<commit_message>
exports and ref formatter
</commit_message>
<xml_diff>
--- a/exports/biomass.docx
+++ b/exports/biomass.docx
@@ -4,7 +4,7 @@
   <w:body>
     <w:p>
       <w:pPr>
-        <w:pStyle w:val="728"/>
+        <w:pStyle w:val="726"/>
         <w:pBdr/>
         <w:spacing/>
         <w:ind/>
@@ -17,7 +17,7 @@
     </w:p>
     <w:p>
       <w:pPr>
-        <w:pStyle w:val="731"/>
+        <w:pStyle w:val="729"/>
         <w:pBdr/>
         <w:spacing/>
         <w:ind/>
@@ -30,7 +30,7 @@
     </w:p>
     <w:p>
       <w:pPr>
-        <w:pStyle w:val="729"/>
+        <w:pStyle w:val="727"/>
         <w:pBdr/>
         <w:spacing/>
         <w:ind/>
@@ -43,7 +43,7 @@
     </w:p>
     <w:p>
       <w:pPr>
-        <w:pStyle w:val="739"/>
+        <w:pStyle w:val="737"/>
         <w:numPr>
           <w:ilvl w:val="0"/>
           <w:numId w:val="2"/>
@@ -85,7 +85,7 @@
     </w:p>
     <w:p>
       <w:pPr>
-        <w:pStyle w:val="739"/>
+        <w:pStyle w:val="737"/>
         <w:numPr>
           <w:ilvl w:val="0"/>
           <w:numId w:val="2"/>
@@ -96,16 +96,16 @@
         <w:rPr/>
       </w:pPr>
       <w:r>
-        <w:t xml:space="preserve">Biomass utilization is a downstream</w:t>
+        <w:t xml:space="preserve">Biomass utilization is a downstream process of fo</w:t>
       </w:r>
       <w:r>
-        <w:t xml:space="preserve"> process of forest health treatments. It is not a driver of logging. In mitigating wildfire, we need to make the distinction between 1. sawtimber; 2. unavoidable treatment residues; and 3. ‘waste’ streams that exist whether or not there’s an energy market.</w:t>
+        <w:t xml:space="preserve">rest health treatments. It is not a driver of logging. In mitigating wildfire, we need to make the distinction between 1. sawtimber; 2. unavoidable treatment residues; and 3. excess forest biomass streams that exist whether or not there’s an energy market.</w:t>
       </w:r>
       <w:r/>
     </w:p>
     <w:p>
       <w:pPr>
-        <w:pStyle w:val="739"/>
+        <w:pStyle w:val="737"/>
         <w:numPr>
           <w:ilvl w:val="0"/>
           <w:numId w:val="2"/>
@@ -125,7 +125,7 @@
     </w:p>
     <w:p>
       <w:pPr>
-        <w:pStyle w:val="739"/>
+        <w:pStyle w:val="737"/>
         <w:numPr>
           <w:ilvl w:val="0"/>
           <w:numId w:val="2"/>
@@ -142,7 +142,7 @@
     </w:p>
     <w:p>
       <w:pPr>
-        <w:pStyle w:val="739"/>
+        <w:pStyle w:val="737"/>
         <w:numPr>
           <w:ilvl w:val="0"/>
           <w:numId w:val="2"/>
@@ -159,7 +159,7 @@
     </w:p>
     <w:p>
       <w:pPr>
-        <w:pStyle w:val="729"/>
+        <w:pStyle w:val="727"/>
         <w:pBdr/>
         <w:spacing/>
         <w:ind/>
@@ -183,7 +183,7 @@
       <w:hyperlink r:id="rId10" w:tooltip="https://calmatters.org/commentary/2025/12/biomass-california-energy-wildfire-problems/" w:history="1">
         <w:r>
           <w:rPr>
-            <w:rStyle w:val="740"/>
+            <w:rStyle w:val="738"/>
           </w:rPr>
           <w:t xml:space="preserve">commentary</w:t>
         </w:r>
@@ -211,7 +211,7 @@
       </w:r>
       <w:r>
         <w:rPr>
-          <w:rStyle w:val="741"/>
+          <w:rStyle w:val="739"/>
         </w:rPr>
         <w:footnoteReference w:id="2"/>
       </w:r>
@@ -222,7 +222,7 @@
     </w:p>
     <w:p>
       <w:pPr>
-        <w:pStyle w:val="729"/>
+        <w:pStyle w:val="727"/>
         <w:pBdr/>
         <w:spacing/>
         <w:ind/>
@@ -250,7 +250,7 @@
     </w:p>
     <w:p>
       <w:pPr>
-        <w:pStyle w:val="730"/>
+        <w:pStyle w:val="728"/>
         <w:pBdr/>
         <w:spacing/>
         <w:ind/>
@@ -278,14 +278,14 @@
     </w:p>
     <w:p>
       <w:pPr>
-        <w:pStyle w:val="730"/>
+        <w:pStyle w:val="728"/>
         <w:pBdr/>
         <w:spacing/>
         <w:ind/>
         <w:rPr/>
       </w:pPr>
       <w:r>
-        <w:t xml:space="preserve">Waste streams</w:t>
+        <w:t xml:space="preserve">Forest residuals</w:t>
       </w:r>
       <w:r/>
     </w:p>
@@ -297,16 +297,16 @@
         <w:rPr/>
       </w:pPr>
       <w:r>
-        <w:t xml:space="preserve">Biomass utilization is a crtical downstream process of forest health treatments. It is not a driver of logging. In mitigating wildfire, we need to make the distinction between 1. sawtimber; 2. unav</w:t>
+        <w:t xml:space="preserve">Biomass utilization is a crtical downstream process of forest health treatments. It is not a driver of logging. In mitigating wildfire, we need to make the distinction between 1. sawtimber; 2. unavoidable treatment residues</w:t>
       </w:r>
       <w:r>
-        <w:t xml:space="preserve">oidable treatment residues; and 3. ‘waste’ streams that exist whether or not there’s an energy market. We also need to make it clear that sawtimber, clearcutting, or excessive forest harvesting cannot be conflated with forest health or wildfire mitigation.</w:t>
+        <w:t xml:space="preserve">; and 3. Excess forest biomass or residual streams that exist whether or not there’s an energy market. We also need to make it clear that sawtimber, clearcutting, or excessive forest harvesting cannot be conflated with forest health or wildfire mitigation.</w:t>
       </w:r>
       <w:r/>
     </w:p>
     <w:p>
       <w:pPr>
-        <w:pStyle w:val="730"/>
+        <w:pStyle w:val="728"/>
         <w:pBdr/>
         <w:spacing/>
         <w:ind/>
@@ -337,7 +337,7 @@
     </w:p>
     <w:p>
       <w:pPr>
-        <w:pStyle w:val="730"/>
+        <w:pStyle w:val="728"/>
         <w:pBdr/>
         <w:spacing/>
         <w:ind/>
@@ -365,7 +365,7 @@
     </w:p>
     <w:p>
       <w:pPr>
-        <w:pStyle w:val="730"/>
+        <w:pStyle w:val="728"/>
         <w:pBdr/>
         <w:spacing/>
         <w:ind/>
@@ -542,7 +542,7 @@
     </w:p>
     <w:p>
       <w:pPr>
-        <w:pStyle w:val="752"/>
+        <w:pStyle w:val="750"/>
         <w:pBdr/>
         <w:spacing/>
         <w:ind/>
@@ -681,7 +681,7 @@
     </w:p>
     <w:p>
       <w:pPr>
-        <w:pStyle w:val="739"/>
+        <w:pStyle w:val="737"/>
         <w:numPr>
           <w:ilvl w:val="0"/>
           <w:numId w:val="3"/>
@@ -710,7 +710,7 @@
     </w:p>
     <w:p>
       <w:pPr>
-        <w:pStyle w:val="739"/>
+        <w:pStyle w:val="737"/>
         <w:numPr>
           <w:ilvl w:val="0"/>
           <w:numId w:val="3"/>
@@ -778,7 +778,7 @@
     </w:p>
     <w:p>
       <w:pPr>
-        <w:pStyle w:val="739"/>
+        <w:pStyle w:val="737"/>
         <w:numPr>
           <w:ilvl w:val="0"/>
           <w:numId w:val="3"/>
@@ -801,7 +801,7 @@
       <w:hyperlink r:id="rId12" w:tooltip="https://calmatters.org/commentary/2022/11/wildfire-prevention-biomass-climate-forest" w:history="1">
         <w:r>
           <w:rPr>
-            <w:rStyle w:val="740"/>
+            <w:rStyle w:val="738"/>
           </w:rPr>
           <w:t xml:space="preserve">Frisch and Uden 2023</w:t>
         </w:r>
@@ -813,7 +813,7 @@
     </w:p>
     <w:p>
       <w:pPr>
-        <w:pStyle w:val="739"/>
+        <w:pStyle w:val="737"/>
         <w:numPr>
           <w:ilvl w:val="0"/>
           <w:numId w:val="3"/>
@@ -839,7 +839,7 @@
       <w:hyperlink r:id="rId13" w:tooltip="https://calmatters.org/commentary/reader-reactions/2025/12/hazardous-forest-waste-wildfire-california/" w:history="1">
         <w:r>
           <w:rPr>
-            <w:rStyle w:val="740"/>
+            <w:rStyle w:val="738"/>
           </w:rPr>
           <w:t xml:space="preserve">Dias 2025</w:t>
         </w:r>
@@ -851,7 +851,7 @@
     </w:p>
     <w:p>
       <w:pPr>
-        <w:pStyle w:val="739"/>
+        <w:pStyle w:val="737"/>
         <w:numPr>
           <w:ilvl w:val="0"/>
           <w:numId w:val="3"/>
@@ -869,10 +869,10 @@
         <w:t xml:space="preserve">Policy-based incentives</w:t>
       </w:r>
       <w:r>
-        <w:t xml:space="preserve">. The Bioenergy Market Adjusting Tariff Program (BIOMAT), which the CPUC sadly decided not to renew, required utilities to buy power from small local projects that convert</w:t>
+        <w:t xml:space="preserve">. The Bioenergy Market Adjusting Tariff Program (BIOMAT), which the CPUC sadly decided not to renew, required utilities to buy power from small local proje</w:t>
       </w:r>
       <w:r>
-        <w:t xml:space="preserve"> forest and other organic waste to energy. Creating a successor program that could get facilities across the line to function or re-idle facilities like Loyalton that aren’t currently operating is critical to processing biomass from forest health projects.</w:t>
+        <w:t xml:space="preserve">cts that convert forest biomass to energy. Creating a successor program that could get facilities across the line to function or re-idle facilities like Loyalton that aren’t currently operating is critical to processing biomass from forest health projects.</w:t>
       </w:r>
       <w:r/>
     </w:p>
@@ -888,7 +888,7 @@
     </w:p>
     <w:p>
       <w:pPr>
-        <w:pStyle w:val="729"/>
+        <w:pStyle w:val="727"/>
         <w:pBdr/>
         <w:spacing/>
         <w:ind/>
@@ -950,7 +950,7 @@
     </w:p>
     <w:p>
       <w:pPr>
-        <w:pStyle w:val="730"/>
+        <w:pStyle w:val="728"/>
         <w:pBdr/>
         <w:spacing/>
         <w:ind/>
@@ -1098,7 +1098,75 @@
     </w:p>
     <w:p>
       <w:pPr>
-        <w:pStyle w:val="730"/>
+        <w:pBdr/>
+        <w:spacing/>
+        <w:ind/>
+        <w:rPr/>
+      </w:pPr>
+      <w:r>
+        <w:t xml:space="preserve">More importantly, recent fires in mixed conifer woodlands, such as the Dixie Caldor Fires in 2021, showed that thinning and prescribed fire reduced the probability of stand replace wildfire and fire severity</w:t>
+      </w:r>
+      <w:r>
+        <w:t xml:space="preserve">(</w:t>
+      </w:r>
+      <w:r>
+        <w:t xml:space="preserve">Shive </w:t>
+      </w:r>
+      <w:r>
+        <w:rPr>
+          <w:i/>
+          <w:iCs/>
+        </w:rPr>
+        <w:t xml:space="preserve">et al.</w:t>
+      </w:r>
+      <w:r>
+        <w:t xml:space="preserve">, 2024</w:t>
+      </w:r>
+      <w:r>
+        <w:t xml:space="preserve">; </w:t>
+      </w:r>
+      <w:r>
+        <w:t xml:space="preserve">Baldassare, 2024</w:t>
+      </w:r>
+      <w:r>
+        <w:t xml:space="preserve">)</w:t>
+      </w:r>
+      <w:r>
+        <w:t xml:space="preserve">. In fact, the Caldor Fire was complete deflected by a prescribed burn at Caples Lake the previous year to the fire reducing the risk to surrounding forest and communities </w:t>
+      </w:r>
+      <w:r>
+        <w:t xml:space="preserve">(</w:t>
+      </w:r>
+      <w:r>
+        <w:t xml:space="preserve">Eagleston </w:t>
+      </w:r>
+      <w:r>
+        <w:rPr>
+          <w:i/>
+          <w:iCs/>
+        </w:rPr>
+        <w:t xml:space="preserve">et al.</w:t>
+      </w:r>
+      <w:r>
+        <w:t xml:space="preserve">, 2025</w:t>
+      </w:r>
+      <w:r>
+        <w:t xml:space="preserve">; </w:t>
+      </w:r>
+      <w:r>
+        <w:t xml:space="preserve">Safford &amp; Saberi, 2026</w:t>
+      </w:r>
+      <w:r>
+        <w:t xml:space="preserve">)</w:t>
+      </w:r>
+      <w:r>
+        <w:t xml:space="preserve">.</w:t>
+      </w:r>
+      <w:r/>
+    </w:p>
+    <w:p>
+      <w:pPr>
+        <w:pStyle w:val="728"/>
         <w:pBdr/>
         <w:spacing/>
         <w:ind/>
@@ -1180,7 +1248,7 @@
     </w:p>
     <w:p>
       <w:pPr>
-        <w:pStyle w:val="730"/>
+        <w:pStyle w:val="728"/>
         <w:pBdr/>
         <w:spacing/>
         <w:ind/>
@@ -1343,7 +1411,7 @@
     </w:p>
     <w:p>
       <w:pPr>
-        <w:pStyle w:val="729"/>
+        <w:pStyle w:val="727"/>
         <w:pBdr/>
         <w:spacing/>
         <w:ind/>
@@ -1371,7 +1439,7 @@
     </w:p>
     <w:p>
       <w:pPr>
-        <w:pStyle w:val="750"/>
+        <w:pStyle w:val="748"/>
         <w:pBdr/>
         <w:spacing/>
         <w:ind/>
@@ -1424,7 +1492,7 @@
     </w:p>
     <w:p>
       <w:pPr>
-        <w:pStyle w:val="739"/>
+        <w:pStyle w:val="737"/>
         <w:numPr>
           <w:ilvl w:val="0"/>
           <w:numId w:val="4"/>
@@ -1470,7 +1538,7 @@
     </w:p>
     <w:p>
       <w:pPr>
-        <w:pStyle w:val="739"/>
+        <w:pStyle w:val="737"/>
         <w:numPr>
           <w:ilvl w:val="0"/>
           <w:numId w:val="4"/>
@@ -1497,7 +1565,7 @@
     </w:p>
     <w:p>
       <w:pPr>
-        <w:pStyle w:val="739"/>
+        <w:pStyle w:val="737"/>
         <w:numPr>
           <w:ilvl w:val="0"/>
           <w:numId w:val="4"/>
@@ -1536,7 +1604,7 @@
     </w:p>
     <w:p>
       <w:pPr>
-        <w:pStyle w:val="739"/>
+        <w:pStyle w:val="737"/>
         <w:numPr>
           <w:ilvl w:val="0"/>
           <w:numId w:val="4"/>
@@ -1563,7 +1631,7 @@
     </w:p>
     <w:p>
       <w:pPr>
-        <w:pStyle w:val="739"/>
+        <w:pStyle w:val="737"/>
         <w:numPr>
           <w:ilvl w:val="0"/>
           <w:numId w:val="4"/>
@@ -1593,7 +1661,7 @@
     </w:p>
     <w:p>
       <w:pPr>
-        <w:pStyle w:val="729"/>
+        <w:pStyle w:val="727"/>
         <w:pBdr/>
         <w:spacing/>
         <w:ind/>
@@ -1624,7 +1692,7 @@
       <w:hyperlink r:id="rId15" w:tooltip="http://3point.xyz" w:history="1">
         <w:r>
           <w:rPr>
-            <w:rStyle w:val="740"/>
+            <w:rStyle w:val="738"/>
             <w:b/>
             <w:bCs/>
           </w:rPr>
@@ -1675,7 +1743,7 @@
     </w:p>
     <w:p>
       <w:pPr>
-        <w:pStyle w:val="729"/>
+        <w:pStyle w:val="727"/>
         <w:pBdr/>
         <w:spacing/>
         <w:ind/>
@@ -1695,27 +1763,8 @@
         <w:rPr/>
       </w:pPr>
       <w:r>
-        <w:t xml:space="preserve">Brown, P. (2024). </w:t>
+        <w:t xml:space="preserve">Baldassare, D. (2024). North Fork Forest Recovery Project Carbon Effects Report.Brown, P. (2024). Cost-effectiveness of large-scale fuel reduction for wildfire mitigation in California. JSTOR. https://www.jstor.org/stable/resrep60733?seq=22.</w:t>
       </w:r>
-      <w:r>
-        <w:rPr>
-          <w:i/>
-          <w:iCs/>
-        </w:rPr>
-        <w:t xml:space="preserve">Cost-effectiveness of large-scale fuel reduction for wildfire mitigation in California</w:t>
-      </w:r>
-      <w:r>
-        <w:t xml:space="preserve">. JSTOR. </w:t>
-      </w:r>
-      <w:hyperlink r:id="rId16" w:tooltip="https://www.jstor.org/stable/resrep60733?seq=22" w:history="1">
-        <w:r>
-          <w:rPr>
-            <w:rStyle w:val="740"/>
-          </w:rPr>
-          <w:t xml:space="preserve">https://www.jstor.org/stable/resrep60733?seq=22</w:t>
-        </w:r>
-      </w:hyperlink>
-      <w:r/>
       <w:r/>
     </w:p>
     <w:p>
@@ -1727,37 +1776,8 @@
         <w:rPr/>
       </w:pPr>
       <w:r>
-        <w:t xml:space="preserve">Collins, B. M., Fry, D. L., Lydersen, J. M., Everett, R., &amp; Stephens, S. L. (2017). Impacts of different land management histories on forest change. </w:t>
+        <w:t xml:space="preserve">Collins, B. M., Fry, D. L., Lydersen, J. M., Everett, R., &amp; Stephens, S. L. (2017). Impacts of different land management histories on forest change. Ecological Applications, 27(8), 2475–2486. 10.1002/eap.1622.</w:t>
       </w:r>
-      <w:r>
-        <w:rPr>
-          <w:i/>
-          <w:iCs/>
-        </w:rPr>
-        <w:t xml:space="preserve">Ecological Applications</w:t>
-      </w:r>
-      <w:r>
-        <w:t xml:space="preserve">, </w:t>
-      </w:r>
-      <w:r>
-        <w:rPr>
-          <w:i/>
-          <w:iCs/>
-        </w:rPr>
-        <w:t xml:space="preserve">27</w:t>
-      </w:r>
-      <w:r>
-        <w:t xml:space="preserve">(8), 2475–2486. </w:t>
-      </w:r>
-      <w:hyperlink r:id="rId17" w:tooltip="https://doi.org/10.1002/eap.1622" w:history="1">
-        <w:r>
-          <w:rPr>
-            <w:rStyle w:val="740"/>
-          </w:rPr>
-          <w:t xml:space="preserve">10.1002/eap.1622</w:t>
-        </w:r>
-      </w:hyperlink>
-      <w:r/>
       <w:r/>
     </w:p>
     <w:p>
@@ -1769,27 +1789,8 @@
         <w:rPr/>
       </w:pPr>
       <w:r>
-        <w:t xml:space="preserve">Cook, J. (2020). Deconstructing climate science denial. In </w:t>
+        <w:t xml:space="preserve">Cook, J. (2020). Deconstructing climate science denial. In Research Handbook on Communicating Climate Change. Edward Elgar Publishing. 10.4337/9781789900408.00014.</w:t>
       </w:r>
-      <w:r>
-        <w:rPr>
-          <w:i/>
-          <w:iCs/>
-        </w:rPr>
-        <w:t xml:space="preserve">Research Handbook on Communicating Climate Change</w:t>
-      </w:r>
-      <w:r>
-        <w:t xml:space="preserve">. Edward Elgar Publishing. </w:t>
-      </w:r>
-      <w:hyperlink r:id="rId18" w:tooltip="https://doi.org/10.4337/9781789900408.00014" w:history="1">
-        <w:r>
-          <w:rPr>
-            <w:rStyle w:val="740"/>
-          </w:rPr>
-          <w:t xml:space="preserve">10.4337/9781789900408.00014</w:t>
-        </w:r>
-      </w:hyperlink>
-      <w:r/>
       <w:r/>
     </w:p>
     <w:p>
@@ -1801,27 +1802,11 @@
         <w:rPr/>
       </w:pPr>
       <w:r>
-        <w:t xml:space="preserve">Delyser, K., Tase, N., Clay, K., Magnan, M., Evans, S., Keithley, C., Bartowitz, K., Gadoth-Goodman, D., Papa, C., Ontl, T., &amp; Cooper, L. (2025). </w:t>
+        <w:t xml:space="preserve">Delyser, K., Tase, N., Clay, K., Magnan, M., Evans, S., Keithley, C., Bartowitz, K., Gadoth-Goodman, D., Papa, C., Ontl, T., &amp; Cooper, L. (2025). Effects of Forest Management &amp; Wood Utilization on Carbon Sequestration &amp; Storage in California. CAL FIRE. http</w:t>
       </w:r>
       <w:r>
-        <w:rPr>
-          <w:i/>
-          <w:iCs/>
-        </w:rPr>
-        <w:t xml:space="preserve">Effects of Forest Management &amp; Wood Utilization on Carbon Sequestration &amp; Storage in California</w:t>
+        <w:t xml:space="preserve">s://d3f9k0n15ckvhe.cloudfront.net/wp-content/uploads/2025/02/CBM_CA_report_FINAL.pdf.</w:t>
       </w:r>
-      <w:r>
-        <w:t xml:space="preserve">. CAL FIRE. </w:t>
-      </w:r>
-      <w:hyperlink r:id="rId19" w:tooltip="https://d3f9k0n15ckvhe.cloudfront.net/wp-content/uploads/2025/02/CBM_CA_report_FINAL.pdf" w:history="1">
-        <w:r>
-          <w:rPr>
-            <w:rStyle w:val="740"/>
-          </w:rPr>
-          <w:t xml:space="preserve">https://d3f9k0n15ckvhe.cloudfront.net/wp-content/uploads/2025/02/CBM_CA_report_FINAL.pdf</w:t>
-        </w:r>
-      </w:hyperlink>
-      <w:r/>
       <w:r/>
     </w:p>
     <w:p>
@@ -1833,37 +1818,11 @@
         <w:rPr/>
       </w:pPr>
       <w:r>
-        <w:t xml:space="preserve">Dodson, E. K., Peterson, D. W., &amp; Harrod, R. J. (2008). Understory vegetation response to thinning and burning restoration treatments in dry conifer forests of the eastern Cascades, USA. </w:t>
+        <w:t xml:space="preserve">Dodson, E. K., Peterson, D. W., &amp; Harrod, R. J. (2008). Understory vegetation response to thinning and burning restoration treatments in dry conifer forests of the eastern Cascades, USA. Forest Ecology and Management, 255(8–9), 3130–3140. 10.1016/j.foreco.2</w:t>
       </w:r>
       <w:r>
-        <w:rPr>
-          <w:i/>
-          <w:iCs/>
-        </w:rPr>
-        <w:t xml:space="preserve">Forest Ecology and Management</w:t>
+        <w:t xml:space="preserve">008.01.026.</w:t>
       </w:r>
-      <w:r>
-        <w:t xml:space="preserve">, </w:t>
-      </w:r>
-      <w:r>
-        <w:rPr>
-          <w:i/>
-          <w:iCs/>
-        </w:rPr>
-        <w:t xml:space="preserve">255</w:t>
-      </w:r>
-      <w:r>
-        <w:t xml:space="preserve">(8–9), 3130–3140. </w:t>
-      </w:r>
-      <w:hyperlink r:id="rId20" w:tooltip="https://doi.org/10.1016/j.foreco.2008.01.026" w:history="1">
-        <w:r>
-          <w:rPr>
-            <w:rStyle w:val="740"/>
-          </w:rPr>
-          <w:t xml:space="preserve">10.1016/j.foreco.2008.01.026</w:t>
-        </w:r>
-      </w:hyperlink>
-      <w:r/>
       <w:r/>
     </w:p>
     <w:p>
@@ -1875,37 +1834,11 @@
         <w:rPr/>
       </w:pPr>
       <w:r>
-        <w:t xml:space="preserve">Elias, M., Yackulic, E., Duffy, K., Saksa, P., Sanchez, D. L., Pevzner, N., Plumb, S., Dyszynski, J., &amp; Bracer, C. (2025). Carbon finance for forest resilience in California. </w:t>
+        <w:t xml:space="preserve">Eagleston, H., Bester, M., Yusuf, J., Damodaran, A., &amp; Reno, M. J. (2025). Systemic Drivers of Electric-Grid-Caused Catastrophic Wildfires: Implications for Resilience in the United States. Challenges, 16(1).Elias, M., Yackulic, E., Duffy, K., Saksa, P., Sa</w:t>
       </w:r>
       <w:r>
-        <w:rPr>
-          <w:i/>
-          <w:iCs/>
-        </w:rPr>
-        <w:t xml:space="preserve">Frontiers in Forests and Global Change</w:t>
+        <w:t xml:space="preserve">nchez, D. L., Pevzner, N., Plumb, S., Dyszynski, J., &amp; Bracer, C. (2025). Carbon finance for forest resilience in California. Frontiers in Forests and Global Change, 7, 1507554. 10.3389/ffgc.2024.1507554.</w:t>
       </w:r>
-      <w:r>
-        <w:t xml:space="preserve">, </w:t>
-      </w:r>
-      <w:r>
-        <w:rPr>
-          <w:i/>
-          <w:iCs/>
-        </w:rPr>
-        <w:t xml:space="preserve">7</w:t>
-      </w:r>
-      <w:r>
-        <w:t xml:space="preserve">, 1507554. </w:t>
-      </w:r>
-      <w:hyperlink r:id="rId21" w:tooltip="https://doi.org/10.3389/ffgc.2024.1507554" w:history="1">
-        <w:r>
-          <w:rPr>
-            <w:rStyle w:val="740"/>
-          </w:rPr>
-          <w:t xml:space="preserve">10.3389/ffgc.2024.1507554</w:t>
-        </w:r>
-      </w:hyperlink>
-      <w:r/>
       <w:r/>
     </w:p>
     <w:p>
@@ -1917,40 +1850,11 @@
         <w:rPr/>
       </w:pPr>
       <w:r>
-        <w:t xml:space="preserve">Hagmann, R. K., Hessburg, P. F., Prichard, S. J., Povak, N. A., Brown, P. M., Fulé, P. Z., Keane, R. E., Knapp, E. E., Lydersen, J. M., Metlen, K. L., Reilly, M. J., Sánchez Meador, A. J.,</w:t>
+        <w:t xml:space="preserve">Hagmann, R. K., Hessburg, P. F., Prichard, S. J., Povak, N. A., Brown, P. M., Fulé, P. Z., Keane, R. E., Knapp, E. E., Lydersen, J. M., Metlen, K. L., Reilly, M. J., Sánchez Meador, A. J., Stephens, S. L., Stevens, J. T., Taylor, A. H., Yocom, L. L., Battag</w:t>
       </w:r>
       <w:r>
-        <w:t xml:space="preserve"> Stephens, S. L., Stevens, J. T., Taylor, A. H., Yocom, L. L., Battaglia, M. A., Churchill, D. J., Daniels, L. D., … Waltz, A. E. M. (2021). Evidence for widespread changes in the structure, composition, and fire regimes of western North American forests. </w:t>
+        <w:t xml:space="preserve">lia, M. A., Churchill, D. J., Daniels, L. D., … Waltz, A. E. M. (2021). Evidence for widespread changes in the structure, composition, and fire regimes of western North American forests. Ecological Applications, 31(8). 10.1002/eap.2431.</w:t>
       </w:r>
-      <w:r>
-        <w:rPr>
-          <w:i/>
-          <w:iCs/>
-        </w:rPr>
-        <w:t xml:space="preserve">Ecological Applications</w:t>
-      </w:r>
-      <w:r>
-        <w:t xml:space="preserve">, </w:t>
-      </w:r>
-      <w:r>
-        <w:rPr>
-          <w:i/>
-          <w:iCs/>
-        </w:rPr>
-        <w:t xml:space="preserve">31</w:t>
-      </w:r>
-      <w:r>
-        <w:t xml:space="preserve">(8). </w:t>
-      </w:r>
-      <w:hyperlink r:id="rId22" w:tooltip="https://doi.org/10.1002/eap.2431" w:history="1">
-        <w:r>
-          <w:rPr>
-            <w:rStyle w:val="740"/>
-          </w:rPr>
-          <w:t xml:space="preserve">10.1002/eap.2431</w:t>
-        </w:r>
-      </w:hyperlink>
-      <w:r/>
       <w:r/>
     </w:p>
     <w:p>
@@ -1962,27 +1866,8 @@
         <w:rPr/>
       </w:pPr>
       <w:r>
-        <w:t xml:space="preserve">Harrison, J. (2025). </w:t>
+        <w:t xml:space="preserve">Harrison, J. (2025). Avoiding an uninsurable future. Medium. https://medium.com/@joshuaharrison_97833/avoiding-an-uninsurable-future-78d525e8ded6.</w:t>
       </w:r>
-      <w:r>
-        <w:rPr>
-          <w:i/>
-          <w:iCs/>
-        </w:rPr>
-        <w:t xml:space="preserve">Avoiding an uninsurable future</w:t>
-      </w:r>
-      <w:r>
-        <w:t xml:space="preserve">. Medium. </w:t>
-      </w:r>
-      <w:hyperlink r:id="rId23" w:tooltip="https://medium.com/@joshuaharrison_97833/avoiding-an-uninsurable-future-78d525e8ded6" w:history="1">
-        <w:r>
-          <w:rPr>
-            <w:rStyle w:val="740"/>
-          </w:rPr>
-          <w:t xml:space="preserve">https://medium.com/@joshuaharrison_97833/avoiding-an-uninsurable-future-78d525e8ded6</w:t>
-        </w:r>
-      </w:hyperlink>
-      <w:r/>
       <w:r/>
     </w:p>
     <w:p>
@@ -1994,37 +1879,11 @@
         <w:rPr/>
       </w:pPr>
       <w:r>
-        <w:t xml:space="preserve">Hoffman, K. M., Davis, E. L., Wickham, S. B., Schang, K., Johnson, A., Larking, T., Lauriault, P. N., Quynh Le, N., Swerdfager, E., &amp; Trant, A. J. (2021). Conservation of Earth’s biodiversity is embedded in Indigenous fire stewardship. </w:t>
+        <w:t xml:space="preserve">Hoffman, K. M., Davis, E. L., Wickham, S. B., Schang, K., Johnson, A., Larking, T., Lauriault, P. N., Quynh Le, N., Swerdfager, E., &amp; Trant, A. J. (2021). Conservation of Earth’s biodiversity is embedded in Indigenous fire stewardship. Proceedings of the Na</w:t>
       </w:r>
       <w:r>
-        <w:rPr>
-          <w:i/>
-          <w:iCs/>
-        </w:rPr>
-        <w:t xml:space="preserve">Proceedings of the National Academy of Sciences</w:t>
+        <w:t xml:space="preserve">tional Academy of Sciences, 118(32). 10.1073/pnas.2105073118.</w:t>
       </w:r>
-      <w:r>
-        <w:t xml:space="preserve">, </w:t>
-      </w:r>
-      <w:r>
-        <w:rPr>
-          <w:i/>
-          <w:iCs/>
-        </w:rPr>
-        <w:t xml:space="preserve">118</w:t>
-      </w:r>
-      <w:r>
-        <w:t xml:space="preserve">(32). </w:t>
-      </w:r>
-      <w:hyperlink r:id="rId24" w:tooltip="https://doi.org/10.1073/pnas.2105073118" w:history="1">
-        <w:r>
-          <w:rPr>
-            <w:rStyle w:val="740"/>
-          </w:rPr>
-          <w:t xml:space="preserve">10.1073/pnas.2105073118</w:t>
-        </w:r>
-      </w:hyperlink>
-      <w:r/>
       <w:r/>
     </w:p>
     <w:p>
@@ -2036,37 +1895,8 @@
         <w:rPr/>
       </w:pPr>
       <w:r>
-        <w:t xml:space="preserve">Holland, T., Evans, S., Long, J., Maxwell, C., Scheller, R., &amp; Potts, M. (2022). The management costs of alternative forest management strategies in the Lake Tahoe Basin. </w:t>
+        <w:t xml:space="preserve">Holland, T., Evans, S., Long, J., Maxwell, C., Scheller, R., &amp; Potts, M. (2022). The management costs of alternative forest management strategies in the Lake Tahoe Basin. Ecology and Society. 27 (4): 43, 27(4). 10.5751/ES-13481-270443.</w:t>
       </w:r>
-      <w:r>
-        <w:rPr>
-          <w:i/>
-          <w:iCs/>
-        </w:rPr>
-        <w:t xml:space="preserve">Ecology and Society. 27 (4): 43</w:t>
-      </w:r>
-      <w:r>
-        <w:t xml:space="preserve">, </w:t>
-      </w:r>
-      <w:r>
-        <w:rPr>
-          <w:i/>
-          <w:iCs/>
-        </w:rPr>
-        <w:t xml:space="preserve">27</w:t>
-      </w:r>
-      <w:r>
-        <w:t xml:space="preserve">(4). </w:t>
-      </w:r>
-      <w:hyperlink r:id="rId25" w:tooltip="https://doi.org/10.5751/ES-13481-270443" w:history="1">
-        <w:r>
-          <w:rPr>
-            <w:rStyle w:val="740"/>
-          </w:rPr>
-          <w:t xml:space="preserve">10.5751/ES-13481-270443</w:t>
-        </w:r>
-      </w:hyperlink>
-      <w:r/>
       <w:r/>
     </w:p>
     <w:p>
@@ -2078,37 +1908,11 @@
         <w:rPr/>
       </w:pPr>
       <w:r>
-        <w:t xml:space="preserve">Jones, G. M., Vraga, E. K., Hessburg, P. F., Hurteau, M. D., Allen, C. D., Keane, R. E., Spies, T. A., North, M. P., Collins, B. M., Finney, M. A., Lydersen, J. M., &amp; Westerling, A. L. (2022). Counteracting wildfire misinformation. </w:t>
+        <w:t xml:space="preserve">Jones, G. M., Vraga, E. K., Hessburg, P. F., Hurteau, M. D., Allen, C. D., Keane, R. E., Spies, T. A., North, M. P., Collins, B. M., Finney, M. A., Lydersen, J. M., &amp; Westerling, A. L. (2022). Counteracting wildfire misinformation. Frontiers in Ecology and </w:t>
       </w:r>
       <w:r>
-        <w:rPr>
-          <w:i/>
-          <w:iCs/>
-        </w:rPr>
-        <w:t xml:space="preserve">Frontiers in Ecology and the Environment</w:t>
+        <w:t xml:space="preserve">the Environment, 20(7), 392–393. 10.1002/fee.2553.</w:t>
       </w:r>
-      <w:r>
-        <w:t xml:space="preserve">, </w:t>
-      </w:r>
-      <w:r>
-        <w:rPr>
-          <w:i/>
-          <w:iCs/>
-        </w:rPr>
-        <w:t xml:space="preserve">20</w:t>
-      </w:r>
-      <w:r>
-        <w:t xml:space="preserve">(7), 392–393. </w:t>
-      </w:r>
-      <w:hyperlink r:id="rId26" w:tooltip="https://doi.org/10.1002/fee.2553" w:history="1">
-        <w:r>
-          <w:rPr>
-            <w:rStyle w:val="740"/>
-          </w:rPr>
-          <w:t xml:space="preserve">10.1002/fee.2553</w:t>
-        </w:r>
-      </w:hyperlink>
-      <w:r/>
       <w:r/>
     </w:p>
     <w:p>
@@ -2120,37 +1924,8 @@
         <w:rPr/>
       </w:pPr>
       <w:r>
-        <w:t xml:space="preserve">North, M. P., Tompkins, R. E., Bernal, A. A., Collins, B. M., Stephens, S. L., &amp; York, R. A. (2022). Operational resilience in western US frequent-fire forests. </w:t>
+        <w:t xml:space="preserve">North, M. P., Tompkins, R. E., Bernal, A. A., Collins, B. M., Stephens, S. L., &amp; York, R. A. (2022). Operational resilience in western US frequent-fire forests. Forest Ecology and Management, 507, 120004. 10.1016/j.foreco.2021.120004.</w:t>
       </w:r>
-      <w:r>
-        <w:rPr>
-          <w:i/>
-          <w:iCs/>
-        </w:rPr>
-        <w:t xml:space="preserve">Forest Ecology and Management</w:t>
-      </w:r>
-      <w:r>
-        <w:t xml:space="preserve">, </w:t>
-      </w:r>
-      <w:r>
-        <w:rPr>
-          <w:i/>
-          <w:iCs/>
-        </w:rPr>
-        <w:t xml:space="preserve">507</w:t>
-      </w:r>
-      <w:r>
-        <w:t xml:space="preserve">, 120004. </w:t>
-      </w:r>
-      <w:hyperlink r:id="rId27" w:tooltip="https://doi.org/10.1016/j.foreco.2021.120004" w:history="1">
-        <w:r>
-          <w:rPr>
-            <w:rStyle w:val="740"/>
-          </w:rPr>
-          <w:t xml:space="preserve">10.1016/j.foreco.2021.120004</w:t>
-        </w:r>
-      </w:hyperlink>
-      <w:r/>
       <w:r/>
     </w:p>
     <w:p>
@@ -2162,27 +1937,8 @@
         <w:rPr/>
       </w:pPr>
       <w:r>
-        <w:t xml:space="preserve">North, M., Stine, P., O’Hara, K., Zielinski, W., &amp; Stephens, S. (2009). </w:t>
+        <w:t xml:space="preserve">North, M., Stine, P., O’Hara, K., Zielinski, W., &amp; Stephens, S. (2009). An ecosystem management strategy for Sierran mixed-conifer forests. U.S. Department of Agriculture, Forest Service, Pacific Southwest Research Station. 10.2737/PSW-GTR-220.</w:t>
       </w:r>
-      <w:r>
-        <w:rPr>
-          <w:i/>
-          <w:iCs/>
-        </w:rPr>
-        <w:t xml:space="preserve">An ecosystem management strategy for Sierran mixed-conifer forests</w:t>
-      </w:r>
-      <w:r>
-        <w:t xml:space="preserve">. U.S. Department of Agriculture, Forest Service, Pacific Southwest Research Station. </w:t>
-      </w:r>
-      <w:hyperlink r:id="rId28" w:tooltip="https://doi.org/10.2737/PSW-GTR-220" w:history="1">
-        <w:r>
-          <w:rPr>
-            <w:rStyle w:val="740"/>
-          </w:rPr>
-          <w:t xml:space="preserve">10.2737/PSW-GTR-220</w:t>
-        </w:r>
-      </w:hyperlink>
-      <w:r/>
       <w:r/>
     </w:p>
     <w:p>
@@ -2194,50 +1950,11 @@
         <w:rPr/>
       </w:pPr>
       <w:r>
-        <w:t xml:space="preserve">Oreskes, N., &amp; Conway, E. M. (2011). </w:t>
+        <w:t xml:space="preserve">Oreskes, N., &amp; Conway, E. M. (2011). Merchants of doubt: How a handful of scientists obscured the truth on issues from tobacco smoke to global warming. Bloomsbury Publishing USA.Peery, M. Z., Jones, G. M., Gutiérrez, R., Redpath, S. M., Franklin, A. B., Sim</w:t>
       </w:r>
       <w:r>
-        <w:rPr>
-          <w:i/>
-          <w:iCs/>
-        </w:rPr>
-        <w:t xml:space="preserve">Merchants of doubt: How a handful of scientists obscured the truth on issues from tobacco smoke to global warming</w:t>
+        <w:t xml:space="preserve">berloff, D., Turner, M. G., Radeloff, V. C., &amp; White, G. C. (2019). The conundrum of agendadriven science in conservation. Frontiers in Ecology and the Environment, 17(2), 80–82. 10.1002/fee.2006.</w:t>
       </w:r>
-      <w:r>
-        <w:t xml:space="preserve">. Bloomsbury Publishing USA.</w:t>
-      </w:r>
-      <w:r>
-        <w:t xml:space="preserve">Peery, M. Z., Jones, G. M., Gutiérrez, R., Redpath, S. M., Franklin, A. B., Simberloff, D., Turner, M. G., Radeloff, V. C., &amp; White, G. C. (2019). The conundrum of agendadriven science in conservation. </w:t>
-      </w:r>
-      <w:r>
-        <w:rPr>
-          <w:i/>
-          <w:iCs/>
-        </w:rPr>
-        <w:t xml:space="preserve">Frontiers in Ecology and the Environment</w:t>
-      </w:r>
-      <w:r>
-        <w:t xml:space="preserve">, </w:t>
-      </w:r>
-      <w:r>
-        <w:rPr>
-          <w:i/>
-          <w:iCs/>
-        </w:rPr>
-        <w:t xml:space="preserve">17</w:t>
-      </w:r>
-      <w:r>
-        <w:t xml:space="preserve">(2), 80–82. </w:t>
-      </w:r>
-      <w:hyperlink r:id="rId29" w:tooltip="https://doi.org/10.1002/fee.2006" w:history="1">
-        <w:r>
-          <w:rPr>
-            <w:rStyle w:val="740"/>
-          </w:rPr>
-          <w:t xml:space="preserve">10.1002/fee.2006</w:t>
-        </w:r>
-      </w:hyperlink>
-      <w:r/>
       <w:r/>
     </w:p>
     <w:p>
@@ -2249,40 +1966,11 @@
         <w:rPr/>
       </w:pPr>
       <w:r>
-        <w:t xml:space="preserve">Prichard, S. J., Hessburg, P. F., Hagmann, R. K., Povak, N. A., Dobrowski, S. Z., Hurteau, M. D., Kane, V. R., Keane, R. E., Kobziar, L. N., Kolden, C. A</w:t>
+        <w:t xml:space="preserve">Prichard, S. J., Hessburg, P. F., Hagmann, R. K., Povak, N. A., Dobrowski, S. Z., Hurteau, M. D., Kane, V. R., Keane, R. E., Kobziar, L. N., Kolden, C. A., North, M., Parks, S. A., Safford, H. D., Stevens, J. T., Yocom, L. L., Churchill, D. J., Gray, R. W.,</w:t>
       </w:r>
       <w:r>
-        <w:t xml:space="preserve">., North, M., Parks, S. A., Safford, H. D., Stevens, J. T., Yocom, L. L., Churchill, D. J., Gray, R. W., Huffman, D. W., Lake, F. K., &amp; KhatriChhetri, P. (2021). Adapting western North American forests to climate change and wildfires: 10 common questions. </w:t>
+        <w:t xml:space="preserve"> Huffman, D. W., Lake, F. K., &amp; KhatriChhetri, P. (2021). Adapting western North American forests to climate change and wildfires: 10 common questions. Ecological Applications, 31(8). 10.1002/eap.2433.</w:t>
       </w:r>
-      <w:r>
-        <w:rPr>
-          <w:i/>
-          <w:iCs/>
-        </w:rPr>
-        <w:t xml:space="preserve">Ecological Applications</w:t>
-      </w:r>
-      <w:r>
-        <w:t xml:space="preserve">, </w:t>
-      </w:r>
-      <w:r>
-        <w:rPr>
-          <w:i/>
-          <w:iCs/>
-        </w:rPr>
-        <w:t xml:space="preserve">31</w:t>
-      </w:r>
-      <w:r>
-        <w:t xml:space="preserve">(8). </w:t>
-      </w:r>
-      <w:hyperlink r:id="rId30" w:tooltip="https://doi.org/10.1002/eap.2433" w:history="1">
-        <w:r>
-          <w:rPr>
-            <w:rStyle w:val="740"/>
-          </w:rPr>
-          <w:t xml:space="preserve">10.1002/eap.2433</w:t>
-        </w:r>
-      </w:hyperlink>
-      <w:r/>
       <w:r/>
     </w:p>
     <w:p>
@@ -2294,58 +1982,8 @@
         <w:rPr/>
       </w:pPr>
       <w:r>
-        <w:t xml:space="preserve">Stephens, S. L., Martin, R. E., &amp; Clinton, N. E. (2007). Prehistoric fire area and emissions from California’s forests, woodlands, shrublands, and grasslands. </w:t>
+        <w:t xml:space="preserve">Safford, H. D., &amp; Saberi, S. (2026). Fuel treatment effects on fire severity during the Caldor Fire (2021), Lake Tahoe, California, USA. Forest Ecology and Management, 603. https://research.fs.usda.gov/treesearch/download/64496.pdf.</w:t>
       </w:r>
-      <w:r>
-        <w:rPr>
-          <w:i/>
-          <w:iCs/>
-        </w:rPr>
-        <w:t xml:space="preserve">Forest Ecology and Management</w:t>
-      </w:r>
-      <w:r>
-        <w:t xml:space="preserve">, </w:t>
-      </w:r>
-      <w:r>
-        <w:rPr>
-          <w:i/>
-          <w:iCs/>
-        </w:rPr>
-        <w:t xml:space="preserve">251</w:t>
-      </w:r>
-      <w:r>
-        <w:t xml:space="preserve">(3), 205–216. </w:t>
-      </w:r>
-      <w:hyperlink r:id="rId31" w:tooltip="https://doi.org/10.1016/j.foreco.2007.06.005" w:history="1">
-        <w:r>
-          <w:rPr>
-            <w:rStyle w:val="740"/>
-          </w:rPr>
-          <w:t xml:space="preserve">10.1016/j.foreco.2007.06.005</w:t>
-        </w:r>
-      </w:hyperlink>
-      <w:r>
-        <w:t xml:space="preserve">Strabo, F., Bryan, C., &amp; Reimer, M. (2025). Wildfire Damages and the Cost-Effective Role of Forest Fuel Treatments. </w:t>
-      </w:r>
-      <w:r>
-        <w:rPr>
-          <w:i/>
-          <w:iCs/>
-        </w:rPr>
-        <w:t xml:space="preserve">SSRN</w:t>
-      </w:r>
-      <w:r>
-        <w:t xml:space="preserve">. </w:t>
-      </w:r>
-      <w:hyperlink r:id="rId32" w:tooltip="https://doi.org/10.2139/ssrn.5337929" w:history="1">
-        <w:r>
-          <w:rPr>
-            <w:rStyle w:val="740"/>
-          </w:rPr>
-          <w:t xml:space="preserve">10.2139/ssrn.5337929</w:t>
-        </w:r>
-      </w:hyperlink>
-      <w:r/>
       <w:r/>
     </w:p>
     <w:p>
@@ -2357,27 +1995,60 @@
         <w:rPr/>
       </w:pPr>
       <w:r>
-        <w:t xml:space="preserve">Turner, E. (2023). </w:t>
+        <w:t xml:space="preserve">Shive, K. L., Coppoletta, M., Wayman, R. B., Paulson, A. K., Wilson, K. N., Abatzaglou, J. T., Saberi, S. J., Estes, B., &amp; Safford, H. D. (2024). Thinning with follow-up burning treatments have increased effectiveness at reducing severity in California’s la</w:t>
       </w:r>
       <w:r>
-        <w:rPr>
-          <w:i/>
-          <w:iCs/>
-        </w:rPr>
-        <w:t xml:space="preserve">The Potential for Hazardous Fuel Reduction Treatments to Produce Net Economic Benefits in California</w:t>
+        <w:t xml:space="preserve">rgest wildfire. Forest Ecology and Management, 572. 10.1016/j.foreco.2024.122171.</w:t>
+      </w:r>
+      <w:r/>
+    </w:p>
+    <w:p>
+      <w:pPr>
+        <w:pBdr/>
+        <w:spacing/>
+        <w:ind/>
+        <w:jc w:val="left"/>
+        <w:rPr/>
+      </w:pPr>
+      <w:r>
+        <w:t xml:space="preserve">Stephens, S. L., Martin, R. E., &amp; Clinton, N. E. (2007). Prehistoric fire area and emissions from California’s forests, woodlands, shrublands, and grasslands. Forest Ecology and Management, 251(3), 205–216. 10.1016/j.foreco.2007.06.005.</w:t>
+      </w:r>
+      <w:r/>
+    </w:p>
+    <w:p>
+      <w:pPr>
+        <w:pBdr/>
+        <w:spacing/>
+        <w:ind/>
+        <w:jc w:val="left"/>
+        <w:rPr/>
+      </w:pPr>
+      <w:r>
+        <w:t xml:space="preserve">Strabo, F., Bryan, C., &amp; Reimer, M. (2025). Wildfire Damages and the Cost-Effective Role of Forest Fuel Treatments. SSRN. 10.2139/ssrn.5337929.</w:t>
+      </w:r>
+      <w:r/>
+    </w:p>
+    <w:p>
+      <w:pPr>
+        <w:pBdr/>
+        <w:spacing/>
+        <w:ind/>
+        <w:jc w:val="left"/>
+        <w:rPr/>
+      </w:pPr>
+      <w:r>
+        <w:t xml:space="preserve">Turner, E. (2023). The Potential for Hazardous Fuel Reduction Treatments to Produce Net Economic Benefits in California [Phdthesis, Johns Hopkins University]. https://jscholarship.library.jhu.edu/server/api/core/bitstreams/f8447761-4375-48d4-a2ba-82bc5bef63</w:t>
       </w:r>
       <w:r>
-        <w:t xml:space="preserve"> [Phdthesis, Johns Hopkins University]. </w:t>
+        <w:t xml:space="preserve">18/content</w:t>
       </w:r>
-      <w:hyperlink r:id="rId33" w:tooltip="https://jscholarship.library.jhu.edu/server/api/core/bitstreams/f8447761-4375-48d4-a2ba-82bc5bef6318/content" w:history="1">
-        <w:r>
-          <w:rPr>
-            <w:rStyle w:val="740"/>
-          </w:rPr>
-          <w:t xml:space="preserve">https://jscholarship.library.jhu.edu/server/api/core/bitstreams/f8447761-4375-48d4-a2ba-82bc5bef6318/content</w:t>
-        </w:r>
-      </w:hyperlink>
       <w:r/>
+      <w:r>
+        <w:rPr>
+          <w:lang w:val="en"/>
+        </w:rPr>
+        <w:t xml:space="preserve">.</w:t>
+      </w:r>
       <w:r/>
     </w:p>
     <w:sectPr>
@@ -2557,24 +2228,18 @@
       </w:pPr>
       <w:r>
         <w:rPr>
-          <w:rStyle w:val="741"/>
+          <w:rStyle w:val="739"/>
         </w:rPr>
         <w:footnoteRef/>
       </w:r>
       <w:r>
-        <w:t xml:space="preserve">Ironically some environmentalists are using a Merchants of Doubt type of approach to their wildfire disinformation campaigns cf </w:t>
+        <w:t xml:space="preserve">Ironically some environmentalists are using a Merchants of Doubt type of approach to their wildfire disinformation campaigns. See </w:t>
       </w:r>
       <w:r>
-        <w:t xml:space="preserve">(</w:t>
+        <w:t xml:space="preserve">Oreskes &amp; Conway (2011)</w:t>
       </w:r>
       <w:r>
-        <w:t xml:space="preserve">Oreskes &amp; Conway, 2011</w:t>
-      </w:r>
-      <w:r>
-        <w:t xml:space="preserve">)</w:t>
-      </w:r>
-      <w:r>
-        <w:t xml:space="preserve">.</w:t>
+        <w:t xml:space="preserve"> for more on disinformation campaigns intended to sew the seeds of doubt with science that have been used historically by the petrochemical and cigarette industries, among others.</w:t>
       </w:r>
       <w:r/>
     </w:p>
@@ -3280,7 +2945,7 @@
   </w:latentStyles>
   <w:style w:type="table" w:styleId="12">
     <w:name w:val="Table Grid"/>
-    <w:basedOn w:val="735"/>
+    <w:basedOn w:val="733"/>
     <w:uiPriority w:val="59"/>
     <w:pPr>
       <w:pBdr/>
@@ -3479,7 +3144,7 @@
   </w:style>
   <w:style w:type="table" w:styleId="13">
     <w:name w:val="Table Grid Light"/>
-    <w:basedOn w:val="735"/>
+    <w:basedOn w:val="733"/>
     <w:uiPriority w:val="59"/>
     <w:pPr>
       <w:pBdr/>
@@ -3678,7 +3343,7 @@
   </w:style>
   <w:style w:type="table" w:styleId="14">
     <w:name w:val="Plain Table 1"/>
-    <w:basedOn w:val="735"/>
+    <w:basedOn w:val="733"/>
     <w:uiPriority w:val="59"/>
     <w:pPr>
       <w:pBdr/>
@@ -3903,7 +3568,7 @@
   </w:style>
   <w:style w:type="table" w:styleId="15">
     <w:name w:val="Plain Table 2"/>
-    <w:basedOn w:val="735"/>
+    <w:basedOn w:val="733"/>
     <w:uiPriority w:val="59"/>
     <w:pPr>
       <w:pBdr/>
@@ -4136,7 +3801,7 @@
   </w:style>
   <w:style w:type="table" w:styleId="16">
     <w:name w:val="Plain Table 3"/>
-    <w:basedOn w:val="735"/>
+    <w:basedOn w:val="733"/>
     <w:uiPriority w:val="99"/>
     <w:pPr>
       <w:pBdr/>
@@ -4366,7 +4031,7 @@
   </w:style>
   <w:style w:type="table" w:styleId="17">
     <w:name w:val="Plain Table 4"/>
-    <w:basedOn w:val="735"/>
+    <w:basedOn w:val="733"/>
     <w:uiPriority w:val="99"/>
     <w:pPr>
       <w:pBdr/>
@@ -4582,7 +4247,7 @@
   </w:style>
   <w:style w:type="table" w:styleId="18">
     <w:name w:val="Plain Table 5"/>
-    <w:basedOn w:val="735"/>
+    <w:basedOn w:val="733"/>
     <w:uiPriority w:val="99"/>
     <w:pPr>
       <w:pBdr/>
@@ -4815,7 +4480,7 @@
   </w:style>
   <w:style w:type="table" w:styleId="19">
     <w:name w:val="Grid Table 1 Light"/>
-    <w:basedOn w:val="735"/>
+    <w:basedOn w:val="733"/>
     <w:uiPriority w:val="99"/>
     <w:pPr>
       <w:pBdr/>
@@ -5038,7 +4703,7 @@
   </w:style>
   <w:style w:type="table" w:styleId="20">
     <w:name w:val="Grid Table 1 Light - Accent 1"/>
-    <w:basedOn w:val="735"/>
+    <w:basedOn w:val="733"/>
     <w:uiPriority w:val="99"/>
     <w:pPr>
       <w:pBdr/>
@@ -5261,7 +4926,7 @@
   </w:style>
   <w:style w:type="table" w:styleId="21">
     <w:name w:val="Grid Table 1 Light - Accent 2"/>
-    <w:basedOn w:val="735"/>
+    <w:basedOn w:val="733"/>
     <w:uiPriority w:val="99"/>
     <w:pPr>
       <w:pBdr/>
@@ -5484,7 +5149,7 @@
   </w:style>
   <w:style w:type="table" w:styleId="22">
     <w:name w:val="Grid Table 1 Light - Accent 3"/>
-    <w:basedOn w:val="735"/>
+    <w:basedOn w:val="733"/>
     <w:uiPriority w:val="99"/>
     <w:pPr>
       <w:pBdr/>
@@ -5707,7 +5372,7 @@
   </w:style>
   <w:style w:type="table" w:styleId="23">
     <w:name w:val="Grid Table 1 Light - Accent 4"/>
-    <w:basedOn w:val="735"/>
+    <w:basedOn w:val="733"/>
     <w:uiPriority w:val="99"/>
     <w:pPr>
       <w:pBdr/>
@@ -5930,7 +5595,7 @@
   </w:style>
   <w:style w:type="table" w:styleId="24">
     <w:name w:val="Grid Table 1 Light - Accent 5"/>
-    <w:basedOn w:val="735"/>
+    <w:basedOn w:val="733"/>
     <w:uiPriority w:val="99"/>
     <w:pPr>
       <w:pBdr/>
@@ -6153,7 +5818,7 @@
   </w:style>
   <w:style w:type="table" w:styleId="25">
     <w:name w:val="Grid Table 1 Light - Accent 6"/>
-    <w:basedOn w:val="735"/>
+    <w:basedOn w:val="733"/>
     <w:uiPriority w:val="99"/>
     <w:pPr>
       <w:pBdr/>
@@ -6376,7 +6041,7 @@
   </w:style>
   <w:style w:type="table" w:styleId="26">
     <w:name w:val="Grid Table 2"/>
-    <w:basedOn w:val="735"/>
+    <w:basedOn w:val="733"/>
     <w:uiPriority w:val="99"/>
     <w:pPr>
       <w:pBdr/>
@@ -6608,7 +6273,7 @@
   </w:style>
   <w:style w:type="table" w:styleId="27">
     <w:name w:val="Grid Table 2 - Accent 1"/>
-    <w:basedOn w:val="735"/>
+    <w:basedOn w:val="733"/>
     <w:uiPriority w:val="99"/>
     <w:pPr>
       <w:pBdr/>
@@ -6840,7 +6505,7 @@
   </w:style>
   <w:style w:type="table" w:styleId="28">
     <w:name w:val="Grid Table 2 - Accent 2"/>
-    <w:basedOn w:val="735"/>
+    <w:basedOn w:val="733"/>
     <w:uiPriority w:val="99"/>
     <w:pPr>
       <w:pBdr/>
@@ -7072,7 +6737,7 @@
   </w:style>
   <w:style w:type="table" w:styleId="29">
     <w:name w:val="Grid Table 2 - Accent 3"/>
-    <w:basedOn w:val="735"/>
+    <w:basedOn w:val="733"/>
     <w:uiPriority w:val="99"/>
     <w:pPr>
       <w:pBdr/>
@@ -7304,7 +6969,7 @@
   </w:style>
   <w:style w:type="table" w:styleId="30">
     <w:name w:val="Grid Table 2 - Accent 4"/>
-    <w:basedOn w:val="735"/>
+    <w:basedOn w:val="733"/>
     <w:uiPriority w:val="99"/>
     <w:pPr>
       <w:pBdr/>
@@ -7536,7 +7201,7 @@
   </w:style>
   <w:style w:type="table" w:styleId="31">
     <w:name w:val="Grid Table 2 - Accent 5"/>
-    <w:basedOn w:val="735"/>
+    <w:basedOn w:val="733"/>
     <w:uiPriority w:val="99"/>
     <w:pPr>
       <w:pBdr/>
@@ -7768,7 +7433,7 @@
   </w:style>
   <w:style w:type="table" w:styleId="32">
     <w:name w:val="Grid Table 2 - Accent 6"/>
-    <w:basedOn w:val="735"/>
+    <w:basedOn w:val="733"/>
     <w:uiPriority w:val="99"/>
     <w:pPr>
       <w:pBdr/>
@@ -8000,7 +7665,7 @@
   </w:style>
   <w:style w:type="table" w:styleId="33">
     <w:name w:val="Grid Table 3"/>
-    <w:basedOn w:val="735"/>
+    <w:basedOn w:val="733"/>
     <w:uiPriority w:val="99"/>
     <w:pPr>
       <w:pBdr/>
@@ -8245,7 +7910,7 @@
   </w:style>
   <w:style w:type="table" w:styleId="34">
     <w:name w:val="Grid Table 3 - Accent 1"/>
-    <w:basedOn w:val="735"/>
+    <w:basedOn w:val="733"/>
     <w:uiPriority w:val="99"/>
     <w:pPr>
       <w:pBdr/>
@@ -8490,7 +8155,7 @@
   </w:style>
   <w:style w:type="table" w:styleId="35">
     <w:name w:val="Grid Table 3 - Accent 2"/>
-    <w:basedOn w:val="735"/>
+    <w:basedOn w:val="733"/>
     <w:uiPriority w:val="99"/>
     <w:pPr>
       <w:pBdr/>
@@ -8735,7 +8400,7 @@
   </w:style>
   <w:style w:type="table" w:styleId="36">
     <w:name w:val="Grid Table 3 - Accent 3"/>
-    <w:basedOn w:val="735"/>
+    <w:basedOn w:val="733"/>
     <w:uiPriority w:val="99"/>
     <w:pPr>
       <w:pBdr/>
@@ -8980,7 +8645,7 @@
   </w:style>
   <w:style w:type="table" w:styleId="37">
     <w:name w:val="Grid Table 3 - Accent 4"/>
-    <w:basedOn w:val="735"/>
+    <w:basedOn w:val="733"/>
     <w:uiPriority w:val="99"/>
     <w:pPr>
       <w:pBdr/>
@@ -9225,7 +8890,7 @@
   </w:style>
   <w:style w:type="table" w:styleId="38">
     <w:name w:val="Grid Table 3 - Accent 5"/>
-    <w:basedOn w:val="735"/>
+    <w:basedOn w:val="733"/>
     <w:uiPriority w:val="99"/>
     <w:pPr>
       <w:pBdr/>
@@ -9470,7 +9135,7 @@
   </w:style>
   <w:style w:type="table" w:styleId="39">
     <w:name w:val="Grid Table 3 - Accent 6"/>
-    <w:basedOn w:val="735"/>
+    <w:basedOn w:val="733"/>
     <w:uiPriority w:val="99"/>
     <w:pPr>
       <w:pBdr/>
@@ -9715,7 +9380,7 @@
   </w:style>
   <w:style w:type="table" w:styleId="40">
     <w:name w:val="Grid Table 4"/>
-    <w:basedOn w:val="735"/>
+    <w:basedOn w:val="733"/>
     <w:uiPriority w:val="59"/>
     <w:pPr>
       <w:pBdr/>
@@ -9948,7 +9613,7 @@
   </w:style>
   <w:style w:type="table" w:styleId="41">
     <w:name w:val="Grid Table 4 - Accent 1"/>
-    <w:basedOn w:val="735"/>
+    <w:basedOn w:val="733"/>
     <w:uiPriority w:val="59"/>
     <w:pPr>
       <w:pBdr/>
@@ -10181,7 +9846,7 @@
   </w:style>
   <w:style w:type="table" w:styleId="42">
     <w:name w:val="Grid Table 4 - Accent 2"/>
-    <w:basedOn w:val="735"/>
+    <w:basedOn w:val="733"/>
     <w:uiPriority w:val="59"/>
     <w:pPr>
       <w:pBdr/>
@@ -10414,7 +10079,7 @@
   </w:style>
   <w:style w:type="table" w:styleId="43">
     <w:name w:val="Grid Table 4 - Accent 3"/>
-    <w:basedOn w:val="735"/>
+    <w:basedOn w:val="733"/>
     <w:uiPriority w:val="59"/>
     <w:pPr>
       <w:pBdr/>
@@ -10647,7 +10312,7 @@
   </w:style>
   <w:style w:type="table" w:styleId="44">
     <w:name w:val="Grid Table 4 - Accent 4"/>
-    <w:basedOn w:val="735"/>
+    <w:basedOn w:val="733"/>
     <w:uiPriority w:val="59"/>
     <w:pPr>
       <w:pBdr/>
@@ -10880,7 +10545,7 @@
   </w:style>
   <w:style w:type="table" w:styleId="45">
     <w:name w:val="Grid Table 4 - Accent 5"/>
-    <w:basedOn w:val="735"/>
+    <w:basedOn w:val="733"/>
     <w:uiPriority w:val="59"/>
     <w:pPr>
       <w:pBdr/>
@@ -11113,7 +10778,7 @@
   </w:style>
   <w:style w:type="table" w:styleId="46">
     <w:name w:val="Grid Table 4 - Accent 6"/>
-    <w:basedOn w:val="735"/>
+    <w:basedOn w:val="733"/>
     <w:uiPriority w:val="59"/>
     <w:pPr>
       <w:pBdr/>
@@ -11346,7 +11011,7 @@
   </w:style>
   <w:style w:type="table" w:styleId="47">
     <w:name w:val="Grid Table 5 Dark"/>
-    <w:basedOn w:val="735"/>
+    <w:basedOn w:val="733"/>
     <w:uiPriority w:val="99"/>
     <w:pPr>
       <w:pBdr/>
@@ -11574,7 +11239,7 @@
   </w:style>
   <w:style w:type="table" w:styleId="48">
     <w:name w:val="Grid Table 5 Dark- Accent 1"/>
-    <w:basedOn w:val="735"/>
+    <w:basedOn w:val="733"/>
     <w:uiPriority w:val="99"/>
     <w:pPr>
       <w:pBdr/>
@@ -11802,7 +11467,7 @@
   </w:style>
   <w:style w:type="table" w:styleId="49">
     <w:name w:val="Grid Table 5 Dark - Accent 2"/>
-    <w:basedOn w:val="735"/>
+    <w:basedOn w:val="733"/>
     <w:uiPriority w:val="99"/>
     <w:pPr>
       <w:pBdr/>
@@ -12030,7 +11695,7 @@
   </w:style>
   <w:style w:type="table" w:styleId="50">
     <w:name w:val="Grid Table 5 Dark - Accent 3"/>
-    <w:basedOn w:val="735"/>
+    <w:basedOn w:val="733"/>
     <w:uiPriority w:val="99"/>
     <w:pPr>
       <w:pBdr/>
@@ -12258,7 +11923,7 @@
   </w:style>
   <w:style w:type="table" w:styleId="51">
     <w:name w:val="Grid Table 5 Dark- Accent 4"/>
-    <w:basedOn w:val="735"/>
+    <w:basedOn w:val="733"/>
     <w:uiPriority w:val="99"/>
     <w:pPr>
       <w:pBdr/>
@@ -12486,7 +12151,7 @@
   </w:style>
   <w:style w:type="table" w:styleId="52">
     <w:name w:val="Grid Table 5 Dark - Accent 5"/>
-    <w:basedOn w:val="735"/>
+    <w:basedOn w:val="733"/>
     <w:uiPriority w:val="99"/>
     <w:pPr>
       <w:pBdr/>
@@ -12714,7 +12379,7 @@
   </w:style>
   <w:style w:type="table" w:styleId="53">
     <w:name w:val="Grid Table 5 Dark - Accent 6"/>
-    <w:basedOn w:val="735"/>
+    <w:basedOn w:val="733"/>
     <w:uiPriority w:val="99"/>
     <w:pPr>
       <w:pBdr/>
@@ -12942,7 +12607,7 @@
   </w:style>
   <w:style w:type="table" w:styleId="54">
     <w:name w:val="Grid Table 6 Colorful"/>
-    <w:basedOn w:val="735"/>
+    <w:basedOn w:val="733"/>
     <w:uiPriority w:val="99"/>
     <w:pPr>
       <w:pBdr/>
@@ -13172,7 +12837,7 @@
   </w:style>
   <w:style w:type="table" w:styleId="55">
     <w:name w:val="Grid Table 6 Colorful - Accent 1"/>
-    <w:basedOn w:val="735"/>
+    <w:basedOn w:val="733"/>
     <w:uiPriority w:val="99"/>
     <w:pPr>
       <w:pBdr/>
@@ -13402,7 +13067,7 @@
   </w:style>
   <w:style w:type="table" w:styleId="56">
     <w:name w:val="Grid Table 6 Colorful - Accent 2"/>
-    <w:basedOn w:val="735"/>
+    <w:basedOn w:val="733"/>
     <w:uiPriority w:val="99"/>
     <w:pPr>
       <w:pBdr/>
@@ -13632,7 +13297,7 @@
   </w:style>
   <w:style w:type="table" w:styleId="57">
     <w:name w:val="Grid Table 6 Colorful - Accent 3"/>
-    <w:basedOn w:val="735"/>
+    <w:basedOn w:val="733"/>
     <w:uiPriority w:val="99"/>
     <w:pPr>
       <w:pBdr/>
@@ -13862,7 +13527,7 @@
   </w:style>
   <w:style w:type="table" w:styleId="58">
     <w:name w:val="Grid Table 6 Colorful - Accent 4"/>
-    <w:basedOn w:val="735"/>
+    <w:basedOn w:val="733"/>
     <w:uiPriority w:val="99"/>
     <w:pPr>
       <w:pBdr/>
@@ -14092,7 +13757,7 @@
   </w:style>
   <w:style w:type="table" w:styleId="59">
     <w:name w:val="Grid Table 6 Colorful - Accent 5"/>
-    <w:basedOn w:val="735"/>
+    <w:basedOn w:val="733"/>
     <w:uiPriority w:val="99"/>
     <w:pPr>
       <w:pBdr/>
@@ -14322,7 +13987,7 @@
   </w:style>
   <w:style w:type="table" w:styleId="60">
     <w:name w:val="Grid Table 6 Colorful - Accent 6"/>
-    <w:basedOn w:val="735"/>
+    <w:basedOn w:val="733"/>
     <w:uiPriority w:val="99"/>
     <w:pPr>
       <w:pBdr/>
@@ -14552,7 +14217,7 @@
   </w:style>
   <w:style w:type="table" w:styleId="61">
     <w:name w:val="Grid Table 7 Colorful"/>
-    <w:basedOn w:val="735"/>
+    <w:basedOn w:val="733"/>
     <w:uiPriority w:val="99"/>
     <w:pPr>
       <w:pBdr/>
@@ -14806,7 +14471,7 @@
   </w:style>
   <w:style w:type="table" w:styleId="62">
     <w:name w:val="Grid Table 7 Colorful - Accent 1"/>
-    <w:basedOn w:val="735"/>
+    <w:basedOn w:val="733"/>
     <w:uiPriority w:val="99"/>
     <w:pPr>
       <w:pBdr/>
@@ -15060,7 +14725,7 @@
   </w:style>
   <w:style w:type="table" w:styleId="63">
     <w:name w:val="Grid Table 7 Colorful - Accent 2"/>
-    <w:basedOn w:val="735"/>
+    <w:basedOn w:val="733"/>
     <w:uiPriority w:val="99"/>
     <w:pPr>
       <w:pBdr/>
@@ -15314,7 +14979,7 @@
   </w:style>
   <w:style w:type="table" w:styleId="64">
     <w:name w:val="Grid Table 7 Colorful - Accent 3"/>
-    <w:basedOn w:val="735"/>
+    <w:basedOn w:val="733"/>
     <w:uiPriority w:val="99"/>
     <w:pPr>
       <w:pBdr/>
@@ -15568,7 +15233,7 @@
   </w:style>
   <w:style w:type="table" w:styleId="65">
     <w:name w:val="Grid Table 7 Colorful - Accent 4"/>
-    <w:basedOn w:val="735"/>
+    <w:basedOn w:val="733"/>
     <w:uiPriority w:val="99"/>
     <w:pPr>
       <w:pBdr/>
@@ -15822,7 +15487,7 @@
   </w:style>
   <w:style w:type="table" w:styleId="66">
     <w:name w:val="Grid Table 7 Colorful - Accent 5"/>
-    <w:basedOn w:val="735"/>
+    <w:basedOn w:val="733"/>
     <w:uiPriority w:val="99"/>
     <w:pPr>
       <w:pBdr/>
@@ -16076,7 +15741,7 @@
   </w:style>
   <w:style w:type="table" w:styleId="67">
     <w:name w:val="Grid Table 7 Colorful - Accent 6"/>
-    <w:basedOn w:val="735"/>
+    <w:basedOn w:val="733"/>
     <w:uiPriority w:val="99"/>
     <w:pPr>
       <w:pBdr/>
@@ -16330,7 +15995,7 @@
   </w:style>
   <w:style w:type="table" w:styleId="68">
     <w:name w:val="List Table 1 Light"/>
-    <w:basedOn w:val="735"/>
+    <w:basedOn w:val="733"/>
     <w:uiPriority w:val="99"/>
     <w:pPr>
       <w:pBdr/>
@@ -16546,7 +16211,7 @@
   </w:style>
   <w:style w:type="table" w:styleId="69">
     <w:name w:val="List Table 1 Light - Accent 1"/>
-    <w:basedOn w:val="735"/>
+    <w:basedOn w:val="733"/>
     <w:uiPriority w:val="99"/>
     <w:pPr>
       <w:pBdr/>
@@ -16762,7 +16427,7 @@
   </w:style>
   <w:style w:type="table" w:styleId="70">
     <w:name w:val="List Table 1 Light - Accent 2"/>
-    <w:basedOn w:val="735"/>
+    <w:basedOn w:val="733"/>
     <w:uiPriority w:val="99"/>
     <w:pPr>
       <w:pBdr/>
@@ -16978,7 +16643,7 @@
   </w:style>
   <w:style w:type="table" w:styleId="71">
     <w:name w:val="List Table 1 Light - Accent 3"/>
-    <w:basedOn w:val="735"/>
+    <w:basedOn w:val="733"/>
     <w:uiPriority w:val="99"/>
     <w:pPr>
       <w:pBdr/>
@@ -17194,7 +16859,7 @@
   </w:style>
   <w:style w:type="table" w:styleId="72">
     <w:name w:val="List Table 1 Light - Accent 4"/>
-    <w:basedOn w:val="735"/>
+    <w:basedOn w:val="733"/>
     <w:uiPriority w:val="99"/>
     <w:pPr>
       <w:pBdr/>
@@ -17410,7 +17075,7 @@
   </w:style>
   <w:style w:type="table" w:styleId="73">
     <w:name w:val="List Table 1 Light - Accent 5"/>
-    <w:basedOn w:val="735"/>
+    <w:basedOn w:val="733"/>
     <w:uiPriority w:val="99"/>
     <w:pPr>
       <w:pBdr/>
@@ -17626,7 +17291,7 @@
   </w:style>
   <w:style w:type="table" w:styleId="74">
     <w:name w:val="List Table 1 Light - Accent 6"/>
-    <w:basedOn w:val="735"/>
+    <w:basedOn w:val="733"/>
     <w:uiPriority w:val="99"/>
     <w:pPr>
       <w:pBdr/>
@@ -17842,7 +17507,7 @@
   </w:style>
   <w:style w:type="table" w:styleId="75">
     <w:name w:val="List Table 2"/>
-    <w:basedOn w:val="735"/>
+    <w:basedOn w:val="733"/>
     <w:uiPriority w:val="99"/>
     <w:pPr>
       <w:pBdr/>
@@ -18080,7 +17745,7 @@
   </w:style>
   <w:style w:type="table" w:styleId="76">
     <w:name w:val="List Table 2 - Accent 1"/>
-    <w:basedOn w:val="735"/>
+    <w:basedOn w:val="733"/>
     <w:uiPriority w:val="99"/>
     <w:pPr>
       <w:pBdr/>
@@ -18318,7 +17983,7 @@
   </w:style>
   <w:style w:type="table" w:styleId="77">
     <w:name w:val="List Table 2 - Accent 2"/>
-    <w:basedOn w:val="735"/>
+    <w:basedOn w:val="733"/>
     <w:uiPriority w:val="99"/>
     <w:pPr>
       <w:pBdr/>
@@ -18556,7 +18221,7 @@
   </w:style>
   <w:style w:type="table" w:styleId="78">
     <w:name w:val="List Table 2 - Accent 3"/>
-    <w:basedOn w:val="735"/>
+    <w:basedOn w:val="733"/>
     <w:uiPriority w:val="99"/>
     <w:pPr>
       <w:pBdr/>
@@ -18794,7 +18459,7 @@
   </w:style>
   <w:style w:type="table" w:styleId="79">
     <w:name w:val="List Table 2 - Accent 4"/>
-    <w:basedOn w:val="735"/>
+    <w:basedOn w:val="733"/>
     <w:uiPriority w:val="99"/>
     <w:pPr>
       <w:pBdr/>
@@ -19032,7 +18697,7 @@
   </w:style>
   <w:style w:type="table" w:styleId="80">
     <w:name w:val="List Table 2 - Accent 5"/>
-    <w:basedOn w:val="735"/>
+    <w:basedOn w:val="733"/>
     <w:uiPriority w:val="99"/>
     <w:pPr>
       <w:pBdr/>
@@ -19270,7 +18935,7 @@
   </w:style>
   <w:style w:type="table" w:styleId="81">
     <w:name w:val="List Table 2 - Accent 6"/>
-    <w:basedOn w:val="735"/>
+    <w:basedOn w:val="733"/>
     <w:uiPriority w:val="99"/>
     <w:pPr>
       <w:pBdr/>
@@ -19508,7 +19173,7 @@
   </w:style>
   <w:style w:type="table" w:styleId="82">
     <w:name w:val="List Table 3"/>
-    <w:basedOn w:val="735"/>
+    <w:basedOn w:val="733"/>
     <w:uiPriority w:val="99"/>
     <w:pPr>
       <w:pBdr/>
@@ -19736,7 +19401,7 @@
   </w:style>
   <w:style w:type="table" w:styleId="83">
     <w:name w:val="List Table 3 - Accent 1"/>
-    <w:basedOn w:val="735"/>
+    <w:basedOn w:val="733"/>
     <w:uiPriority w:val="99"/>
     <w:pPr>
       <w:pBdr/>
@@ -19964,7 +19629,7 @@
   </w:style>
   <w:style w:type="table" w:styleId="84">
     <w:name w:val="List Table 3 - Accent 2"/>
-    <w:basedOn w:val="735"/>
+    <w:basedOn w:val="733"/>
     <w:uiPriority w:val="99"/>
     <w:pPr>
       <w:pBdr/>
@@ -20192,7 +19857,7 @@
   </w:style>
   <w:style w:type="table" w:styleId="85">
     <w:name w:val="List Table 3 - Accent 3"/>
-    <w:basedOn w:val="735"/>
+    <w:basedOn w:val="733"/>
     <w:uiPriority w:val="99"/>
     <w:pPr>
       <w:pBdr/>
@@ -20420,7 +20085,7 @@
   </w:style>
   <w:style w:type="table" w:styleId="86">
     <w:name w:val="List Table 3 - Accent 4"/>
-    <w:basedOn w:val="735"/>
+    <w:basedOn w:val="733"/>
     <w:uiPriority w:val="99"/>
     <w:pPr>
       <w:pBdr/>
@@ -20648,7 +20313,7 @@
   </w:style>
   <w:style w:type="table" w:styleId="87">
     <w:name w:val="List Table 3 - Accent 5"/>
-    <w:basedOn w:val="735"/>
+    <w:basedOn w:val="733"/>
     <w:uiPriority w:val="99"/>
     <w:pPr>
       <w:pBdr/>
@@ -20876,7 +20541,7 @@
   </w:style>
   <w:style w:type="table" w:styleId="88">
     <w:name w:val="List Table 3 - Accent 6"/>
-    <w:basedOn w:val="735"/>
+    <w:basedOn w:val="733"/>
     <w:uiPriority w:val="99"/>
     <w:pPr>
       <w:pBdr/>
@@ -21104,7 +20769,7 @@
   </w:style>
   <w:style w:type="table" w:styleId="89">
     <w:name w:val="List Table 4"/>
-    <w:basedOn w:val="735"/>
+    <w:basedOn w:val="733"/>
     <w:uiPriority w:val="99"/>
     <w:pPr>
       <w:pBdr/>
@@ -21329,7 +20994,7 @@
   </w:style>
   <w:style w:type="table" w:styleId="90">
     <w:name w:val="List Table 4 - Accent 1"/>
-    <w:basedOn w:val="735"/>
+    <w:basedOn w:val="733"/>
     <w:uiPriority w:val="99"/>
     <w:pPr>
       <w:pBdr/>
@@ -21554,7 +21219,7 @@
   </w:style>
   <w:style w:type="table" w:styleId="91">
     <w:name w:val="List Table 4 - Accent 2"/>
-    <w:basedOn w:val="735"/>
+    <w:basedOn w:val="733"/>
     <w:uiPriority w:val="99"/>
     <w:pPr>
       <w:pBdr/>
@@ -21779,7 +21444,7 @@
   </w:style>
   <w:style w:type="table" w:styleId="92">
     <w:name w:val="List Table 4 - Accent 3"/>
-    <w:basedOn w:val="735"/>
+    <w:basedOn w:val="733"/>
     <w:uiPriority w:val="99"/>
     <w:pPr>
       <w:pBdr/>
@@ -22004,7 +21669,7 @@
   </w:style>
   <w:style w:type="table" w:styleId="93">
     <w:name w:val="List Table 4 - Accent 4"/>
-    <w:basedOn w:val="735"/>
+    <w:basedOn w:val="733"/>
     <w:uiPriority w:val="99"/>
     <w:pPr>
       <w:pBdr/>
@@ -22229,7 +21894,7 @@
   </w:style>
   <w:style w:type="table" w:styleId="94">
     <w:name w:val="List Table 4 - Accent 5"/>
-    <w:basedOn w:val="735"/>
+    <w:basedOn w:val="733"/>
     <w:uiPriority w:val="99"/>
     <w:pPr>
       <w:pBdr/>
@@ -22454,7 +22119,7 @@
   </w:style>
   <w:style w:type="table" w:styleId="95">
     <w:name w:val="List Table 4 - Accent 6"/>
-    <w:basedOn w:val="735"/>
+    <w:basedOn w:val="733"/>
     <w:uiPriority w:val="99"/>
     <w:pPr>
       <w:pBdr/>
@@ -22679,7 +22344,7 @@
   </w:style>
   <w:style w:type="table" w:styleId="96">
     <w:name w:val="List Table 5 Dark"/>
-    <w:basedOn w:val="735"/>
+    <w:basedOn w:val="733"/>
     <w:uiPriority w:val="99"/>
     <w:pPr>
       <w:pBdr/>
@@ -22921,7 +22586,7 @@
   </w:style>
   <w:style w:type="table" w:styleId="97">
     <w:name w:val="List Table 5 Dark - Accent 1"/>
-    <w:basedOn w:val="735"/>
+    <w:basedOn w:val="733"/>
     <w:uiPriority w:val="99"/>
     <w:pPr>
       <w:pBdr/>
@@ -23163,7 +22828,7 @@
   </w:style>
   <w:style w:type="table" w:styleId="98">
     <w:name w:val="List Table 5 Dark - Accent 2"/>
-    <w:basedOn w:val="735"/>
+    <w:basedOn w:val="733"/>
     <w:uiPriority w:val="99"/>
     <w:pPr>
       <w:pBdr/>
@@ -23405,7 +23070,7 @@
   </w:style>
   <w:style w:type="table" w:styleId="99">
     <w:name w:val="List Table 5 Dark - Accent 3"/>
-    <w:basedOn w:val="735"/>
+    <w:basedOn w:val="733"/>
     <w:uiPriority w:val="99"/>
     <w:pPr>
       <w:pBdr/>
@@ -23647,7 +23312,7 @@
   </w:style>
   <w:style w:type="table" w:styleId="100">
     <w:name w:val="List Table 5 Dark - Accent 4"/>
-    <w:basedOn w:val="735"/>
+    <w:basedOn w:val="733"/>
     <w:uiPriority w:val="99"/>
     <w:pPr>
       <w:pBdr/>
@@ -23889,7 +23554,7 @@
   </w:style>
   <w:style w:type="table" w:styleId="101">
     <w:name w:val="List Table 5 Dark - Accent 5"/>
-    <w:basedOn w:val="735"/>
+    <w:basedOn w:val="733"/>
     <w:uiPriority w:val="99"/>
     <w:pPr>
       <w:pBdr/>
@@ -24131,7 +23796,7 @@
   </w:style>
   <w:style w:type="table" w:styleId="102">
     <w:name w:val="List Table 5 Dark - Accent 6"/>
-    <w:basedOn w:val="735"/>
+    <w:basedOn w:val="733"/>
     <w:uiPriority w:val="99"/>
     <w:pPr>
       <w:pBdr/>
@@ -24373,7 +24038,7 @@
   </w:style>
   <w:style w:type="table" w:styleId="103">
     <w:name w:val="List Table 6 Colorful"/>
-    <w:basedOn w:val="735"/>
+    <w:basedOn w:val="733"/>
     <w:uiPriority w:val="99"/>
     <w:pPr>
       <w:pBdr/>
@@ -24596,7 +24261,7 @@
   </w:style>
   <w:style w:type="table" w:styleId="104">
     <w:name w:val="List Table 6 Colorful - Accent 1"/>
-    <w:basedOn w:val="735"/>
+    <w:basedOn w:val="733"/>
     <w:uiPriority w:val="99"/>
     <w:pPr>
       <w:pBdr/>
@@ -24819,7 +24484,7 @@
   </w:style>
   <w:style w:type="table" w:styleId="105">
     <w:name w:val="List Table 6 Colorful - Accent 2"/>
-    <w:basedOn w:val="735"/>
+    <w:basedOn w:val="733"/>
     <w:uiPriority w:val="99"/>
     <w:pPr>
       <w:pBdr/>
@@ -25042,7 +24707,7 @@
   </w:style>
   <w:style w:type="table" w:styleId="106">
     <w:name w:val="List Table 6 Colorful - Accent 3"/>
-    <w:basedOn w:val="735"/>
+    <w:basedOn w:val="733"/>
     <w:uiPriority w:val="99"/>
     <w:pPr>
       <w:pBdr/>
@@ -25265,7 +24930,7 @@
   </w:style>
   <w:style w:type="table" w:styleId="107">
     <w:name w:val="List Table 6 Colorful - Accent 4"/>
-    <w:basedOn w:val="735"/>
+    <w:basedOn w:val="733"/>
     <w:uiPriority w:val="99"/>
     <w:pPr>
       <w:pBdr/>
@@ -25488,7 +25153,7 @@
   </w:style>
   <w:style w:type="table" w:styleId="108">
     <w:name w:val="List Table 6 Colorful - Accent 5"/>
-    <w:basedOn w:val="735"/>
+    <w:basedOn w:val="733"/>
     <w:uiPriority w:val="99"/>
     <w:pPr>
       <w:pBdr/>
@@ -25711,7 +25376,7 @@
   </w:style>
   <w:style w:type="table" w:styleId="109">
     <w:name w:val="List Table 6 Colorful - Accent 6"/>
-    <w:basedOn w:val="735"/>
+    <w:basedOn w:val="733"/>
     <w:uiPriority w:val="99"/>
     <w:pPr>
       <w:pBdr/>
@@ -25934,7 +25599,7 @@
   </w:style>
   <w:style w:type="table" w:styleId="110">
     <w:name w:val="List Table 7 Colorful"/>
-    <w:basedOn w:val="735"/>
+    <w:basedOn w:val="733"/>
     <w:uiPriority w:val="99"/>
     <w:pPr>
       <w:pBdr/>
@@ -26190,7 +25855,7 @@
   </w:style>
   <w:style w:type="table" w:styleId="111">
     <w:name w:val="List Table 7 Colorful - Accent 1"/>
-    <w:basedOn w:val="735"/>
+    <w:basedOn w:val="733"/>
     <w:uiPriority w:val="99"/>
     <w:pPr>
       <w:pBdr/>
@@ -26446,7 +26111,7 @@
   </w:style>
   <w:style w:type="table" w:styleId="112">
     <w:name w:val="List Table 7 Colorful - Accent 2"/>
-    <w:basedOn w:val="735"/>
+    <w:basedOn w:val="733"/>
     <w:uiPriority w:val="99"/>
     <w:pPr>
       <w:pBdr/>
@@ -26702,7 +26367,7 @@
   </w:style>
   <w:style w:type="table" w:styleId="113">
     <w:name w:val="List Table 7 Colorful - Accent 3"/>
-    <w:basedOn w:val="735"/>
+    <w:basedOn w:val="733"/>
     <w:uiPriority w:val="99"/>
     <w:pPr>
       <w:pBdr/>
@@ -26958,7 +26623,7 @@
   </w:style>
   <w:style w:type="table" w:styleId="114">
     <w:name w:val="List Table 7 Colorful - Accent 4"/>
-    <w:basedOn w:val="735"/>
+    <w:basedOn w:val="733"/>
     <w:uiPriority w:val="99"/>
     <w:pPr>
       <w:pBdr/>
@@ -27214,7 +26879,7 @@
   </w:style>
   <w:style w:type="table" w:styleId="115">
     <w:name w:val="List Table 7 Colorful - Accent 5"/>
-    <w:basedOn w:val="735"/>
+    <w:basedOn w:val="733"/>
     <w:uiPriority w:val="99"/>
     <w:pPr>
       <w:pBdr/>
@@ -27470,7 +27135,7 @@
   </w:style>
   <w:style w:type="table" w:styleId="116">
     <w:name w:val="List Table 7 Colorful - Accent 6"/>
-    <w:basedOn w:val="735"/>
+    <w:basedOn w:val="733"/>
     <w:uiPriority w:val="99"/>
     <w:pPr>
       <w:pBdr/>
@@ -27726,7 +27391,7 @@
   </w:style>
   <w:style w:type="table" w:styleId="117">
     <w:name w:val="Lined - Accent"/>
-    <w:basedOn w:val="735"/>
+    <w:basedOn w:val="733"/>
     <w:uiPriority w:val="99"/>
     <w:pPr>
       <w:pBdr/>
@@ -27963,7 +27628,7 @@
   </w:style>
   <w:style w:type="table" w:styleId="118">
     <w:name w:val="Lined - Accent 1"/>
-    <w:basedOn w:val="735"/>
+    <w:basedOn w:val="733"/>
     <w:uiPriority w:val="99"/>
     <w:pPr>
       <w:pBdr/>
@@ -28200,7 +27865,7 @@
   </w:style>
   <w:style w:type="table" w:styleId="119">
     <w:name w:val="Lined - Accent 2"/>
-    <w:basedOn w:val="735"/>
+    <w:basedOn w:val="733"/>
     <w:uiPriority w:val="99"/>
     <w:pPr>
       <w:pBdr/>
@@ -28437,7 +28102,7 @@
   </w:style>
   <w:style w:type="table" w:styleId="120">
     <w:name w:val="Lined - Accent 3"/>
-    <w:basedOn w:val="735"/>
+    <w:basedOn w:val="733"/>
     <w:uiPriority w:val="99"/>
     <w:pPr>
       <w:pBdr/>
@@ -28674,7 +28339,7 @@
   </w:style>
   <w:style w:type="table" w:styleId="121">
     <w:name w:val="Lined - Accent 4"/>
-    <w:basedOn w:val="735"/>
+    <w:basedOn w:val="733"/>
     <w:uiPriority w:val="99"/>
     <w:pPr>
       <w:pBdr/>
@@ -28911,7 +28576,7 @@
   </w:style>
   <w:style w:type="table" w:styleId="122">
     <w:name w:val="Lined - Accent 5"/>
-    <w:basedOn w:val="735"/>
+    <w:basedOn w:val="733"/>
     <w:uiPriority w:val="99"/>
     <w:pPr>
       <w:pBdr/>
@@ -29148,7 +28813,7 @@
   </w:style>
   <w:style w:type="table" w:styleId="123">
     <w:name w:val="Lined - Accent 6"/>
-    <w:basedOn w:val="735"/>
+    <w:basedOn w:val="733"/>
     <w:uiPriority w:val="99"/>
     <w:pPr>
       <w:pBdr/>
@@ -29385,7 +29050,7 @@
   </w:style>
   <w:style w:type="table" w:styleId="124">
     <w:name w:val="Bordered &amp; Lined - Accent"/>
-    <w:basedOn w:val="735"/>
+    <w:basedOn w:val="733"/>
     <w:uiPriority w:val="99"/>
     <w:pPr>
       <w:pBdr/>
@@ -29629,7 +29294,7 @@
   </w:style>
   <w:style w:type="table" w:styleId="125">
     <w:name w:val="Bordered &amp; Lined - Accent 1"/>
-    <w:basedOn w:val="735"/>
+    <w:basedOn w:val="733"/>
     <w:uiPriority w:val="99"/>
     <w:pPr>
       <w:pBdr/>
@@ -29873,7 +29538,7 @@
   </w:style>
   <w:style w:type="table" w:styleId="126">
     <w:name w:val="Bordered &amp; Lined - Accent 2"/>
-    <w:basedOn w:val="735"/>
+    <w:basedOn w:val="733"/>
     <w:uiPriority w:val="99"/>
     <w:pPr>
       <w:pBdr/>
@@ -30117,7 +29782,7 @@
   </w:style>
   <w:style w:type="table" w:styleId="127">
     <w:name w:val="Bordered &amp; Lined - Accent 3"/>
-    <w:basedOn w:val="735"/>
+    <w:basedOn w:val="733"/>
     <w:uiPriority w:val="99"/>
     <w:pPr>
       <w:pBdr/>
@@ -30361,7 +30026,7 @@
   </w:style>
   <w:style w:type="table" w:styleId="128">
     <w:name w:val="Bordered &amp; Lined - Accent 4"/>
-    <w:basedOn w:val="735"/>
+    <w:basedOn w:val="733"/>
     <w:uiPriority w:val="99"/>
     <w:pPr>
       <w:pBdr/>
@@ -30605,7 +30270,7 @@
   </w:style>
   <w:style w:type="table" w:styleId="129">
     <w:name w:val="Bordered &amp; Lined - Accent 5"/>
-    <w:basedOn w:val="735"/>
+    <w:basedOn w:val="733"/>
     <w:uiPriority w:val="99"/>
     <w:pPr>
       <w:pBdr/>
@@ -30849,7 +30514,7 @@
   </w:style>
   <w:style w:type="table" w:styleId="130">
     <w:name w:val="Bordered &amp; Lined - Accent 6"/>
-    <w:basedOn w:val="735"/>
+    <w:basedOn w:val="733"/>
     <w:uiPriority w:val="99"/>
     <w:pPr>
       <w:pBdr/>
@@ -31093,7 +30758,7 @@
   </w:style>
   <w:style w:type="table" w:styleId="131">
     <w:name w:val="Bordered"/>
-    <w:basedOn w:val="735"/>
+    <w:basedOn w:val="733"/>
     <w:uiPriority w:val="99"/>
     <w:pPr>
       <w:pBdr/>
@@ -31324,7 +30989,7 @@
   </w:style>
   <w:style w:type="table" w:styleId="132">
     <w:name w:val="Bordered - Accent 1"/>
-    <w:basedOn w:val="735"/>
+    <w:basedOn w:val="733"/>
     <w:uiPriority w:val="99"/>
     <w:pPr>
       <w:pBdr/>
@@ -31555,7 +31220,7 @@
   </w:style>
   <w:style w:type="table" w:styleId="133">
     <w:name w:val="Bordered - Accent 2"/>
-    <w:basedOn w:val="735"/>
+    <w:basedOn w:val="733"/>
     <w:uiPriority w:val="99"/>
     <w:pPr>
       <w:pBdr/>
@@ -31786,7 +31451,7 @@
   </w:style>
   <w:style w:type="table" w:styleId="134">
     <w:name w:val="Bordered - Accent 3"/>
-    <w:basedOn w:val="735"/>
+    <w:basedOn w:val="733"/>
     <w:uiPriority w:val="99"/>
     <w:pPr>
       <w:pBdr/>
@@ -32017,7 +31682,7 @@
   </w:style>
   <w:style w:type="table" w:styleId="135">
     <w:name w:val="Bordered - Accent 4"/>
-    <w:basedOn w:val="735"/>
+    <w:basedOn w:val="733"/>
     <w:uiPriority w:val="99"/>
     <w:pPr>
       <w:pBdr/>
@@ -32248,7 +31913,7 @@
   </w:style>
   <w:style w:type="table" w:styleId="136">
     <w:name w:val="Bordered - Accent 5"/>
-    <w:basedOn w:val="735"/>
+    <w:basedOn w:val="733"/>
     <w:uiPriority w:val="99"/>
     <w:pPr>
       <w:pBdr/>
@@ -32479,7 +32144,7 @@
   </w:style>
   <w:style w:type="table" w:styleId="137">
     <w:name w:val="Bordered - Accent 6"/>
-    <w:basedOn w:val="735"/>
+    <w:basedOn w:val="733"/>
     <w:uiPriority w:val="99"/>
     <w:pPr>
       <w:pBdr/>
@@ -32710,8 +32375,8 @@
   </w:style>
   <w:style w:type="paragraph" w:styleId="145">
     <w:name w:val="Heading 7"/>
-    <w:basedOn w:val="727"/>
-    <w:next w:val="727"/>
+    <w:basedOn w:val="725"/>
+    <w:next w:val="725"/>
     <w:link w:val="156"/>
     <w:uiPriority w:val="9"/>
     <w:unhideWhenUsed/>
@@ -32731,8 +32396,8 @@
   </w:style>
   <w:style w:type="paragraph" w:styleId="146">
     <w:name w:val="Heading 8"/>
-    <w:basedOn w:val="727"/>
-    <w:next w:val="727"/>
+    <w:basedOn w:val="725"/>
+    <w:next w:val="725"/>
     <w:link w:val="157"/>
     <w:uiPriority w:val="9"/>
     <w:unhideWhenUsed/>
@@ -32754,8 +32419,8 @@
   </w:style>
   <w:style w:type="paragraph" w:styleId="147">
     <w:name w:val="Heading 9"/>
-    <w:basedOn w:val="727"/>
-    <w:next w:val="727"/>
+    <w:basedOn w:val="725"/>
+    <w:next w:val="725"/>
     <w:link w:val="158"/>
     <w:uiPriority w:val="9"/>
     <w:unhideWhenUsed/>
@@ -32777,8 +32442,8 @@
   </w:style>
   <w:style w:type="character" w:styleId="150">
     <w:name w:val="Heading 1 Char"/>
-    <w:basedOn w:val="734"/>
-    <w:link w:val="728"/>
+    <w:basedOn w:val="732"/>
+    <w:link w:val="726"/>
     <w:uiPriority w:val="9"/>
     <w:pPr>
       <w:pBdr/>
@@ -32794,8 +32459,8 @@
   </w:style>
   <w:style w:type="character" w:styleId="151">
     <w:name w:val="Heading 2 Char"/>
-    <w:basedOn w:val="734"/>
-    <w:link w:val="729"/>
+    <w:basedOn w:val="732"/>
+    <w:link w:val="727"/>
     <w:uiPriority w:val="9"/>
     <w:pPr>
       <w:pBdr/>
@@ -32811,8 +32476,8 @@
   </w:style>
   <w:style w:type="character" w:styleId="152">
     <w:name w:val="Heading 3 Char"/>
-    <w:basedOn w:val="734"/>
-    <w:link w:val="730"/>
+    <w:basedOn w:val="732"/>
+    <w:link w:val="728"/>
     <w:uiPriority w:val="9"/>
     <w:pPr>
       <w:pBdr/>
@@ -32828,8 +32493,8 @@
   </w:style>
   <w:style w:type="character" w:styleId="153">
     <w:name w:val="Heading 4 Char"/>
-    <w:basedOn w:val="734"/>
-    <w:link w:val="731"/>
+    <w:basedOn w:val="732"/>
+    <w:link w:val="729"/>
     <w:uiPriority w:val="9"/>
     <w:pPr>
       <w:pBdr/>
@@ -32845,8 +32510,8 @@
   </w:style>
   <w:style w:type="character" w:styleId="154">
     <w:name w:val="Heading 5 Char"/>
-    <w:basedOn w:val="734"/>
-    <w:link w:val="732"/>
+    <w:basedOn w:val="732"/>
+    <w:link w:val="730"/>
     <w:uiPriority w:val="9"/>
     <w:pPr>
       <w:pBdr/>
@@ -32860,8 +32525,8 @@
   </w:style>
   <w:style w:type="character" w:styleId="155">
     <w:name w:val="Heading 6 Char"/>
-    <w:basedOn w:val="734"/>
-    <w:link w:val="733"/>
+    <w:basedOn w:val="732"/>
+    <w:link w:val="731"/>
     <w:uiPriority w:val="9"/>
     <w:pPr>
       <w:pBdr/>
@@ -32877,7 +32542,7 @@
   </w:style>
   <w:style w:type="character" w:styleId="156">
     <w:name w:val="Heading 7 Char"/>
-    <w:basedOn w:val="734"/>
+    <w:basedOn w:val="732"/>
     <w:link w:val="145"/>
     <w:uiPriority w:val="9"/>
     <w:pPr>
@@ -32892,7 +32557,7 @@
   </w:style>
   <w:style w:type="character" w:styleId="157">
     <w:name w:val="Heading 8 Char"/>
-    <w:basedOn w:val="734"/>
+    <w:basedOn w:val="732"/>
     <w:link w:val="146"/>
     <w:uiPriority w:val="9"/>
     <w:pPr>
@@ -32909,7 +32574,7 @@
   </w:style>
   <w:style w:type="character" w:styleId="158">
     <w:name w:val="Heading 9 Char"/>
-    <w:basedOn w:val="734"/>
+    <w:basedOn w:val="732"/>
     <w:link w:val="147"/>
     <w:uiPriority w:val="9"/>
     <w:pPr>
@@ -32926,8 +32591,8 @@
   </w:style>
   <w:style w:type="character" w:styleId="160">
     <w:name w:val="Title Char"/>
-    <w:basedOn w:val="734"/>
-    <w:link w:val="737"/>
+    <w:basedOn w:val="732"/>
+    <w:link w:val="735"/>
     <w:uiPriority w:val="10"/>
     <w:pPr>
       <w:pBdr/>
@@ -32943,8 +32608,8 @@
   </w:style>
   <w:style w:type="paragraph" w:styleId="163">
     <w:name w:val="Quote"/>
-    <w:basedOn w:val="727"/>
-    <w:next w:val="727"/>
+    <w:basedOn w:val="725"/>
+    <w:next w:val="725"/>
     <w:link w:val="164"/>
     <w:uiPriority w:val="29"/>
     <w:qFormat/>
@@ -32962,7 +32627,7 @@
   </w:style>
   <w:style w:type="character" w:styleId="164">
     <w:name w:val="Quote Char"/>
-    <w:basedOn w:val="734"/>
+    <w:basedOn w:val="732"/>
     <w:link w:val="163"/>
     <w:uiPriority w:val="29"/>
     <w:pPr>
@@ -32978,7 +32643,7 @@
   </w:style>
   <w:style w:type="character" w:styleId="166">
     <w:name w:val="Intense Emphasis"/>
-    <w:basedOn w:val="734"/>
+    <w:basedOn w:val="732"/>
     <w:uiPriority w:val="21"/>
     <w:qFormat/>
     <w:pPr>
@@ -32994,7 +32659,7 @@
   </w:style>
   <w:style w:type="character" w:styleId="169">
     <w:name w:val="Intense Reference"/>
-    <w:basedOn w:val="734"/>
+    <w:basedOn w:val="732"/>
     <w:uiPriority w:val="32"/>
     <w:qFormat/>
     <w:pPr>
@@ -33012,7 +32677,7 @@
   </w:style>
   <w:style w:type="paragraph" w:styleId="170">
     <w:name w:val="No Spacing"/>
-    <w:basedOn w:val="727"/>
+    <w:basedOn w:val="725"/>
     <w:uiPriority w:val="1"/>
     <w:qFormat/>
     <w:pPr>
@@ -33023,7 +32688,7 @@
   </w:style>
   <w:style w:type="character" w:styleId="171">
     <w:name w:val="Subtle Emphasis"/>
-    <w:basedOn w:val="734"/>
+    <w:basedOn w:val="732"/>
     <w:uiPriority w:val="19"/>
     <w:qFormat/>
     <w:pPr>
@@ -33039,7 +32704,7 @@
   </w:style>
   <w:style w:type="character" w:styleId="172">
     <w:name w:val="Emphasis"/>
-    <w:basedOn w:val="734"/>
+    <w:basedOn w:val="732"/>
     <w:uiPriority w:val="20"/>
     <w:qFormat/>
     <w:pPr>
@@ -33054,7 +32719,7 @@
   </w:style>
   <w:style w:type="character" w:styleId="173">
     <w:name w:val="Strong"/>
-    <w:basedOn w:val="734"/>
+    <w:basedOn w:val="732"/>
     <w:uiPriority w:val="22"/>
     <w:qFormat/>
     <w:pPr>
@@ -33069,7 +32734,7 @@
   </w:style>
   <w:style w:type="character" w:styleId="174">
     <w:name w:val="Subtle Reference"/>
-    <w:basedOn w:val="734"/>
+    <w:basedOn w:val="732"/>
     <w:uiPriority w:val="31"/>
     <w:qFormat/>
     <w:pPr>
@@ -33084,7 +32749,7 @@
   </w:style>
   <w:style w:type="character" w:styleId="175">
     <w:name w:val="Book Title"/>
-    <w:basedOn w:val="734"/>
+    <w:basedOn w:val="732"/>
     <w:uiPriority w:val="33"/>
     <w:qFormat/>
     <w:pPr>
@@ -33102,7 +32767,7 @@
   </w:style>
   <w:style w:type="paragraph" w:styleId="184">
     <w:name w:val="endnote text"/>
-    <w:basedOn w:val="727"/>
+    <w:basedOn w:val="725"/>
     <w:link w:val="185"/>
     <w:uiPriority w:val="99"/>
     <w:semiHidden/>
@@ -33119,7 +32784,7 @@
   </w:style>
   <w:style w:type="character" w:styleId="185">
     <w:name w:val="Endnote Text Char"/>
-    <w:basedOn w:val="734"/>
+    <w:basedOn w:val="732"/>
     <w:link w:val="184"/>
     <w:uiPriority w:val="99"/>
     <w:semiHidden/>
@@ -33135,7 +32800,7 @@
   </w:style>
   <w:style w:type="character" w:styleId="186">
     <w:name w:val="endnote reference"/>
-    <w:basedOn w:val="734"/>
+    <w:basedOn w:val="732"/>
     <w:uiPriority w:val="99"/>
     <w:semiHidden/>
     <w:unhideWhenUsed/>
@@ -33150,7 +32815,7 @@
   </w:style>
   <w:style w:type="character" w:styleId="188">
     <w:name w:val="FollowedHyperlink"/>
-    <w:basedOn w:val="734"/>
+    <w:basedOn w:val="732"/>
     <w:uiPriority w:val="99"/>
     <w:semiHidden/>
     <w:unhideWhenUsed/>
@@ -33166,8 +32831,8 @@
   </w:style>
   <w:style w:type="paragraph" w:styleId="189">
     <w:name w:val="toc 1"/>
-    <w:basedOn w:val="727"/>
-    <w:next w:val="727"/>
+    <w:basedOn w:val="725"/>
+    <w:next w:val="725"/>
     <w:uiPriority w:val="39"/>
     <w:unhideWhenUsed/>
     <w:pPr>
@@ -33178,8 +32843,8 @@
   </w:style>
   <w:style w:type="paragraph" w:styleId="190">
     <w:name w:val="toc 2"/>
-    <w:basedOn w:val="727"/>
-    <w:next w:val="727"/>
+    <w:basedOn w:val="725"/>
+    <w:next w:val="725"/>
     <w:uiPriority w:val="39"/>
     <w:unhideWhenUsed/>
     <w:pPr>
@@ -33190,8 +32855,8 @@
   </w:style>
   <w:style w:type="paragraph" w:styleId="191">
     <w:name w:val="toc 3"/>
-    <w:basedOn w:val="727"/>
-    <w:next w:val="727"/>
+    <w:basedOn w:val="725"/>
+    <w:next w:val="725"/>
     <w:uiPriority w:val="39"/>
     <w:unhideWhenUsed/>
     <w:pPr>
@@ -33202,8 +32867,8 @@
   </w:style>
   <w:style w:type="paragraph" w:styleId="192">
     <w:name w:val="toc 4"/>
-    <w:basedOn w:val="727"/>
-    <w:next w:val="727"/>
+    <w:basedOn w:val="725"/>
+    <w:next w:val="725"/>
     <w:uiPriority w:val="39"/>
     <w:unhideWhenUsed/>
     <w:pPr>
@@ -33214,8 +32879,8 @@
   </w:style>
   <w:style w:type="paragraph" w:styleId="193">
     <w:name w:val="toc 5"/>
-    <w:basedOn w:val="727"/>
-    <w:next w:val="727"/>
+    <w:basedOn w:val="725"/>
+    <w:next w:val="725"/>
     <w:uiPriority w:val="39"/>
     <w:unhideWhenUsed/>
     <w:pPr>
@@ -33226,8 +32891,8 @@
   </w:style>
   <w:style w:type="paragraph" w:styleId="194">
     <w:name w:val="toc 6"/>
-    <w:basedOn w:val="727"/>
-    <w:next w:val="727"/>
+    <w:basedOn w:val="725"/>
+    <w:next w:val="725"/>
     <w:uiPriority w:val="39"/>
     <w:unhideWhenUsed/>
     <w:pPr>
@@ -33238,8 +32903,8 @@
   </w:style>
   <w:style w:type="paragraph" w:styleId="195">
     <w:name w:val="toc 7"/>
-    <w:basedOn w:val="727"/>
-    <w:next w:val="727"/>
+    <w:basedOn w:val="725"/>
+    <w:next w:val="725"/>
     <w:uiPriority w:val="39"/>
     <w:unhideWhenUsed/>
     <w:pPr>
@@ -33250,8 +32915,8 @@
   </w:style>
   <w:style w:type="paragraph" w:styleId="196">
     <w:name w:val="toc 8"/>
-    <w:basedOn w:val="727"/>
-    <w:next w:val="727"/>
+    <w:basedOn w:val="725"/>
+    <w:next w:val="725"/>
     <w:uiPriority w:val="39"/>
     <w:unhideWhenUsed/>
     <w:pPr>
@@ -33262,8 +32927,8 @@
   </w:style>
   <w:style w:type="paragraph" w:styleId="197">
     <w:name w:val="toc 9"/>
-    <w:basedOn w:val="727"/>
-    <w:next w:val="727"/>
+    <w:basedOn w:val="725"/>
+    <w:next w:val="725"/>
     <w:uiPriority w:val="39"/>
     <w:unhideWhenUsed/>
     <w:pPr>
@@ -33274,7 +32939,7 @@
   </w:style>
   <w:style w:type="character" w:styleId="198">
     <w:name w:val="Placeholder Text"/>
-    <w:basedOn w:val="734"/>
+    <w:basedOn w:val="732"/>
     <w:uiPriority w:val="99"/>
     <w:semiHidden/>
     <w:pPr>
@@ -33298,8 +32963,8 @@
   </w:style>
   <w:style w:type="paragraph" w:styleId="209">
     <w:name w:val="table of figures"/>
-    <w:basedOn w:val="727"/>
-    <w:next w:val="727"/>
+    <w:basedOn w:val="725"/>
+    <w:next w:val="725"/>
     <w:uiPriority w:val="99"/>
     <w:unhideWhenUsed/>
     <w:pPr>
@@ -33308,7 +32973,7 @@
       <w:ind/>
     </w:pPr>
   </w:style>
-  <w:style w:type="paragraph" w:styleId="727" w:default="1">
+  <w:style w:type="paragraph" w:styleId="725" w:default="1">
     <w:name w:val="Normal"/>
     <w:qFormat/>
     <w:pPr>
@@ -33318,7 +32983,7 @@
       <w:jc w:val="both"/>
     </w:pPr>
   </w:style>
-  <w:style w:type="paragraph" w:styleId="728">
+  <w:style w:type="paragraph" w:styleId="726">
     <w:name w:val="Heading 1"/>
     <w:uiPriority w:val="9"/>
     <w:qFormat/>
@@ -33335,7 +33000,7 @@
       <w:szCs w:val="32"/>
     </w:rPr>
   </w:style>
-  <w:style w:type="paragraph" w:styleId="729">
+  <w:style w:type="paragraph" w:styleId="727">
     <w:name w:val="Heading 2"/>
     <w:uiPriority w:val="9"/>
     <w:unhideWhenUsed/>
@@ -33353,7 +33018,7 @@
       <w:szCs w:val="26"/>
     </w:rPr>
   </w:style>
-  <w:style w:type="paragraph" w:styleId="730">
+  <w:style w:type="paragraph" w:styleId="728">
     <w:name w:val="Heading 3"/>
     <w:uiPriority w:val="9"/>
     <w:unhideWhenUsed/>
@@ -33371,7 +33036,7 @@
       <w:szCs w:val="24"/>
     </w:rPr>
   </w:style>
-  <w:style w:type="paragraph" w:styleId="731">
+  <w:style w:type="paragraph" w:styleId="729">
     <w:name w:val="Heading 4"/>
     <w:uiPriority w:val="9"/>
     <w:semiHidden/>
@@ -33389,7 +33054,7 @@
       <w:color w:val="2e74b5"/>
     </w:rPr>
   </w:style>
-  <w:style w:type="paragraph" w:styleId="732">
+  <w:style w:type="paragraph" w:styleId="730">
     <w:name w:val="Heading 5"/>
     <w:uiPriority w:val="9"/>
     <w:semiHidden/>
@@ -33405,7 +33070,7 @@
       <w:color w:val="2e74b5"/>
     </w:rPr>
   </w:style>
-  <w:style w:type="paragraph" w:styleId="733">
+  <w:style w:type="paragraph" w:styleId="731">
     <w:name w:val="Heading 6"/>
     <w:uiPriority w:val="9"/>
     <w:semiHidden/>
@@ -33421,7 +33086,7 @@
       <w:color w:val="1f4d78"/>
     </w:rPr>
   </w:style>
-  <w:style w:type="character" w:styleId="734" w:default="1">
+  <w:style w:type="character" w:styleId="732" w:default="1">
     <w:name w:val="Default Paragraph Font"/>
     <w:uiPriority w:val="1"/>
     <w:semiHidden/>
@@ -33432,7 +33097,7 @@
       <w:ind/>
     </w:pPr>
   </w:style>
-  <w:style w:type="table" w:styleId="735" w:default="1">
+  <w:style w:type="table" w:styleId="733" w:default="1">
     <w:name w:val="Normal Table"/>
     <w:uiPriority w:val="99"/>
     <w:semiHidden/>
@@ -33625,7 +33290,7 @@
       </w:tcPr>
     </w:tblStylePr>
   </w:style>
-  <w:style w:type="numbering" w:styleId="736" w:default="1">
+  <w:style w:type="numbering" w:styleId="734" w:default="1">
     <w:name w:val="No List"/>
     <w:uiPriority w:val="99"/>
     <w:semiHidden/>
@@ -33636,7 +33301,7 @@
       <w:ind/>
     </w:pPr>
   </w:style>
-  <w:style w:type="paragraph" w:styleId="737">
+  <w:style w:type="paragraph" w:styleId="735">
     <w:name w:val="Title"/>
     <w:uiPriority w:val="10"/>
     <w:qFormat/>
@@ -33650,7 +33315,7 @@
       <w:szCs w:val="56"/>
     </w:rPr>
   </w:style>
-  <w:style w:type="paragraph" w:styleId="738" w:customStyle="1">
+  <w:style w:type="paragraph" w:styleId="736" w:customStyle="1">
     <w:name w:val="Strong1"/>
     <w:qFormat/>
     <w:pPr>
@@ -33663,7 +33328,7 @@
       <w:bCs/>
     </w:rPr>
   </w:style>
-  <w:style w:type="paragraph" w:styleId="739">
+  <w:style w:type="paragraph" w:styleId="737">
     <w:name w:val="List Paragraph"/>
     <w:qFormat/>
     <w:pPr>
@@ -33672,7 +33337,7 @@
       <w:ind/>
     </w:pPr>
   </w:style>
-  <w:style w:type="character" w:styleId="740">
+  <w:style w:type="character" w:styleId="738">
     <w:name w:val="Hyperlink"/>
     <w:uiPriority w:val="99"/>
     <w:unhideWhenUsed/>
@@ -33686,7 +33351,7 @@
       <w:u w:val="single"/>
     </w:rPr>
   </w:style>
-  <w:style w:type="character" w:styleId="741">
+  <w:style w:type="character" w:styleId="739">
     <w:name w:val="footnote reference"/>
     <w:uiPriority w:val="99"/>
     <w:semiHidden/>
@@ -33700,9 +33365,9 @@
       <w:vertAlign w:val="superscript"/>
     </w:rPr>
   </w:style>
-  <w:style w:type="paragraph" w:styleId="742">
+  <w:style w:type="paragraph" w:styleId="740">
     <w:name w:val="footnote text"/>
-    <w:link w:val="743"/>
+    <w:link w:val="741"/>
     <w:uiPriority w:val="99"/>
     <w:semiHidden/>
     <w:unhideWhenUsed/>
@@ -33712,9 +33377,9 @@
       <w:ind/>
     </w:pPr>
   </w:style>
-  <w:style w:type="character" w:styleId="743" w:customStyle="1">
+  <w:style w:type="character" w:styleId="741" w:customStyle="1">
     <w:name w:val="Footnote Text Char"/>
-    <w:link w:val="742"/>
+    <w:link w:val="740"/>
     <w:uiPriority w:val="99"/>
     <w:semiHidden/>
     <w:unhideWhenUsed/>
@@ -33728,9 +33393,36 @@
       <w:szCs w:val="20"/>
     </w:rPr>
   </w:style>
+  <w:style w:type="paragraph" w:styleId="742">
+    <w:name w:val="Header"/>
+    <w:basedOn w:val="725"/>
+    <w:link w:val="743"/>
+    <w:uiPriority w:val="99"/>
+    <w:unhideWhenUsed/>
+    <w:pPr>
+      <w:pBdr/>
+      <w:tabs>
+        <w:tab w:val="center" w:leader="none" w:pos="4680"/>
+        <w:tab w:val="right" w:leader="none" w:pos="9360"/>
+      </w:tabs>
+      <w:spacing/>
+      <w:ind/>
+    </w:pPr>
+  </w:style>
+  <w:style w:type="character" w:styleId="743" w:customStyle="1">
+    <w:name w:val="Header Char"/>
+    <w:basedOn w:val="732"/>
+    <w:link w:val="742"/>
+    <w:uiPriority w:val="99"/>
+    <w:pPr>
+      <w:pBdr/>
+      <w:spacing/>
+      <w:ind/>
+    </w:pPr>
+  </w:style>
   <w:style w:type="paragraph" w:styleId="744">
-    <w:name w:val="Header"/>
-    <w:basedOn w:val="727"/>
+    <w:name w:val="Footer"/>
+    <w:basedOn w:val="725"/>
     <w:link w:val="745"/>
     <w:uiPriority w:val="99"/>
     <w:unhideWhenUsed/>
@@ -33745,8 +33437,8 @@
     </w:pPr>
   </w:style>
   <w:style w:type="character" w:styleId="745" w:customStyle="1">
-    <w:name w:val="Header Char"/>
-    <w:basedOn w:val="734"/>
+    <w:name w:val="Footer Char"/>
+    <w:basedOn w:val="732"/>
     <w:link w:val="744"/>
     <w:uiPriority w:val="99"/>
     <w:pPr>
@@ -33756,37 +33448,10 @@
     </w:pPr>
   </w:style>
   <w:style w:type="paragraph" w:styleId="746">
-    <w:name w:val="Footer"/>
-    <w:basedOn w:val="727"/>
+    <w:name w:val="Subtitle"/>
+    <w:basedOn w:val="725"/>
+    <w:next w:val="725"/>
     <w:link w:val="747"/>
-    <w:uiPriority w:val="99"/>
-    <w:unhideWhenUsed/>
-    <w:pPr>
-      <w:pBdr/>
-      <w:tabs>
-        <w:tab w:val="center" w:leader="none" w:pos="4680"/>
-        <w:tab w:val="right" w:leader="none" w:pos="9360"/>
-      </w:tabs>
-      <w:spacing/>
-      <w:ind/>
-    </w:pPr>
-  </w:style>
-  <w:style w:type="character" w:styleId="747" w:customStyle="1">
-    <w:name w:val="Footer Char"/>
-    <w:basedOn w:val="734"/>
-    <w:link w:val="746"/>
-    <w:uiPriority w:val="99"/>
-    <w:pPr>
-      <w:pBdr/>
-      <w:spacing/>
-      <w:ind/>
-    </w:pPr>
-  </w:style>
-  <w:style w:type="paragraph" w:styleId="748">
-    <w:name w:val="Subtitle"/>
-    <w:basedOn w:val="727"/>
-    <w:next w:val="727"/>
-    <w:link w:val="749"/>
     <w:uiPriority w:val="11"/>
     <w:qFormat/>
     <w:pPr>
@@ -33805,10 +33470,10 @@
       <w:szCs w:val="22"/>
     </w:rPr>
   </w:style>
-  <w:style w:type="character" w:styleId="749" w:customStyle="1">
+  <w:style w:type="character" w:styleId="747" w:customStyle="1">
     <w:name w:val="Subtitle Char"/>
-    <w:basedOn w:val="734"/>
-    <w:link w:val="748"/>
+    <w:basedOn w:val="732"/>
+    <w:link w:val="746"/>
     <w:uiPriority w:val="11"/>
     <w:pPr>
       <w:pBdr/>
@@ -33822,11 +33487,11 @@
       <w:szCs w:val="22"/>
     </w:rPr>
   </w:style>
-  <w:style w:type="paragraph" w:styleId="750">
+  <w:style w:type="paragraph" w:styleId="748">
     <w:name w:val="Intense Quote"/>
-    <w:basedOn w:val="727"/>
-    <w:next w:val="727"/>
-    <w:link w:val="751"/>
+    <w:basedOn w:val="725"/>
+    <w:next w:val="725"/>
+    <w:link w:val="749"/>
     <w:uiPriority w:val="30"/>
     <w:qFormat/>
     <w:pPr>
@@ -33844,10 +33509,10 @@
       <w:color w:val="4472c4" w:themeColor="accent1"/>
     </w:rPr>
   </w:style>
-  <w:style w:type="character" w:styleId="751" w:customStyle="1">
+  <w:style w:type="character" w:styleId="749" w:customStyle="1">
     <w:name w:val="Intense Quote Char"/>
-    <w:basedOn w:val="734"/>
-    <w:link w:val="750"/>
+    <w:basedOn w:val="732"/>
+    <w:link w:val="748"/>
     <w:uiPriority w:val="30"/>
     <w:pPr>
       <w:pBdr/>
@@ -33860,10 +33525,10 @@
       <w:color w:val="4472c4" w:themeColor="accent1"/>
     </w:rPr>
   </w:style>
-  <w:style w:type="paragraph" w:styleId="752">
+  <w:style w:type="paragraph" w:styleId="750">
     <w:name w:val="Caption"/>
-    <w:basedOn w:val="727"/>
-    <w:next w:val="727"/>
+    <w:basedOn w:val="725"/>
+    <w:next w:val="725"/>
     <w:uiPriority w:val="35"/>
     <w:unhideWhenUsed/>
     <w:qFormat/>

</xml_diff>

<commit_message>
edit from josh changes
</commit_message>
<xml_diff>
--- a/exports/biomass.docx
+++ b/exports/biomass.docx
@@ -4,26 +4,24 @@
   <w:body>
     <w:p>
       <w:pPr>
-        <w:pStyle w:val="736"/>
+        <w:pStyle w:val="724"/>
         <w:pBdr/>
         <w:spacing/>
         <w:ind/>
         <w:rPr/>
       </w:pPr>
       <w:r>
-        <w:t xml:space="preserve">Forest Biomass Solutions</w:t>
+        <w:t xml:space="preserve">Takeaways</w:t>
       </w:r>
       <w:r/>
     </w:p>
     <w:p>
       <w:pPr>
-        <w:pStyle w:val="739"/>
-        <w:pBdr/>
-        <w:spacing/>
-        <w:ind/>
-        <w:rPr>
-          <w:highlight w:val="none"/>
-        </w:rPr>
+        <w:pStyle w:val="727"/>
+        <w:pBdr/>
+        <w:spacing/>
+        <w:ind/>
+        <w:rPr/>
       </w:pPr>
       <w:r>
         <w:t xml:space="preserve">Vance Russell, Joshua Harrison</w:t>
@@ -32,44 +30,7 @@
     </w:p>
     <w:p>
       <w:pPr>
-        <w:pStyle w:val="739"/>
-        <w:pBdr/>
-        <w:spacing/>
-        <w:ind/>
-        <w:rPr/>
-      </w:pPr>
-      <w:r>
-        <w:rPr>
-          <w:highlight w:val="none"/>
-        </w:rPr>
-      </w:r>
-      <w:r>
-        <w:rPr>
-          <w:highlight w:val="none"/>
-        </w:rPr>
-      </w:r>
-      <w:r>
-        <w:rPr>
-          <w:highlight w:val="none"/>
-        </w:rPr>
-      </w:r>
-    </w:p>
-    <w:p>
-      <w:pPr>
-        <w:pStyle w:val="737"/>
-        <w:pBdr/>
-        <w:spacing/>
-        <w:ind/>
-        <w:rPr/>
-      </w:pPr>
-      <w:r>
-        <w:t xml:space="preserve">Takeaways</w:t>
-      </w:r>
-      <w:r/>
-    </w:p>
-    <w:p>
-      <w:pPr>
-        <w:pStyle w:val="747"/>
+        <w:pStyle w:val="735"/>
         <w:numPr>
           <w:ilvl w:val="0"/>
           <w:numId w:val="2"/>
@@ -80,7 +41,17 @@
         <w:rPr/>
       </w:pPr>
       <w:r>
-        <w:t xml:space="preserve">The issue at hand is whether active forest man</w:t>
+        <w:t xml:space="preserve">The </w:t>
+      </w:r>
+      <w:r>
+        <w:rPr>
+          <w:b/>
+          <w:bCs/>
+        </w:rPr>
+        <w:t xml:space="preserve">central issue</w:t>
+      </w:r>
+      <w:r>
+        <w:t xml:space="preserve"> is whether active forest man</w:t>
       </w:r>
       <w:r>
         <w:t xml:space="preserve">agement is ecologically legitimate under novel climate conditions. We believe that ecological forest management following the guidelines outlined in GTR-220, coupled with prescribed fire maintenance, will create more resilient forests and reduce fire risk </w:t>
@@ -111,7 +82,7 @@
     </w:p>
     <w:p>
       <w:pPr>
-        <w:pStyle w:val="747"/>
+        <w:pStyle w:val="735"/>
         <w:numPr>
           <w:ilvl w:val="0"/>
           <w:numId w:val="2"/>
@@ -122,16 +93,23 @@
         <w:rPr/>
       </w:pPr>
       <w:r>
-        <w:t xml:space="preserve">Biomass utilization is a downstream process of fo</w:t>
-      </w:r>
-      <w:r>
-        <w:t xml:space="preserve">rest health treatments. It is not a driver of logging. In mitigating wildfire, we need to make the distinction between 1. sawtimber, 2. unavoidable treatment residues, and 3. excess forest biomass streams that exist whether or not there’s an energy market.</w:t>
+        <w:t xml:space="preserve">Biomass utilization is </w:t>
+      </w:r>
+      <w:r>
+        <w:rPr>
+          <w:b/>
+          <w:bCs/>
+        </w:rPr>
+        <w:t xml:space="preserve">integrate process</w:t>
+      </w:r>
+      <w:r>
+        <w:t xml:space="preserve"> of forest health treatments.</w:t>
       </w:r>
       <w:r/>
     </w:p>
     <w:p>
       <w:pPr>
-        <w:pStyle w:val="747"/>
+        <w:pStyle w:val="735"/>
         <w:numPr>
           <w:ilvl w:val="0"/>
           <w:numId w:val="2"/>
@@ -142,16 +120,23 @@
         <w:rPr/>
       </w:pPr>
       <w:r>
-        <w:t xml:space="preserve">Continu</w:t>
-      </w:r>
-      <w:r>
-        <w:t xml:space="preserve">ed business as usual will mean that California’s forests continue being a net emitter of carbon. Biomass utilization is not free of greenhouse gas emissions; however, it is part of a solution to greatly reduce massive emissions from uncontrolled wildfires.</w:t>
+        <w:t xml:space="preserve">Continued business as usual will mean that California’s forests continue being a </w:t>
+      </w:r>
+      <w:r>
+        <w:rPr>
+          <w:b/>
+          <w:bCs/>
+        </w:rPr>
+        <w:t xml:space="preserve">net emitter of carbon</w:t>
+      </w:r>
+      <w:r>
+        <w:t xml:space="preserve">. Biomass utilization is not free of greenhouse gas emissions; however, it is part of a solution to greatly reduce massive emissions from uncontrolled wildfires.</w:t>
       </w:r>
       <w:r/>
     </w:p>
     <w:p>
       <w:pPr>
-        <w:pStyle w:val="747"/>
+        <w:pStyle w:val="735"/>
         <w:numPr>
           <w:ilvl w:val="0"/>
           <w:numId w:val="2"/>
@@ -162,13 +147,23 @@
         <w:rPr/>
       </w:pPr>
       <w:r>
-        <w:t xml:space="preserve">Economics</w:t>
+        <w:t xml:space="preserve">The </w:t>
+      </w:r>
+      <w:r>
+        <w:rPr>
+          <w:b/>
+          <w:bCs/>
+        </w:rPr>
+        <w:t xml:space="preserve">economics of biomass utilization</w:t>
+      </w:r>
+      <w:r>
+        <w:t xml:space="preserve"> are not about subsidizing energy production. They are about reducing catastrophic losses, stabilizing long-term risk, and capturing value from material streams that already exist as a consequence of forest restoration.</w:t>
       </w:r>
       <w:r/>
     </w:p>
     <w:p>
       <w:pPr>
-        <w:pStyle w:val="747"/>
+        <w:pStyle w:val="735"/>
         <w:numPr>
           <w:ilvl w:val="0"/>
           <w:numId w:val="2"/>
@@ -179,9 +174,38 @@
         <w:rPr/>
       </w:pPr>
       <w:r>
-        <w:t xml:space="preserve">Policies that focus on reducing emissions from biomass while integrating forest health solutions with climate change are critical to the long-term biodiversity and human health throughout California and the West.</w:t>
+        <w:t xml:space="preserve">Policies that </w:t>
+      </w:r>
+      <w:r>
+        <w:rPr>
+          <w:b/>
+          <w:bCs/>
+        </w:rPr>
+        <w:t xml:space="preserve">focus on reducing emissions</w:t>
+      </w:r>
+      <w:r>
+        <w:t xml:space="preserve"> from biomass while i</w:t>
+      </w:r>
+      <w:r>
+        <w:rPr>
+          <w:b/>
+          <w:bCs/>
+        </w:rPr>
+        <w:t xml:space="preserve">ntegrating forest health solutions</w:t>
+      </w:r>
+      <w:r>
+        <w:t xml:space="preserve"> with climate change are critical to the long-term biodiversity and human health throughout California and the West.</w:t>
       </w:r>
       <w:r/>
+    </w:p>
+    <w:p>
+      <w:pPr>
+        <w:pStyle w:val="725"/>
+        <w:pBdr/>
+        <w:spacing/>
+        <w:ind/>
+        <w:rPr/>
+      </w:pPr>
       <w:r>
         <w:rPr>
           <w:highlight w:val="none"/>
@@ -197,49 +221,24 @@
           <w:highlight w:val="none"/>
         </w:rPr>
       </w:r>
+    </w:p>
+    <w:p>
+      <w:pPr>
+        <w:pStyle w:val="725"/>
+        <w:pBdr/>
+        <w:spacing/>
+        <w:ind/>
+        <w:rPr>
+          <w:highlight w:val="none"/>
+        </w:rPr>
+      </w:pPr>
+      <w:r>
+        <w:t xml:space="preserve">Background</w:t>
+      </w:r>
       <w:r/>
     </w:p>
     <w:p>
       <w:pPr>
-        <w:pStyle w:val="737"/>
-        <w:pBdr/>
-        <w:spacing/>
-        <w:ind/>
-        <w:rPr/>
-      </w:pPr>
-      <w:r>
-        <w:rPr>
-          <w:highlight w:val="none"/>
-        </w:rPr>
-      </w:r>
-      <w:r>
-        <w:rPr>
-          <w:highlight w:val="none"/>
-        </w:rPr>
-      </w:r>
-      <w:r>
-        <w:rPr>
-          <w:highlight w:val="none"/>
-        </w:rPr>
-      </w:r>
-    </w:p>
-    <w:p>
-      <w:pPr>
-        <w:pStyle w:val="737"/>
-        <w:pBdr/>
-        <w:spacing/>
-        <w:ind/>
-        <w:rPr>
-          <w:highlight w:val="none"/>
-        </w:rPr>
-      </w:pPr>
-      <w:r>
-        <w:t xml:space="preserve">Background</w:t>
-      </w:r>
-      <w:r/>
-    </w:p>
-    <w:p>
-      <w:pPr>
         <w:pBdr/>
         <w:spacing/>
         <w:ind/>
@@ -251,19 +250,19 @@
       <w:hyperlink r:id="rId10" w:tooltip="https://calmatters.org/commentary/2025/12/biomass-california-energy-wildfire-problems/" w:history="1">
         <w:r>
           <w:rPr>
-            <w:rStyle w:val="748"/>
+            <w:rStyle w:val="736"/>
           </w:rPr>
           <w:t xml:space="preserve">commentary</w:t>
         </w:r>
       </w:hyperlink>
       <w:r>
-        <w:t xml:space="preserve"> claiming biomass is a money pit that won’t solve California’s energy or wildfir</w:t>
-      </w:r>
-      <w:r>
-        <w:t xml:space="preserve">e problems. The piece cited research from authors whose work has been discredited or debunked by a majority of climate and forest scientists. It also made several claims that were neither cited nor accurate. Shortly afterward, Matt Dias of the California F</w:t>
-      </w:r>
-      <w:r>
-        <w:t xml:space="preserve">orestry Association responded, arguing that biomass utilization isn’t primarily about renewable energy production—rather, the real issue is confronting the wildfire crisis. We now have a perspective from an environmental group and a response from industry.</w:t>
+        <w:t xml:space="preserve"> claiming that</w:t>
+      </w:r>
+      <w:r>
+        <w:t xml:space="preserve"> biomass is a money pit that will not solve California’s energy or wildfire problems. The piece cited research by authors whose work has been widely challenged by climate and forest scientists, and it made several claims that were either unsupported or ina</w:t>
+      </w:r>
+      <w:r>
+        <w:t xml:space="preserve">ccurate. Shortly afterward, Matt Dias of the California Forestry Association responded, arguing that biomass utilization is not primarily about renewable energy production, but about confronting the wildfire crisis created by a century of fire suppression.</w:t>
       </w:r>
       <w:r/>
     </w:p>
@@ -275,29 +274,31 @@
         <w:rPr/>
       </w:pPr>
       <w:r>
-        <w:t xml:space="preserve">This article examines the need for forest health treatments that produce biomass and debunks common myths around its utilization. We then proceed to broader wildfire disinformation</w:t>
-      </w:r>
-      <w:r>
-        <w:rPr>
-          <w:rStyle w:val="749"/>
-        </w:rPr>
-        <w:footnoteReference w:id="2"/>
-      </w:r>
-      <w:r>
-        <w:t xml:space="preserve">, discuss impacts of forest health on biodiversity, and provide broad solutions.</w:t>
+        <w:t xml:space="preserve">We believe the debate cannot be understood through a narrow energy lens alone. A durable response to California’s forest and fire crises requires restoring forest conditions that can function under current and future climate</w:t>
+      </w:r>
+      <w:r>
+        <w:t xml:space="preserve"> realities. That includes re-establishing fire regimes that, as Kat Anderson has described, “tend the wild,” combining active intervention with restraint. In the short and medium term, this will require ecologically informed removal of excess trees and und</w:t>
+      </w:r>
+      <w:r>
+        <w:t xml:space="preserve">erbrush, along with responsible management of the byproducts generated by those treatments. The goal is not extraction, but restoring balance and ecological function through cultural burning, intentional fire, and selective, place-based forestry practices.</w:t>
       </w:r>
       <w:r/>
     </w:p>
     <w:p>
       <w:pPr>
-        <w:pStyle w:val="737"/>
         <w:pBdr/>
         <w:spacing/>
         <w:ind/>
         <w:rPr/>
       </w:pPr>
       <w:r>
-        <w:t xml:space="preserve">Biomass</w:t>
+        <w:t xml:space="preserve">All living species interact with their environments in order to survive; humans are no different. People have actively engaged with California’s forests using fire since these ecosystems emerged at the end of the </w:t>
+      </w:r>
+      <w:r>
+        <w:t xml:space="preserve">last ice age. The question, then, is not whether humans can or should be involved in living systems, but whether that involvement is wise, adaptive, proportional, or destructive. Indigenous stewardship offers an essential reference point here, grounded in </w:t>
+      </w:r>
+      <w:r>
+        <w:t xml:space="preserve">practices that combine active intervention with clear guidance on when, where, and how to apply fire, and when to step back. It is the breakdown of those relationships, not human presence itself, that lies at the root of today’s forest and wildfire crisis.</w:t>
       </w:r>
       <w:r/>
     </w:p>
@@ -309,26 +310,23 @@
         <w:rPr/>
       </w:pPr>
       <w:r>
-        <w:t xml:space="preserve">Many biomass critiques rely on broader wildfire myths, e.g</w:t>
-      </w:r>
-      <w:r>
-        <w:t xml:space="preserve">., “fires are mostly shrubland,” “thinning increases fire severity,” “forests should be left alone”, or “thinning is an excuse for logging”. Disinformation in this realm becomes a mechanism by which forest management and biomass are broadly maligned withou</w:t>
-      </w:r>
-      <w:r>
-        <w:t xml:space="preserve">t nuance. Because of this, we get a singular argument along the lines of misunderstood fire ecology -&gt; misdiagnosed forest conditions -&gt; misframed biomass debate -&gt; bad policy outcomes. This result does nothing to mitigate the wildfire problem in the West.</w:t>
+        <w:t xml:space="preserve">This article examines the need for forest health treatments that prod</w:t>
+      </w:r>
+      <w:r>
+        <w:t xml:space="preserve">uce biomass and addresses common myths surrounding its utilization. It then situates the biomass debate within broader patterns of wildfire disinformation, explores impacts on biodiversity, and outlines integrated solutions for restoring forest resilience.</w:t>
       </w:r>
       <w:r/>
     </w:p>
     <w:p>
       <w:pPr>
-        <w:pStyle w:val="738"/>
+        <w:pStyle w:val="725"/>
         <w:pBdr/>
         <w:spacing/>
         <w:ind/>
         <w:rPr/>
       </w:pPr>
       <w:r>
-        <w:t xml:space="preserve">THE disagreement</w:t>
+        <w:t xml:space="preserve">Biomass</w:t>
       </w:r>
       <w:r/>
     </w:p>
@@ -340,69 +338,115 @@
         <w:rPr/>
       </w:pPr>
       <w:r>
-        <w:t xml:space="preserve">In reality, the debate isn’t really about biomass. It’s about whether active forest management is ecologica</w:t>
-      </w:r>
-      <w:r>
-        <w:t xml:space="preserve">lly legitimate under novel climate conditions. CBD’s position implicitly says restraint and retreat are the answer; yours says intervention, done carefully, is unavoidable. Surfacing that philosophical split would make the argument clearer and more honest.</w:t>
+        <w:t xml:space="preserve">Debates over biomass are often framed narrowly, as disputes over energy technology or emissions accounting. In practice, many critiques of biomass draw on broader misunderstandings about wildfire, forest structure, and the role of </w:t>
+      </w:r>
+      <w:r>
+        <w:t xml:space="preserve">human intervention in fire-adapted landscapes. Claims such as “fires are mostly a shrubland problem,” “thinning increases fire severity,” or “forests should be left alone” shape public perception long before questions of biomass utilization are considered.</w:t>
       </w:r>
       <w:r/>
     </w:p>
     <w:p>
       <w:pPr>
-        <w:pStyle w:val="738"/>
         <w:pBdr/>
         <w:spacing/>
         <w:ind/>
         <w:rPr/>
       </w:pPr>
       <w:r>
-        <w:t xml:space="preserve">Forest residuals</w:t>
+        <w:t xml:space="preserve">When these</w:t>
+      </w:r>
+      <w:r>
+        <w:t xml:space="preserve"> assumptions go unexamined, biomass becomes a proxy target for deeper anxieties about forest management. The result is a familiar pattern: misunderstood fire ecology leads to misdiagnosed forest conditions, which in turn produce a misframed biomass debate </w:t>
+      </w:r>
+      <w:r>
+        <w:t xml:space="preserve">and, ultimately, policies that fail to reduce wildfire risk. This sequence does little to address the underlying drivers of large, high-severity fires in the western United States and obscures the material realities created by necessary forest restoration.</w:t>
       </w:r>
       <w:r/>
     </w:p>
     <w:p>
       <w:pPr>
+        <w:pStyle w:val="726"/>
         <w:pBdr/>
         <w:spacing/>
         <w:ind/>
         <w:rPr/>
       </w:pPr>
       <w:r>
-        <w:t xml:space="preserve">Biomass utilization is a critical downstream process of forest health treatments. It is not a driver of logging. In mitigating wildfire, we need to make the distinction between 1. sawtimber, 2. unavoidable treatment res</w:t>
-      </w:r>
-      <w:r>
-        <w:t xml:space="preserve">idues, and 3. Excess forest biomass or residual streams exist whether or not there’s an energy market. We also need to make it clear that sawtimber, clearcutting, or excessive forest harvesting cannot be conflated with forest health or wildfire mitigation.</w:t>
+        <w:t xml:space="preserve">THE disagreement</w:t>
       </w:r>
       <w:r/>
     </w:p>
     <w:p>
       <w:pPr>
-        <w:pStyle w:val="738"/>
         <w:pBdr/>
         <w:spacing/>
         <w:ind/>
         <w:rPr/>
       </w:pPr>
       <w:r>
-        <w:t xml:space="preserve">Burning &amp; air quality</w:t>
+        <w:t xml:space="preserve">In reality, the debate isn’t really about biomass. It’s about whether active forest management is ecologica</w:t>
+      </w:r>
+      <w:r>
+        <w:t xml:space="preserve">lly legitimate under novel climate conditions. CBD’s position implicitly says restraint and retreat are the answer; yours says intervention, done carefully, is unavoidable. Surfacing that philosophical split would make the argument clearer and more honest.</w:t>
       </w:r>
       <w:r/>
     </w:p>
     <w:p>
       <w:pPr>
+        <w:pStyle w:val="726"/>
         <w:pBdr/>
         <w:spacing/>
         <w:ind/>
         <w:rPr/>
       </w:pPr>
       <w:r>
-        <w:t xml:space="preserve">Let’s </w:t>
-      </w:r>
-      <w:r>
-        <w:t xml:space="preserve">acknowledge that older biomass plants were dirty, but modern regulations, controls, and siting are helping to mitigate that issue. These and environmental justice impacts from siting facilities in disadvantaged communities can be further strengthened with </w:t>
-      </w:r>
-      <w:r>
-        <w:t xml:space="preserve">strong CEQA and other environmental policies. Nevertheless poor air quality and greenhouse gas emissions from wildfires dwarf regulated point sources. The nearly million acre Dixie fire, California’s second largest wildfire, emitted 37 million tonnes of CO</w:t>
+        <w:t xml:space="preserve">Forest residuals</w:t>
+      </w:r>
+      <w:r/>
+    </w:p>
+    <w:p>
+      <w:pPr>
+        <w:pBdr/>
+        <w:spacing/>
+        <w:ind/>
+        <w:rPr/>
+      </w:pPr>
+      <w:r>
+        <w:t xml:space="preserve">Biomass utilization is a critical downstream process of forest health treatments. It is not a driver of logging. In mitigating wildfire, we need to make the distinction between 1. sawtimber, 2. unavoidable treatment res</w:t>
+      </w:r>
+      <w:r>
+        <w:t xml:space="preserve">idues, and 3. Excess forest biomass or residual streams exist whether or not there’s an energy market. We also need to make it clear that sawtimber, clearcutting, or excessive forest harvesting cannot be conflated with forest health or wildfire mitigation.</w:t>
+      </w:r>
+      <w:r/>
+    </w:p>
+    <w:p>
+      <w:pPr>
+        <w:pStyle w:val="726"/>
+        <w:pBdr/>
+        <w:spacing/>
+        <w:ind/>
+        <w:rPr/>
+      </w:pPr>
+      <w:r>
+        <w:t xml:space="preserve">Burning &amp; air quality</w:t>
+      </w:r>
+      <w:r/>
+    </w:p>
+    <w:p>
+      <w:pPr>
+        <w:pBdr/>
+        <w:spacing/>
+        <w:ind/>
+        <w:rPr/>
+      </w:pPr>
+      <w:r>
+        <w:t xml:space="preserve">Let’s a</w:t>
+      </w:r>
+      <w:r>
+        <w:t xml:space="preserve">cknowledge that older biomass plants were dirty, but modern regulations, controls, and siting are helping to mitigate that issue. These and environmental justice impacts from siting facilities in disadvantaged communities can be further strengthened with s</w:t>
+      </w:r>
+      <w:r>
+        <w:t xml:space="preserve">trong CEQA and other environmental policies. Nevertheless, poor air quality and greenhouse gas emissions from wildfires dwarf regulated point sources. The nearly million-acre Dixie fire, California’s second-largest wildfire, emitted 37 million tonnes of CO</w:t>
       </w:r>
       <w:r>
         <w:rPr>
@@ -423,7 +467,7 @@
         <w:t xml:space="preserve">)</w:t>
       </w:r>
       <w:r>
-        <w:t xml:space="preserve">. In 2020 wildfires emitted 127 million tonnoes of CO</w:t>
+        <w:t xml:space="preserve">. In 2020, wildfires emitted 127 million tons of CO</w:t>
       </w:r>
       <w:r>
         <w:rPr>
@@ -432,7 +476,7 @@
         <w:t xml:space="preserve">2e</w:t>
       </w:r>
       <w:r>
-        <w:t xml:space="preserve"> nearly two times higher than California’s total greenhouse gas emissions reductions achieved since 2003 </w:t>
+        <w:t xml:space="preserve">, nearly twice California’s total greenhouse gas emissions reductions achieved since 2003 </w:t>
       </w:r>
       <w:r>
         <w:t xml:space="preserve">(</w:t>
@@ -469,7 +513,7 @@
         <w:t xml:space="preserve">Wolf suggests leaving biomass residues in the forest. Masticating on site, lopping and pilling, or removin</w:t>
       </w:r>
       <w:r>
-        <w:t xml:space="preserve">g residue to landings has long been practiced at thinning sites. But the accumulation of materials is overwhelming. A study showed that there are approximately 150,000 acres of piles representing 1,000,000 tones with 78% of these materials on public lands </w:t>
+        <w:t xml:space="preserve">g residue to landings has long been practiced at thinning sites. But the accumulation of materials is overwhelming. A study showed that there are approximately 150,000 acres of piles representing 1,000,000 tons, with 78% of these materials on public lands </w:t>
       </w:r>
       <w:r>
         <w:t xml:space="preserve">(</w:t>
@@ -495,9 +539,9 @@
       </w:r>
       <w:r>
         <w:rPr>
-          <w:rStyle w:val="749"/>
+          <w:rStyle w:val="737"/>
         </w:rPr>
-        <w:footnoteReference w:id="3"/>
+        <w:footnoteReference w:id="2"/>
       </w:r>
       <w:r>
         <w:t xml:space="preserve"> Even disposing of those piles by burning is an episodic, unregulated process that would be much more harmful than utilization in long-term wood products or burning at a facility.</w:t>
@@ -506,7 +550,7 @@
     </w:p>
     <w:p>
       <w:pPr>
-        <w:pStyle w:val="738"/>
+        <w:pStyle w:val="726"/>
         <w:pBdr/>
         <w:spacing/>
         <w:ind/>
@@ -525,26 +569,28 @@
         <w:rPr/>
       </w:pPr>
       <w:r>
-        <w:t xml:space="preserve">We need to separate “biomass as energy” from “biomass as material flow management". Wolf collapses everything into burning trees for electricity. Biomass utilization is neither of these  an energy silver bullet nor an unending consu</w:t>
-      </w:r>
-      <w:r>
-        <w:t xml:space="preserve">mer of timber and spewer of wood smoke from giant burning plants. Biomass utilization is one of many solutions to California’s wildfire crisis, as the century-long suppression of fires has created unnatural conditions in most forests, making them more susc</w:t>
-      </w:r>
-      <w:r>
-        <w:t xml:space="preserve">eptible to disease, fire, and other threats related to climate change. We argue for a broader solution: managing unavoidable residues across multiple uses (materials, combined heat and power, heat, and biochar) as part of a landscape risk reduction system.</w:t>
+        <w:t xml:space="preserve">We need to separate “biomass as energy” from “biomass as mater</w:t>
+      </w:r>
+      <w:r>
+        <w:t xml:space="preserve">ial-flow management.” Wolf collapses everything into burning trees for electricity. Biomass utilization is neither an energy silver bullet nor an unending consumer of timber and spewer of wood smoke from giant burning plants. Rather, it is one of several t</w:t>
+      </w:r>
+      <w:r>
+        <w:t xml:space="preserve">ools for addressing California’s wildfire crisis, which itself is the result of a century of fire suppression that has produced unnaturally dense, stressed forests increasingly vulnerable to disease, drought, and high-severity fire under a warming climate.</w:t>
       </w:r>
       <w:r/>
     </w:p>
     <w:p>
       <w:pPr>
-        <w:pStyle w:val="738"/>
         <w:pBdr/>
         <w:spacing/>
         <w:ind/>
         <w:rPr/>
       </w:pPr>
       <w:r>
-        <w:t xml:space="preserve">Economics</w:t>
+        <w:t xml:space="preserve">The broader challenge is not energy production per se, but system efficiency: how to handle unavoidable forest residues once they are generated by necessary forest health treatment</w:t>
+      </w:r>
+      <w:r>
+        <w:t xml:space="preserve">s. From that perspective, biomass utilization is best understood as part of a landscape-scale risk-reduction and materials-management strategy, spanning multiple uses including long-lived wood products, combined heat and power, thermal energy, and biochar.</w:t>
       </w:r>
       <w:r/>
     </w:p>
@@ -556,39 +602,8 @@
         <w:rPr/>
       </w:pPr>
       <w:r>
-        <w:t xml:space="preserve">Increased forest management, through the use of either hand/mechanical treatments or prescribed fire, can reduce fire suppression costs relative to recent practices by more than US$400,000 per year </w:t>
-      </w:r>
-      <w:r>
-        <w:t xml:space="preserve">(</w:t>
-      </w:r>
-      <w:r>
-        <w:t xml:space="preserve">Holland </w:t>
-      </w:r>
-      <w:r>
-        <w:rPr>
-          <w:i/>
-          <w:iCs/>
-        </w:rPr>
-        <w:t xml:space="preserve">et al.</w:t>
-      </w:r>
-      <w:r>
-        <w:t xml:space="preserve">, 2022</w:t>
-      </w:r>
-      <w:r>
-        <w:t xml:space="preserve">)</w:t>
-      </w:r>
-      <w:r>
-        <w:t xml:space="preserve">.</w:t>
-      </w:r>
-      <w:r/>
-    </w:p>
-    <w:p>
-      <w:pPr>
-        <w:pBdr/>
-        <w:spacing/>
-        <w:ind/>
-        <w:rPr/>
-      </w:pPr>
+        <w:t xml:space="preserve">One useful way to think about this is as a full-circle wood economy (</w:t>
+      </w:r>
       <w:r>
         <w:t xml:space="preserve">Figure </w:t>
       </w:r>
@@ -596,40 +611,10 @@
         <w:t xml:space="preserve">1</w:t>
       </w:r>
       <w:r>
-        <w:t xml:space="preserve"> shows the cost-benefit of treatments, with an estimated cost of reaching the 1 million acres treated/year goal of </w:t>
-      </w:r>
-      <m:oMath>
-        <m:r>
-          <m:rPr/>
-          <m:t>3 billion and a benefit of </m:t>
-        </m:r>
-      </m:oMath>
-      <w:r>
-        <w:t xml:space="preserve">7.9/yr </w:t>
-      </w:r>
-      <w:r>
-        <w:t xml:space="preserve">(</w:t>
-      </w:r>
-      <w:r>
-        <w:t xml:space="preserve">Brown, 2024</w:t>
-      </w:r>
-      <w:r>
-        <w:t xml:space="preserve">)</w:t>
-      </w:r>
-      <w:r>
-        <w:t xml:space="preserve">. A maximized net benfit </w:t>
-      </w:r>
-      <m:oMath>
-        <m:r>
-          <m:rPr/>
-          <m:t>22.2 billion/yr would be reached if 3.9 million acres/yr are treated at a cost of </m:t>
-        </m:r>
-      </m:oMath>
-      <w:r>
-        <w:t xml:space="preserve">10.5. These numbers seem astronomical, but indicate the sheer scale of the problem of truly reducing wildfire risk after a century of fire suppression. Even if the state reaches the million acre annual treatment goal, all of the biomass pr</w:t>
-      </w:r>
-      <w:r>
-        <w:t xml:space="preserve">oduced has to go somewhere, as piling, masticating, and spreading it in place will only shift wildfire risk or destroy the forest understory. That somewhere can be a mix of wood utilization that maximizes carbon sequestration benefits, such as mass timber.</w:t>
+        <w:t xml:space="preserve">), in which forest biomass flows into three broad pathways: burn, bury, or build. Burn includes both open-pile burning and energy generation; bury includes decomposition, landfilling, or unmanaged decay; an</w:t>
+      </w:r>
+      <w:r>
+        <w:t xml:space="preserve">d build includes integrating wood-based carbon into longer-lived material uses, such as mass timber, engineered wood products, biochar, and soil amendments that store carbon for decades or even centuries while displacing more emissions-intensive materials.</w:t>
       </w:r>
       <w:r/>
     </w:p>
@@ -646,7 +631,7 @@
           <mc:Choice Requires="wpg">
             <w:drawing>
               <wp:inline xmlns:wp="http://schemas.openxmlformats.org/drawingml/2006/wordprocessingDrawing" distT="0" distB="0" distL="0" distR="0">
-                <wp:extent cx="4000500" cy="4021086"/>
+                <wp:extent cx="4000500" cy="4000500"/>
                 <wp:effectExtent l="0" t="0" r="0" b="0"/>
                 <wp:docPr id="2" name="" descr="" title=""/>
                 <wp:cNvGraphicFramePr>
@@ -664,6 +649,192 @@
                       </pic:nvPicPr>
                       <pic:blipFill rotWithShape="1">
                         <a:blip r:embed="rId11"/>
+                        <a:stretch/>
+                      </pic:blipFill>
+                      <pic:spPr bwMode="auto">
+                        <a:xfrm>
+                          <a:off x="0" y="0"/>
+                          <a:ext cx="4000500" cy="4000500"/>
+                        </a:xfrm>
+                        <a:prstGeom prst="rect">
+                          <a:avLst/>
+                        </a:prstGeom>
+                      </pic:spPr>
+                    </pic:pic>
+                  </a:graphicData>
+                </a:graphic>
+              </wp:inline>
+            </w:drawing>
+          </mc:Choice>
+          <mc:Fallback>
+            <w:pict>
+              <v:shapetype id="_x0000_t75" coordsize="21600,21600" o:spt="75" o:preferrelative="t" path="m@4@5l@4@11@9@11@9@5xe" filled="f" stroked="f">
+                <v:stroke joinstyle="miter"/>
+                <v:formulas>
+                  <v:f eqn="if lineDrawn pixelLineWidth 0"/>
+                  <v:f eqn="sum @0 1 0"/>
+                  <v:f eqn="sum 0 0 @1"/>
+                  <v:f eqn="prod @2 1 2"/>
+                  <v:f eqn="prod @3 21600 pixelWidth"/>
+                  <v:f eqn="prod @3 21600 pixelHeight"/>
+                  <v:f eqn="sum @0 0 1"/>
+                  <v:f eqn="prod @6 1 2"/>
+                  <v:f eqn="prod @7 21600 pixelWidth"/>
+                  <v:f eqn="sum @8 21600 0"/>
+                  <v:f eqn="prod @7 21600 pixelHeight"/>
+                  <v:f eqn="sum @10 21600 0"/>
+                </v:formulas>
+                <v:path o:extrusionok="f" gradientshapeok="t" o:connecttype="rect"/>
+                <o:lock v:ext="edit" aspectratio="t"/>
+              </v:shapetype>
+              <v:shape id="_x0000_i1" o:spid="_x0000_s1" type="#_x0000_t75" style="width:315.00pt;height:315.00pt;mso-wrap-distance-left:0.00pt;mso-wrap-distance-top:0.00pt;mso-wrap-distance-right:0.00pt;mso-wrap-distance-bottom:0.00pt;z-index:1;" stroked="false">
+                <v:imagedata r:id="rId11" o:title=""/>
+                <o:lock v:ext="edit" rotation="t"/>
+              </v:shape>
+            </w:pict>
+          </mc:Fallback>
+        </mc:AlternateContent>
+      </w:r>
+      <w:r/>
+    </w:p>
+    <w:p>
+      <w:pPr>
+        <w:pStyle w:val="748"/>
+        <w:pBdr/>
+        <w:spacing/>
+        <w:ind/>
+        <w:rPr/>
+      </w:pPr>
+      <w:r>
+        <w:rPr>
+          <w:b/>
+          <w:bCs/>
+        </w:rPr>
+        <w:t xml:space="preserve">Figure </w:t>
+      </w:r>
+      <w:r>
+        <w:rPr>
+          <w:b/>
+          <w:bCs/>
+        </w:rPr>
+        <w:t xml:space="preserve">1</w:t>
+      </w:r>
+      <w:r>
+        <w:rPr>
+          <w:b/>
+          <w:bCs/>
+        </w:rPr>
+        <w:t xml:space="preserve">:</w:t>
+      </w:r>
+      <w:r>
+        <w:t xml:space="preserve"> </w:t>
+      </w:r>
+      <w:r>
+        <w:t xml:space="preserve">Products from ecologically managed forests. Burn (red upper left) = in fire-prone forests, using wood to power low-emission bioenergy facilities replaces fossil fuels and produces less GHGs than pile burning o</w:t>
+      </w:r>
+      <w:r>
+        <w:t xml:space="preserve">r mega fires. Bury (gree lower left) = compost is one of the simplest products made from any woody biomass, requiring little energy and diverting biomass from landfills (where it can generate methane, a greenhouse gas). Build (brown/green lower right) = ma</w:t>
+      </w:r>
+      <w:r>
+        <w:t xml:space="preserve">king productive use of harvested wood is difficult due to a lack of processing infrastructure. More distributed solutions for utilizing small-diameter wood for building material should be pursued to create a viable economy for ecological forest management.</w:t>
+      </w:r>
+      <w:r/>
+    </w:p>
+    <w:p>
+      <w:pPr>
+        <w:pBdr/>
+        <w:spacing/>
+        <w:ind/>
+        <w:rPr/>
+      </w:pPr>
+      <w:r>
+        <w:t xml:space="preserve">Seen this way, the policy question is not whether biomass exists; it does. The question is whether we design systems tha</w:t>
+      </w:r>
+      <w:r>
+        <w:t xml:space="preserve">t treat it as a resource whose fate can be shaped deliberately. The system question could reflect nature, e.g., maximizing the system efficiency by finding uses for every element in the residue equation. This includes both utilization and leaving in place.</w:t>
+      </w:r>
+      <w:r/>
+    </w:p>
+    <w:p>
+      <w:pPr>
+        <w:pStyle w:val="726"/>
+        <w:pBdr/>
+        <w:spacing/>
+        <w:ind/>
+        <w:rPr/>
+      </w:pPr>
+      <w:r>
+        <w:t xml:space="preserve">Economics</w:t>
+      </w:r>
+      <w:r/>
+    </w:p>
+    <w:p>
+      <w:pPr>
+        <w:pBdr/>
+        <w:spacing/>
+        <w:ind/>
+        <w:rPr/>
+      </w:pPr>
+      <w:r>
+        <w:t xml:space="preserve">At the statewide scale, cost–benefit analyses illustrate both the magnitude of the problem and the opportunity. As shown in </w:t>
+      </w:r>
+      <w:r>
+        <w:t xml:space="preserve">Figure </w:t>
+      </w:r>
+      <w:r>
+        <w:t xml:space="preserve">2</w:t>
+      </w:r>
+      <w:r>
+        <w:t xml:space="preserve">, reaching California’s current goal of treating one million acres per year requires substantial investment, but the estimated benefits already exceed costs by a wide margin </w:t>
+      </w:r>
+      <w:r>
+        <w:t xml:space="preserve">(</w:t>
+      </w:r>
+      <w:r>
+        <w:t xml:space="preserve">Brown, 2024</w:t>
+      </w:r>
+      <w:r>
+        <w:t xml:space="preserve">)</w:t>
+      </w:r>
+      <w:r>
+        <w:t xml:space="preserve">. At treatment levels closer to what is required to meaningfully reduce wildfire risk after a century of fire suppression, net benefits increase </w:t>
+      </w:r>
+      <w:r>
+        <w:t xml:space="preserve">further. Whereas these dollar values may appear large, they reflect the true scale of avoided suppression costs, reduced disaster losses, and long-term risk stabilization in a state where wildfire has become one of the most expensive unmanaged liabilities.</w:t>
+      </w:r>
+      <w:r/>
+    </w:p>
+    <w:p>
+      <w:pPr>
+        <w:pBdr/>
+        <w:spacing/>
+        <w:ind/>
+        <w:jc w:val="center"/>
+        <w:rPr/>
+      </w:pPr>
+      <w:r>
+        <mc:AlternateContent>
+          <mc:Choice Requires="wpg">
+            <w:drawing>
+              <wp:inline xmlns:wp="http://schemas.openxmlformats.org/drawingml/2006/wordprocessingDrawing" distT="0" distB="0" distL="0" distR="0">
+                <wp:extent cx="4000500" cy="4021086"/>
+                <wp:effectExtent l="0" t="0" r="0" b="0"/>
+                <wp:docPr id="3" name="" descr="" title=""/>
+                <wp:cNvGraphicFramePr>
+                  <a:graphicFrameLocks xmlns:a="http://schemas.openxmlformats.org/drawingml/2006/main" noChangeAspect="1"/>
+                </wp:cNvGraphicFramePr>
+                <a:graphic xmlns:a="http://schemas.openxmlformats.org/drawingml/2006/main">
+                  <a:graphicData uri="http://schemas.openxmlformats.org/drawingml/2006/picture">
+                    <pic:pic xmlns:pic="http://schemas.openxmlformats.org/drawingml/2006/picture">
+                      <pic:nvPicPr>
+                        <pic:cNvPr id="0" name="" descr=""/>
+                        <pic:cNvPicPr>
+                          <a:picLocks noChangeAspect="1"/>
+                        </pic:cNvPicPr>
+                        <pic:nvPr/>
+                      </pic:nvPicPr>
+                      <pic:blipFill rotWithShape="1">
+                        <a:blip r:embed="rId12"/>
                         <a:stretch/>
                       </pic:blipFill>
                       <pic:spPr bwMode="auto">
@@ -702,8 +873,8 @@
                 <v:path o:extrusionok="f" gradientshapeok="t" o:connecttype="rect"/>
                 <o:lock v:ext="edit" aspectratio="t"/>
               </v:shapetype>
-              <v:shape id="_x0000_i1" o:spid="_x0000_s1" type="#_x0000_t75" style="width:315.00pt;height:316.62pt;mso-wrap-distance-left:0.00pt;mso-wrap-distance-top:0.00pt;mso-wrap-distance-right:0.00pt;mso-wrap-distance-bottom:0.00pt;z-index:1;" stroked="false">
-                <v:imagedata r:id="rId11" o:title=""/>
+              <v:shape id="_x0000_i2" o:spid="_x0000_s2" type="#_x0000_t75" style="width:315.00pt;height:316.62pt;mso-wrap-distance-left:0.00pt;mso-wrap-distance-top:0.00pt;mso-wrap-distance-right:0.00pt;mso-wrap-distance-bottom:0.00pt;z-index:1;" stroked="false">
+                <v:imagedata r:id="rId12" o:title=""/>
                 <o:lock v:ext="edit" rotation="t"/>
               </v:shape>
             </w:pict>
@@ -714,7 +885,7 @@
     </w:p>
     <w:p>
       <w:pPr>
-        <w:pStyle w:val="760"/>
+        <w:pStyle w:val="748"/>
         <w:pBdr/>
         <w:spacing/>
         <w:ind/>
@@ -732,7 +903,7 @@
           <w:b/>
           <w:bCs/>
         </w:rPr>
-        <w:t xml:space="preserve">1</w:t>
+        <w:t xml:space="preserve">2</w:t>
       </w:r>
       <w:r>
         <w:rPr>
@@ -769,7 +940,7 @@
         <w:rPr/>
       </w:pPr>
       <w:r>
-        <w:t xml:space="preserve">Additional studies estimate a return on investment of treatments of $3.42 for every $1 invested </w:t>
+        <w:t xml:space="preserve">Additional studies reinforce this conclusion; estimating returns on investment of more than three dollars for every dollar spent on fuel treatments and benefit–cost ratios approaching four when avoided damages are included </w:t>
       </w:r>
       <w:r>
         <w:t xml:space="preserve">(</w:t>
@@ -788,22 +959,105 @@
         <w:t xml:space="preserve">, 2025</w:t>
       </w:r>
       <w:r>
+        <w:t xml:space="preserve">; </w:t>
+      </w:r>
+      <w:r>
+        <w:t xml:space="preserve">Turner, 2023</w:t>
+      </w:r>
+      <w:r>
         <w:t xml:space="preserve">)</w:t>
       </w:r>
       <w:r>
-        <w:t xml:space="preserve"> similar and a benefit-cost ratio of 4 </w:t>
+        <w:t xml:space="preserve">. The economic question, then, is no longer whether California can afford to treat its forests, but whether it can afford not to.</w:t>
+      </w:r>
+      <w:r/>
+    </w:p>
+    <w:p>
+      <w:pPr>
+        <w:pBdr/>
+        <w:spacing/>
+        <w:ind/>
+        <w:rPr/>
+      </w:pPr>
+      <w:r>
+        <w:t xml:space="preserve">Large-scale forest treatments i</w:t>
+      </w:r>
+      <w:r>
+        <w:t xml:space="preserve">nevitably generate substantial volumes of woody material. From an economic standpoint, this material is not optional; it is an unavoidable byproduct of necessary restoration. If it is left in place, piled, or masticated, wildfire risk is often shifted rath</w:t>
+      </w:r>
+      <w:r>
+        <w:t xml:space="preserve">er than reduced, and carbon is released through decay or open burning without benefit. That biomass must go somewhere. Deliberate utilization converts an unavoidable cost into a managed material flow that supports risk reduction rather than undermining it.</w:t>
+      </w:r>
+      <w:r/>
+    </w:p>
+    <w:p>
+      <w:pPr>
+        <w:pBdr/>
+        <w:spacing/>
+        <w:ind/>
+        <w:rPr/>
+      </w:pPr>
+      <w:r>
+        <w:t xml:space="preserve">Another longer-term economic value is often undercounted: carbon</w:t>
+      </w:r>
+      <w:r>
+        <w:t xml:space="preserve"> storage and avoided emissions. Using forest biomass in longer-lived products such as mass timber, engineered wood, or biochar effectively sequesters carbon that would otherwise be released through wildfire or decomposition, while simultaneously displacing</w:t>
+      </w:r>
+      <w:r>
+        <w:t xml:space="preserve"> more emissions-intensive materials. Modeling studies show that treated forest scenarios can result in greater total carbon storage over time despite substantially lower tree densities, due to reduced wildfire emissions and increased growth of large trees </w:t>
       </w:r>
       <w:r>
         <w:t xml:space="preserve">(</w:t>
       </w:r>
       <w:r>
-        <w:t xml:space="preserve">Turner, 2023</w:t>
+        <w:t xml:space="preserve">Elias </w:t>
+      </w:r>
+      <w:r>
+        <w:rPr>
+          <w:i/>
+          <w:iCs/>
+        </w:rPr>
+        <w:t xml:space="preserve">et al.</w:t>
+      </w:r>
+      <w:r>
+        <w:t xml:space="preserve">, 2025</w:t>
+      </w:r>
+      <w:r>
+        <w:t xml:space="preserve">; </w:t>
+      </w:r>
+      <w:r>
+        <w:t xml:space="preserve">Delyser </w:t>
+      </w:r>
+      <w:r>
+        <w:rPr>
+          <w:i/>
+          <w:iCs/>
+        </w:rPr>
+        <w:t xml:space="preserve">et al.</w:t>
+      </w:r>
+      <w:r>
+        <w:t xml:space="preserve">, 2025</w:t>
       </w:r>
       <w:r>
         <w:t xml:space="preserve">)</w:t>
       </w:r>
       <w:r>
         <w:t xml:space="preserve">.</w:t>
+      </w:r>
+      <w:r/>
+    </w:p>
+    <w:p>
+      <w:pPr>
+        <w:pBdr/>
+        <w:spacing/>
+        <w:ind/>
+        <w:rPr/>
+      </w:pPr>
+      <w:r>
+        <w:t xml:space="preserve">Taken together, the economics of biomass utilization are not about subsidizing energy production. They are about reducing catastrophic losses, stabilizing long-term risk, and capturing value from material streams that result from f</w:t>
+      </w:r>
+      <w:r>
+        <w:t xml:space="preserve">orest restoration. In this context, biomass utilization functions less as a cost center and more as preventive infrastructure—an investment that lowers future public expenditures while supporting more resilient forests, communities, and regional economies.</w:t>
       </w:r>
       <w:r/>
     </w:p>
@@ -847,13 +1101,13 @@
         <w:rPr/>
       </w:pPr>
       <w:r>
-        <w:t xml:space="preserve">In addition to wildfire and climate disinformation, several recurring themes touted by some environmentalists deserve debunking and nuance.</w:t>
+        <w:t xml:space="preserve">In addition to wildfire and climate disinformation, several recurring claims about biomass utilization appear frequently in public debate. These arguments often rely on incomplete framing, and their resolutions benefit from clarification and nuance.</w:t>
       </w:r>
       <w:r/>
     </w:p>
     <w:p>
       <w:pPr>
-        <w:pStyle w:val="747"/>
+        <w:pStyle w:val="735"/>
         <w:numPr>
           <w:ilvl w:val="0"/>
           <w:numId w:val="3"/>
@@ -862,7 +1116,7 @@
           <w:left w:val="single" w:color="5d85d0" w:sz="4" w:space="0"/>
         </w:pBdr>
         <w:spacing/>
-        <w:ind w:right="288"/>
+        <w:ind w:right="288" w:left="288"/>
         <w:rPr/>
       </w:pPr>
       <w:r>
@@ -870,19 +1124,22 @@
           <w:b/>
           <w:bCs/>
         </w:rPr>
-        <w:t xml:space="preserve">Downstream process</w:t>
-      </w:r>
-      <w:r>
-        <w:t xml:space="preserve">. Wolf mentions leaving thinned biomass in place rather than using it as biomass. However, this practice has led to suppression of important undergrowth and, in worst-case scenarios, started or exacerbated some of the largest</w:t>
-      </w:r>
-      <w:r>
-        <w:t xml:space="preserve"> fires in California’s history. For example, it’s widely acknowledged that the Dixie Fire, which burned more than 1 million acres across the Plumas National Forest, was spread by a log deck and by thinned fuel piles left in place after thinning operations.</w:t>
+        <w:t xml:space="preserve">Biomass is not a downstream process</w:t>
+      </w:r>
+      <w:r>
+        <w:t xml:space="preserve">. A common claim is that thinned biomass should simply be left in the forest rather than removed or utilized. In practice, leaving large volumes of treated material</w:t>
+      </w:r>
+      <w:r>
+        <w:t xml:space="preserve"> in place can suppress understory regeneration and, in some cases, increase fire risk. In extreme scenarios, residual piles or log decks have contributed to fire spread. The 2021 Dixie Fire, which burned more than one million acres across the Plumas Nation</w:t>
+      </w:r>
+      <w:r>
+        <w:t xml:space="preserve">al Forest, is widely acknowledged to have spread in part through a log deck and thinned fuel piles left on site after forest operations. At the scale now required for restoration, residual material must be actively managed rather than assumed to be benign.</w:t>
       </w:r>
       <w:r/>
     </w:p>
     <w:p>
       <w:pPr>
-        <w:pStyle w:val="747"/>
+        <w:pStyle w:val="735"/>
         <w:numPr>
           <w:ilvl w:val="0"/>
           <w:numId w:val="3"/>
@@ -897,13 +1154,13 @@
           <w:b/>
           <w:bCs/>
         </w:rPr>
-        <w:t xml:space="preserve">Carbon accounting</w:t>
-      </w:r>
-      <w:r>
-        <w:t xml:space="preserve">. Biomass utilization is not zero-carbon, even with newer technologies that reduce carbon emissions. However, in fire-prone forests, t</w:t>
-      </w:r>
-      <w:r>
-        <w:t xml:space="preserve">he alternative is large wildfires that release immense amounts of carbon in an uncontrolled manner, often negatively impacting communities downwind for weeks to months. Due to fires, California forests have been a net source of carbon emissions since 2015 </w:t>
+        <w:t xml:space="preserve">Carbon accounting is context dependent</w:t>
+      </w:r>
+      <w:r>
+        <w:t xml:space="preserve">. Biomass utilization is not zero carbon, even with modern technologies that reduce emissions. However, in fire-prone forests, the relevant comparison is not biomass versus no emissions, but biomass versus uncontrolled wildfire and decay.</w:t>
+      </w:r>
+      <w:r>
+        <w:t xml:space="preserve"> Large wildfires release immense amounts of carbon rapidly and unpredictably, often exposing downwind communities to smoke for weeks or months. Due to repeated high-severity fires, California’s forests have been a net source of carbon emissions since 2015 </w:t>
       </w:r>
       <w:r>
         <w:t xml:space="preserve">(</w:t>
@@ -925,10 +1182,13 @@
         <w:t xml:space="preserve">)</w:t>
       </w:r>
       <w:r>
-        <w:t xml:space="preserve">. Even leaving biomass from thinning projects in place is not a solution, as it shifts wildfi</w:t>
-      </w:r>
-      <w:r>
-        <w:t xml:space="preserve">re risk or creates unnatural conditions from excessive wood chips spread on the forest floor. Another element of carbon accounting is sequestration. With thinned forests, carbon sequestration increases, and large trees grow larger. In a recent simulation, </w:t>
+        <w:t xml:space="preserve">. Leaving biomass from thinning projects in place does not eliminate emissions and can shift wildfire risk or create unnatural conditions from excessive wood chips on the forest floor. Carbon acco</w:t>
+      </w:r>
+      <w:r>
+        <w:t xml:space="preserve">unting must also include sequestration. In treated forests, large trees grow larger, and total carbon storage can increase over time. A recent simulation found that treated forest scenarios retained 6% more carbon despite a 74% reduction in trees per acre </w:t>
+      </w:r>
+      <w:r>
+        <w:t xml:space="preserve">(</w:t>
       </w:r>
       <w:r>
         <w:t xml:space="preserve">Elias </w:t>
@@ -941,16 +1201,19 @@
         <w:t xml:space="preserve">et al.</w:t>
       </w:r>
       <w:r>
-        <w:t xml:space="preserve"> (2025)</w:t>
-      </w:r>
-      <w:r>
-        <w:t xml:space="preserve"> found a treated forest scenario with 6% more carbon despite a 74% decrease in trees/acre.</w:t>
+        <w:t xml:space="preserve">, 2025</w:t>
+      </w:r>
+      <w:r>
+        <w:t xml:space="preserve">)</w:t>
+      </w:r>
+      <w:r>
+        <w:t xml:space="preserve">.</w:t>
       </w:r>
       <w:r/>
     </w:p>
     <w:p>
       <w:pPr>
-        <w:pStyle w:val="747"/>
+        <w:pStyle w:val="735"/>
         <w:numPr>
           <w:ilvl w:val="0"/>
           <w:numId w:val="3"/>
@@ -965,27 +1228,31 @@
           <w:b/>
           <w:bCs/>
         </w:rPr>
-        <w:t xml:space="preserve">Feeding the beast</w:t>
-      </w:r>
-      <w:r>
-        <w:t xml:space="preserve">. A fear among opponents of biomass utilization is that feeding plants from pristine forests to support the biomass industry with dubious climate benefits, e.g., as in North Carolina or Europe (</w:t>
-      </w:r>
-      <w:hyperlink r:id="rId12" w:tooltip="https://calmatters.org/commentary/2022/11/wildfire-prevention-biomass-climate-forest" w:history="1">
-        <w:r>
-          <w:rPr>
-            <w:rStyle w:val="748"/>
-          </w:rPr>
-          <w:t xml:space="preserve">Frisch and Uden 2023</w:t>
-        </w:r>
-      </w:hyperlink>
-      <w:r>
-        <w:t xml:space="preserve">). However, as the same authors argue, the situation is very different in the American West, where biomass results from wildfire mitigation treatments and 90% of forest land is owned by the public and small-scale landowners.</w:t>
+        <w:t xml:space="preserve">Concerns about “feeding the beast” are geographic</w:t>
+      </w:r>
+      <w:r>
+        <w:t xml:space="preserve">. Opponents of biomass utilization often raise concerns about creating demand that incentivizes harvesting from intact or old-growth forests, citing examples from the southeastern United States or Europe </w:t>
+      </w:r>
+      <w:r>
+        <w:t xml:space="preserve">(</w:t>
+      </w:r>
+      <w:r>
+        <w:t xml:space="preserve">Frisch &amp; Uden, 2022</w:t>
+      </w:r>
+      <w:r>
+        <w:t xml:space="preserve">)</w:t>
+      </w:r>
+      <w:r>
+        <w:t xml:space="preserve">. Those concerns deserve scrutiny, but they do not translate directly to the American West. In California and much of the western United States, biomass associated with utilization proposals overwhelmingly comes fro</w:t>
+      </w:r>
+      <w:r>
+        <w:t xml:space="preserve">m wildfire mitigation and forest health treatments. Approximately ninety percent of forest land is publicly owned or held by small private landowners, and large-scale industrial clearcutting for biomass is neither the dominant practice nor the policy goal.</w:t>
       </w:r>
       <w:r/>
     </w:p>
     <w:p>
       <w:pPr>
-        <w:pStyle w:val="747"/>
+        <w:pStyle w:val="735"/>
         <w:numPr>
           <w:ilvl w:val="0"/>
           <w:numId w:val="3"/>
@@ -1000,30 +1267,34 @@
           <w:b/>
           <w:bCs/>
         </w:rPr>
-        <w:t xml:space="preserve">Biomass is an energy silver bullet</w:t>
-      </w:r>
-      <w:r>
-        <w:t xml:space="preserve">. Biomass energy will not replace renewable energy</w:t>
-      </w:r>
-      <w:r>
-        <w:t xml:space="preserve"> sources such as solar and wind. It is meant to be a local utilization process that is far superior to and less polluting than letting forests burn. The real issue at hand is addressing California’s wildfire emergency and not biomass vs. other renewables (</w:t>
-      </w:r>
-      <w:hyperlink r:id="rId13" w:tooltip="https://calmatters.org/commentary/reader-reactions/2025/12/hazardous-forest-waste-wildfire-california/" w:history="1">
-        <w:r>
-          <w:rPr>
-            <w:rStyle w:val="748"/>
-          </w:rPr>
-          <w:t xml:space="preserve">Dias 2025</w:t>
-        </w:r>
-      </w:hyperlink>
-      <w:r>
-        <w:t xml:space="preserve">).</w:t>
+        <w:t xml:space="preserve">Biomass is not an energy silver bullet</w:t>
+      </w:r>
+      <w:r>
+        <w:t xml:space="preserve">. Bi</w:t>
+      </w:r>
+      <w:r>
+        <w:t xml:space="preserve">omass energy is not intended to replace renewable energy sources such as solar or wind. Its role is local and complementary, focused on managing unavoidable material streams produced by forest restoration. Compared with open pile burning or uncontrolled wi</w:t>
+      </w:r>
+      <w:r>
+        <w:t xml:space="preserve">ldfire, regulated utilization can be less polluting and more predictable. The central issue is not biomass versus other renewables, but how California addresses its wildfire emergency while managing the material consequences of necessary forest treatments </w:t>
+      </w:r>
+      <w:r>
+        <w:t xml:space="preserve">(</w:t>
+      </w:r>
+      <w:r>
+        <w:t xml:space="preserve">Dias, 2025</w:t>
+      </w:r>
+      <w:r>
+        <w:t xml:space="preserve">)</w:t>
+      </w:r>
+      <w:r>
+        <w:t xml:space="preserve">.</w:t>
       </w:r>
       <w:r/>
     </w:p>
     <w:p>
       <w:pPr>
-        <w:pStyle w:val="747"/>
+        <w:pStyle w:val="735"/>
         <w:numPr>
           <w:ilvl w:val="0"/>
           <w:numId w:val="3"/>
@@ -1038,13 +1309,16 @@
           <w:b/>
           <w:bCs/>
         </w:rPr>
-        <w:t xml:space="preserve">Policy-based incentives</w:t>
-      </w:r>
-      <w:r>
-        <w:t xml:space="preserve">. The Bioenergy Market Adjusting Tariff Program (BIOMAT), which the CPUC sadly decided not to renew, required utilities to buy power from small local proje</w:t>
-      </w:r>
-      <w:r>
-        <w:t xml:space="preserve">cts that convert forest biomass to energy. Creating a successor program that could get facilities across the line to function or re-idle facilities like Loyalton that aren’t currently operating is critical to processing biomass from forest health projects.</w:t>
+        <w:t xml:space="preserve">Policy incentives shape outcomes, not extraction</w:t>
+      </w:r>
+      <w:r>
+        <w:t xml:space="preserve">. Programs such as the Bioenergy Market Adjusting Tariff Program, or BIOMAT, required utilities to purchase power from small, local facilities that convert forest biomass to energy. The program was designed to support</w:t>
+      </w:r>
+      <w:r>
+        <w:t xml:space="preserve"> material processing capacity near treatment areas, not to drive increased harvesting. With the program’s expiration, facilities capable of handling biomass from forest health projects have idled or closed. Creating a successor program that enables appropr</w:t>
+      </w:r>
+      <w:r>
+        <w:t xml:space="preserve">iately sited facilities to operate, or re-idle facilities such as Loyalton, is critical to ensuring that biomass generated through restoration can be processed responsibly rather than disposed of through open burning or left to accumulate on the landscape.</w:t>
       </w:r>
       <w:r/>
     </w:p>
@@ -1060,7 +1334,7 @@
     </w:p>
     <w:p>
       <w:pPr>
-        <w:pStyle w:val="737"/>
+        <w:pStyle w:val="725"/>
         <w:pBdr/>
         <w:spacing/>
         <w:ind/>
@@ -1079,7 +1353,7 @@
         <w:rPr/>
       </w:pPr>
       <w:r>
-        <w:t xml:space="preserve">Similar to climate misinformation, untruths about wildfire, forests, and logging have multiplied in the media, political discourse, and across organizations </w:t>
+        <w:t xml:space="preserve">As with climate change, misinformation about wildfire, forests, and logging has increasingly shaped public understanding and policy debates </w:t>
       </w:r>
       <w:r>
         <w:t xml:space="preserve">(</w:t>
@@ -1101,35 +1375,25 @@
         <w:t xml:space="preserve">)</w:t>
       </w:r>
       <w:r>
-        <w:t xml:space="preserve">. Likewise, overexposure of wildfire and biomass contrarians in the media to give ‘balanced’ views can result in public confusion and weakened support for interventions, as well as undermine scientific consensus </w:t>
-      </w:r>
-      <w:r>
-        <w:t xml:space="preserve">(</w:t>
-      </w:r>
-      <w:r>
-        <w:t xml:space="preserve">Cook, 2020</w:t>
-      </w:r>
-      <w:r>
-        <w:t xml:space="preserve">)</w:t>
-      </w:r>
-      <w:r>
-        <w:t xml:space="preserve">. A perfect example from the CalMatters article is the claim that ‘Most of California’s destructive wildfires...have burned in shrubland</w:t>
-      </w:r>
-      <w:r>
-        <w:t xml:space="preserve">s and grasslands...’ The citation is for a study that concludes that destructive wildfires in the continental US have occurred mostly in these habitats. In reality, the most destructive California wildfires have occurred in a mix of forests and shrublands.</w:t>
+        <w:t xml:space="preserve">. In California, this misinformation is often reinforced by deeply ingrained visual and cultural ass</w:t>
+      </w:r>
+      <w:r>
+        <w:t xml:space="preserve">umptions about what a healthy forest looks like. Many people implicitly picture dense, closed-canopy forests modeled on the eastern United States, northern Europe, or England, landscapes that evolved under very different climatic and ecological conditions.</w:t>
       </w:r>
       <w:r/>
     </w:p>
     <w:p>
       <w:pPr>
-        <w:pStyle w:val="738"/>
         <w:pBdr/>
         <w:spacing/>
         <w:ind/>
         <w:rPr/>
       </w:pPr>
       <w:r>
-        <w:t xml:space="preserve">Fire-adapted forests</w:t>
+        <w:t xml:space="preserve">California’s forests exist largely within a Mediterranean climate, characterized by wet winters and long, hot, dry summers. These conditions favor fire-adapted ecosystems rather than the dense, moisture-rich forest</w:t>
+      </w:r>
+      <w:r>
+        <w:t xml:space="preserve">s common in temperate eastern regions. When forest health is judged using the wrong ecological reference point, fire-adapted landscapes can be misdiagnosed as degraded or overmanaged, while overly dense stands are mistakenly viewed as natural or desirable.</w:t>
       </w:r>
       <w:r/>
     </w:p>
@@ -1141,10 +1405,98 @@
         <w:rPr/>
       </w:pPr>
       <w:r>
-        <w:t xml:space="preserve">Another misconception mentioned is that thinning makes cool, moist forests hotter, drier, and more wind-prone, where the author cites </w:t>
-      </w:r>
-      <w:r>
-        <w:t xml:space="preserve">Hagmann </w:t>
+        <w:t xml:space="preserve">These misconceptions shape how wildfire risk is interp</w:t>
+      </w:r>
+      <w:r>
+        <w:t xml:space="preserve">reted and how solutions are evaluated. Simplified narratives, such as the claim that destructive fires are primarily a shrubland phenomenon, further obscure the reality that California’s most damaging fires occur across mixed landscapes that include forest</w:t>
+      </w:r>
+      <w:r>
+        <w:t xml:space="preserve">s, shrublands, and the wildland–urban interface. When wildfire ecology is misunderstood in this way, forest management and biomass utilization are often framed as unnecessary or harmful rather than as responses to a misaligned, historically altered system.</w:t>
+      </w:r>
+      <w:r/>
+    </w:p>
+    <w:p>
+      <w:pPr>
+        <w:pBdr/>
+        <w:spacing/>
+        <w:ind/>
+        <w:rPr/>
+      </w:pPr>
+      <w:r>
+        <w:t xml:space="preserve">Wildfire disinformation matters not only because it is inaccurate and undermines accepted science, but because it drives policy choices that fail to address the underlying causes of high-severity fire in a fire-adapted landscape </w:t>
+      </w:r>
+      <w:r>
+        <w:t xml:space="preserve">(</w:t>
+      </w:r>
+      <w:r>
+        <w:t xml:space="preserve">Cook, 2020</w:t>
+      </w:r>
+      <w:r>
+        <w:t xml:space="preserve">)</w:t>
+      </w:r>
+      <w:r>
+        <w:t xml:space="preserve">.</w:t>
+      </w:r>
+      <w:r/>
+    </w:p>
+    <w:p>
+      <w:pPr>
+        <w:pStyle w:val="726"/>
+        <w:pBdr/>
+        <w:spacing/>
+        <w:ind/>
+        <w:rPr/>
+      </w:pPr>
+      <w:r>
+        <w:t xml:space="preserve">Fire-adapted forests &amp; cultural fire</w:t>
+      </w:r>
+      <w:r/>
+    </w:p>
+    <w:p>
+      <w:pPr>
+        <w:pBdr/>
+        <w:spacing/>
+        <w:ind/>
+        <w:rPr/>
+      </w:pPr>
+      <w:r>
+        <w:t xml:space="preserve">A growing body of ecological research, supported by historical records and Indigenous knowledge, makes clear that most of California’s landscapes burned regularly prior to Euro-American settlement. From the coast to the Sierra</w:t>
+      </w:r>
+      <w:r>
+        <w:t xml:space="preserve"> Nevada and beyond, fire occurred on highly variable but frequent cycles, often on the order of five to fifteen years, depending on vegetation type, elevation, and local climate. Fire was not an anomaly in these systems; it was essential to their function.</w:t>
+      </w:r>
+      <w:r/>
+    </w:p>
+    <w:p>
+      <w:pPr>
+        <w:pBdr/>
+        <w:spacing/>
+        <w:ind/>
+        <w:rPr/>
+      </w:pPr>
+      <w:r>
+        <w:t xml:space="preserve">Indigenous peoples actively shaped these fire regimes through intentional burning, now commonly referred to as cultural burning. These practices did not simply mimic lightning ignitions but actively guided fire to support food systems, medicinal p</w:t>
+      </w:r>
+      <w:r>
+        <w:t xml:space="preserve">lants, wildlife habitat, travel corridors, and sacred landscapes. Cultural burning worked in concert with natural fire to sustain open, patchy forests, interspersed meadows, and diverse age structures, supporting high levels of biodiversity and resilience.</w:t>
+      </w:r>
+      <w:r/>
+    </w:p>
+    <w:p>
+      <w:pPr>
+        <w:pBdr/>
+        <w:spacing/>
+        <w:ind/>
+        <w:rPr/>
+      </w:pPr>
+      <w:r>
+        <w:t xml:space="preserve">Decades of fire science align closely with this knowledge. Prior to widespread fire suppression, western forests tended to have larger trees, lower overall density, and greater structural heterogeneity </w:t>
+      </w:r>
+      <w:r>
+        <w:t xml:space="preserve">(</w:t>
+      </w:r>
+      <w:r>
+        <w:t xml:space="preserve">North </w:t>
       </w:r>
       <w:r>
         <w:rPr>
@@ -1154,13 +1506,13 @@
         <w:t xml:space="preserve">et al.</w:t>
       </w:r>
       <w:r>
-        <w:t xml:space="preserve"> (2021)</w:t>
-      </w:r>
-      <w:r>
-        <w:t xml:space="preserve">. Several authors cited in this article are described in </w:t>
-      </w:r>
-      <w:r>
-        <w:t xml:space="preserve">Peery </w:t>
+        <w:t xml:space="preserve">, 2009</w:t>
+      </w:r>
+      <w:r>
+        <w:t xml:space="preserve">; </w:t>
+      </w:r>
+      <w:r>
+        <w:t xml:space="preserve">Stephens </w:t>
       </w:r>
       <w:r>
         <w:rPr>
@@ -1170,19 +1522,44 @@
         <w:t xml:space="preserve">et al.</w:t>
       </w:r>
       <w:r>
-        <w:t xml:space="preserve"> (2019)</w:t>
-      </w:r>
-      <w:r>
-        <w:t xml:space="preserve"> as engaging in agenda-driven pseudoscien</w:t>
-      </w:r>
-      <w:r>
-        <w:t xml:space="preserve">ce, such as the selective use of data, mixing science and litigation without declaring conflicts of interest, and harassing scientists publishing competing studies. Yet there’s widespread scientific consensus that fire was more frequent in western forests </w:t>
+        <w:t xml:space="preserve">, 2007</w:t>
+      </w:r>
+      <w:r>
+        <w:t xml:space="preserve">)</w:t>
+      </w:r>
+      <w:r>
+        <w:t xml:space="preserve">. The removal of frequent, low- to moderate-severity fire disrupted these systems, allowing fuels to accumulate and forest structure to shift far beyond historical and ecological norms.</w:t>
+      </w:r>
+      <w:r/>
+    </w:p>
+    <w:p>
+      <w:pPr>
+        <w:pStyle w:val="726"/>
+        <w:pBdr/>
+        <w:spacing/>
+        <w:ind/>
+        <w:rPr/>
+      </w:pPr>
+      <w:r>
+        <w:t xml:space="preserve">Fire suppression</w:t>
+      </w:r>
+      <w:r/>
+    </w:p>
+    <w:p>
+      <w:pPr>
+        <w:pBdr/>
+        <w:spacing/>
+        <w:ind/>
+        <w:rPr/>
+      </w:pPr>
+      <w:r>
+        <w:t xml:space="preserve">The transition from frequent, smaller fires to the large, high-severity wildfires of today is not a natural evolution but the result of more than a century of fire suppression </w:t>
       </w:r>
       <w:r>
         <w:t xml:space="preserve">(</w:t>
       </w:r>
       <w:r>
-        <w:t xml:space="preserve">Stephens </w:t>
+        <w:t xml:space="preserve">Collins </w:t>
       </w:r>
       <w:r>
         <w:rPr>
@@ -1192,19 +1569,13 @@
         <w:t xml:space="preserve">et al.</w:t>
       </w:r>
       <w:r>
-        <w:t xml:space="preserve">, 2007</w:t>
-      </w:r>
-      <w:r>
-        <w:t xml:space="preserve">)</w:t>
-      </w:r>
-      <w:r>
-        <w:t xml:space="preserve">, trees were bigger and forest stands were more ‘park like’ </w:t>
-      </w:r>
-      <w:r>
-        <w:t xml:space="preserve">(</w:t>
-      </w:r>
-      <w:r>
-        <w:t xml:space="preserve">North </w:t>
+        <w:t xml:space="preserve">, 2017</w:t>
+      </w:r>
+      <w:r>
+        <w:t xml:space="preserve">; </w:t>
+      </w:r>
+      <w:r>
+        <w:t xml:space="preserve">Peery </w:t>
       </w:r>
       <w:r>
         <w:rPr>
@@ -1214,19 +1585,95 @@
         <w:t xml:space="preserve">et al.</w:t>
       </w:r>
       <w:r>
-        <w:t xml:space="preserve">, 2009</w:t>
+        <w:t xml:space="preserve">, 2019</w:t>
       </w:r>
       <w:r>
         <w:t xml:space="preserve">)</w:t>
       </w:r>
       <w:r>
-        <w:t xml:space="preserve">, and due to loss of moderate fires due to decades of fire suppression make current conditions in nearly all forests more vulnerable to drought and fire, particularly in a warming climate </w:t>
+        <w:t xml:space="preserve">. Historically, regular fire functioned as an active form of landscape management. It improved tree health by reducing competition, clearing </w:t>
+      </w:r>
+      <w:r>
+        <w:t xml:space="preserve">understory fuels, removing dead or weakened vegetation, and opening the forest canopy to sunlight. These processes reduced water stress, improved nutrient cycling, and supported the development of meadows and open patches that acted as natural fire breaks.</w:t>
+      </w:r>
+      <w:r/>
+    </w:p>
+    <w:p>
+      <w:pPr>
+        <w:pBdr/>
+        <w:spacing/>
+        <w:ind/>
+        <w:rPr/>
+      </w:pPr>
+      <w:r>
+        <w:t xml:space="preserve">Frequent fire also interacted with hydrology. By reducing excessive tree density, fire helped balance water demand with available moisture, supporting small</w:t>
+      </w:r>
+      <w:r>
+        <w:t xml:space="preserve">er, localized water cycles and maintaining soil and vegetation health. In these landscapes, most fires burned at lower intensity and often self-extinguished as they encountered patchy fuels and open areas. Large, stand-replacing fires were relatively rare.</w:t>
+      </w:r>
+      <w:r/>
+    </w:p>
+    <w:p>
+      <w:pPr>
+        <w:pBdr/>
+        <w:spacing/>
+        <w:ind/>
+        <w:rPr/>
+      </w:pPr>
+      <w:r>
+        <w:t xml:space="preserve">Fire suppression reversed these dynamics. Forests became denser and more uniform, fuels accumulated continuously</w:t>
+      </w:r>
+      <w:r>
+        <w:t xml:space="preserve"> across large areas, and the patchiness that once limited fire spread was lost. Under modern climate conditions, this produced fires that burn hotter, spread farther, and cause far greater ecological and social damage than the frequent fires they replaced.</w:t>
+      </w:r>
+      <w:r/>
+    </w:p>
+    <w:p>
+      <w:pPr>
+        <w:pBdr/>
+        <w:spacing/>
+        <w:ind/>
+        <w:rPr/>
+      </w:pPr>
+      <w:r>
+        <w:t xml:space="preserve">Restoring fire-</w:t>
+      </w:r>
+      <w:r>
+        <w:t xml:space="preserve">adapted landscapes, therefore, requires reintroducing fire as a management tool, alongside thinning and other treatments that help re-establish appropriate structure. In the near term, this process generates large volumes of forest residuals. Biomass utili</w:t>
+      </w:r>
+      <w:r>
+        <w:t xml:space="preserve">zation does not drive this work; rather, it emerges from it as a practical necessity. Over time, as landscapes regain balance and fire resumes its ecological role, the need for intensive intervention and large-scale biomass handling can and should decline.</w:t>
+      </w:r>
+      <w:r/>
+    </w:p>
+    <w:p>
+      <w:pPr>
+        <w:pStyle w:val="726"/>
+        <w:pBdr/>
+        <w:spacing/>
+        <w:ind/>
+        <w:rPr/>
+      </w:pPr>
+      <w:r>
+        <w:t xml:space="preserve">Biodiversity</w:t>
+      </w:r>
+      <w:r/>
+    </w:p>
+    <w:p>
+      <w:pPr>
+        <w:pBdr/>
+        <w:spacing/>
+        <w:ind/>
+        <w:rPr/>
+      </w:pPr>
+      <w:r>
+        <w:t xml:space="preserve">It is well known that indigenous burning, as part of historic fire regimes, enhanced biodiversity </w:t>
       </w:r>
       <w:r>
         <w:t xml:space="preserve">(</w:t>
       </w:r>
       <w:r>
-        <w:t xml:space="preserve">Hagmann </w:t>
+        <w:t xml:space="preserve">Hoffman </w:t>
       </w:r>
       <w:r>
         <w:rPr>
@@ -1242,13 +1689,13 @@
         <w:t xml:space="preserve">)</w:t>
       </w:r>
       <w:r>
-        <w:t xml:space="preserve">. Current needs assessments indicate more than 11.2 million forested acres require treatment to reduce future wildfire risk and severity </w:t>
+        <w:t xml:space="preserve">. Additional evidence indicates that a combination of thinning and prescribed fire significantly increases plant diversity in mixed or dry conifer forests </w:t>
       </w:r>
       <w:r>
         <w:t xml:space="preserve">(</w:t>
       </w:r>
       <w:r>
-        <w:t xml:space="preserve">Delyser </w:t>
+        <w:t xml:space="preserve">Dodson </w:t>
       </w:r>
       <w:r>
         <w:rPr>
@@ -1258,247 +1705,28 @@
         <w:t xml:space="preserve">et al.</w:t>
       </w:r>
       <w:r>
-        <w:t xml:space="preserve">, 2025</w:t>
+        <w:t xml:space="preserve">, 2008</w:t>
       </w:r>
       <w:r>
         <w:t xml:space="preserve">)</w:t>
       </w:r>
       <w:r>
-        <w:t xml:space="preserve">. The same study shows that rapid initial treatments can restore resilience before climate change intensifies wildfires.</w:t>
-      </w:r>
-      <w:r/>
-    </w:p>
-    <w:p>
-      <w:pPr>
-        <w:pBdr/>
-        <w:spacing/>
-        <w:ind/>
-        <w:rPr/>
-      </w:pPr>
-      <w:r>
-        <w:t xml:space="preserve">More importantly, recent fires in mixed conifer woodlands, such as the Dixie Caldor Fires in 2021, showed that thinning and prescribed fire reduced the probability of stand-replacing wildfire and fire severity</w:t>
+        <w:t xml:space="preserve">. However, California is very diverse, and what works in one ecosystem may</w:t>
+      </w:r>
+      <w:r>
+        <w:t xml:space="preserve"> not work in others, especially in chaparral or mesic systems, where burn frequency is generally too high and thinning or prescribed fire are not applicable treatments. However, in fire-adapted systems, biodiversity is inextricably linked to pyrodiversity </w:t>
       </w:r>
       <w:r>
         <w:t xml:space="preserve">(</w:t>
       </w:r>
       <w:r>
-        <w:t xml:space="preserve">Shive </w:t>
-      </w:r>
-      <w:r>
-        <w:rPr>
-          <w:i/>
-          <w:iCs/>
-        </w:rPr>
-        <w:t xml:space="preserve">et al.</w:t>
-      </w:r>
-      <w:r>
-        <w:t xml:space="preserve">, 2024</w:t>
-      </w:r>
-      <w:r>
-        <w:t xml:space="preserve">; </w:t>
-      </w:r>
-      <w:r>
-        <w:t xml:space="preserve">Baldassare, 2024</w:t>
+        <w:t xml:space="preserve">Fernando &amp; McCarthy, 2025</w:t>
       </w:r>
       <w:r>
         <w:t xml:space="preserve">)</w:t>
       </w:r>
       <w:r>
-        <w:t xml:space="preserve">. In fact, the Caldor Fire was deflected by a prescribed burn at Caples Lake the previous year, reducing the risk to surrounding forests and communities </w:t>
-      </w:r>
-      <w:r>
-        <w:t xml:space="preserve">(</w:t>
-      </w:r>
-      <w:r>
-        <w:t xml:space="preserve">Eagleston </w:t>
-      </w:r>
-      <w:r>
-        <w:rPr>
-          <w:i/>
-          <w:iCs/>
-        </w:rPr>
-        <w:t xml:space="preserve">et al.</w:t>
-      </w:r>
-      <w:r>
-        <w:t xml:space="preserve">, 2025</w:t>
-      </w:r>
-      <w:r>
-        <w:t xml:space="preserve">; </w:t>
-      </w:r>
-      <w:r>
-        <w:t xml:space="preserve">Safford &amp; Saberi, 2026</w:t>
-      </w:r>
-      <w:r>
-        <w:t xml:space="preserve">)</w:t>
-      </w:r>
-      <w:r>
         <w:t xml:space="preserve">.</w:t>
-      </w:r>
-      <w:r/>
-    </w:p>
-    <w:p>
-      <w:pPr>
-        <w:pStyle w:val="738"/>
-        <w:pBdr/>
-        <w:spacing/>
-        <w:ind/>
-        <w:rPr/>
-      </w:pPr>
-      <w:r>
-        <w:t xml:space="preserve">Fire suppression</w:t>
-      </w:r>
-      <w:r/>
-    </w:p>
-    <w:p>
-      <w:pPr>
-        <w:pBdr/>
-        <w:spacing/>
-        <w:ind/>
-        <w:rPr/>
-      </w:pPr>
-      <w:r>
-        <w:t xml:space="preserve">Quite possibly the biggest miss of the Calmatter’s article is not acknowledging the degree of ecological departure from ‘natural’ conditions due to a century of wildfire suppression </w:t>
-      </w:r>
-      <w:r>
-        <w:t xml:space="preserve">(</w:t>
-      </w:r>
-      <w:r>
-        <w:t xml:space="preserve">Collins </w:t>
-      </w:r>
-      <w:r>
-        <w:rPr>
-          <w:i/>
-          <w:iCs/>
-        </w:rPr>
-        <w:t xml:space="preserve">et al.</w:t>
-      </w:r>
-      <w:r>
-        <w:t xml:space="preserve">, 2017</w:t>
-      </w:r>
-      <w:r>
-        <w:t xml:space="preserve">; </w:t>
-      </w:r>
-      <w:r>
-        <w:t xml:space="preserve">Peery </w:t>
-      </w:r>
-      <w:r>
-        <w:rPr>
-          <w:i/>
-          <w:iCs/>
-        </w:rPr>
-        <w:t xml:space="preserve">et al.</w:t>
-      </w:r>
-      <w:r>
-        <w:t xml:space="preserve">, 2019</w:t>
-      </w:r>
-      <w:r>
-        <w:t xml:space="preserve">)</w:t>
-      </w:r>
-      <w:r>
-        <w:t xml:space="preserve">. This human-induced forest condition has led to increasingly large, more frequent fires that destroy ecosystems and communities alike. </w:t>
-      </w:r>
-      <w:r>
-        <w:t xml:space="preserve">Prichard </w:t>
-      </w:r>
-      <w:r>
-        <w:rPr>
-          <w:i/>
-          <w:iCs/>
-        </w:rPr>
-        <w:t xml:space="preserve">et al.</w:t>
-      </w:r>
-      <w:r>
-        <w:t xml:space="preserve"> (2021)</w:t>
-      </w:r>
-      <w:r>
-        <w:t xml:space="preserve"> found that the effects of fire exclusion are not overstated, and that intentional management that adapts to current for</w:t>
-      </w:r>
-      <w:r>
-        <w:t xml:space="preserve">est conditions is needed. Utilizing biomass from projects intended to return forest stands to natural fire regimes will be needed in the short term until prescribed fire or fires allowed to burn can allow the forest to catch up to pre-Columbian conditions.</w:t>
-      </w:r>
-      <w:r/>
-    </w:p>
-    <w:p>
-      <w:pPr>
-        <w:pStyle w:val="738"/>
-        <w:pBdr/>
-        <w:spacing/>
-        <w:ind/>
-        <w:rPr/>
-      </w:pPr>
-      <w:r>
-        <w:t xml:space="preserve">Biodiversity</w:t>
-      </w:r>
-      <w:r/>
-    </w:p>
-    <w:p>
-      <w:pPr>
-        <w:pBdr/>
-        <w:spacing/>
-        <w:ind/>
-        <w:rPr/>
-      </w:pPr>
-      <w:r>
-        <w:t xml:space="preserve">Curiously, despite the author’s organizational mission, biodiversity wasn’t mentioned at all in the opinion piece. For instance, it is well known that the indigenous burning as a part of historic fire regimes enhanced biodiversity </w:t>
-      </w:r>
-      <w:r>
-        <w:t xml:space="preserve">(</w:t>
-      </w:r>
-      <w:r>
-        <w:t xml:space="preserve">Hoffman </w:t>
-      </w:r>
-      <w:r>
-        <w:rPr>
-          <w:i/>
-          <w:iCs/>
-        </w:rPr>
-        <w:t xml:space="preserve">et al.</w:t>
-      </w:r>
-      <w:r>
-        <w:t xml:space="preserve">, 2021</w:t>
-      </w:r>
-      <w:r>
-        <w:t xml:space="preserve">)</w:t>
-      </w:r>
-      <w:r>
-        <w:t xml:space="preserve">. Measuring the impact of thinning, prescribed fire, and other forest health projects should be a feature of any publicly funded projects.</w:t>
-      </w:r>
-      <w:r/>
-    </w:p>
-    <w:p>
-      <w:pPr>
-        <w:pBdr/>
-        <w:spacing/>
-        <w:ind/>
-        <w:rPr/>
-      </w:pPr>
-      <w:r>
-        <w:t xml:space="preserve">The science advisory panel of the Wildfire Task Force has done a superb job ensuring biodiversity and listed species data are available for all regions in the state, but more can be </w:t>
-      </w:r>
-      <w:r>
-        <w:t xml:space="preserve">done to measure project impacts on vulnerable or threatened species and overall impacts on species over time. There is some evidence that a combination of thinning and prescribed fire significantly increases plant diversity in mixed or dry conifer forests </w:t>
-      </w:r>
-      <w:r>
-        <w:t xml:space="preserve">(</w:t>
-      </w:r>
-      <w:r>
-        <w:t xml:space="preserve">Dodson </w:t>
-      </w:r>
-      <w:r>
-        <w:rPr>
-          <w:i/>
-          <w:iCs/>
-        </w:rPr>
-        <w:t xml:space="preserve">et al.</w:t>
-      </w:r>
-      <w:r>
-        <w:t xml:space="preserve">, 2008</w:t>
-      </w:r>
-      <w:r>
-        <w:t xml:space="preserve">)</w:t>
-      </w:r>
-      <w:r>
-        <w:t xml:space="preserve">. However, California is very diverse, and what works in one ecosystem may not work in others, especially in chaparral or mesic systems, where burn frequency is generally too high and thinning or prescribed fire are not applicable treatments.</w:t>
       </w:r>
       <w:r/>
     </w:p>
@@ -1515,9 +1743,9 @@
           <mc:Choice Requires="wpg">
             <w:drawing>
               <wp:inline xmlns:wp="http://schemas.openxmlformats.org/drawingml/2006/wordprocessingDrawing" distT="0" distB="0" distL="0" distR="0">
-                <wp:extent cx="1785938" cy="1251385"/>
+                <wp:extent cx="2857500" cy="2002216"/>
                 <wp:effectExtent l="0" t="0" r="0" b="0"/>
-                <wp:docPr id="3" name="" descr="" title=""/>
+                <wp:docPr id="4" name="" descr="" title=""/>
                 <wp:cNvGraphicFramePr>
                   <a:graphicFrameLocks xmlns:a="http://schemas.openxmlformats.org/drawingml/2006/main" noChangeAspect="1"/>
                 </wp:cNvGraphicFramePr>
@@ -1532,13 +1760,13 @@
                         <pic:nvPr/>
                       </pic:nvPicPr>
                       <pic:blipFill rotWithShape="1">
-                        <a:blip r:embed="rId14"/>
+                        <a:blip r:embed="rId13"/>
                         <a:stretch/>
                       </pic:blipFill>
                       <pic:spPr bwMode="auto">
                         <a:xfrm>
                           <a:off x="0" y="0"/>
-                          <a:ext cx="1785938" cy="1251385"/>
+                          <a:ext cx="2857500" cy="2002216"/>
                         </a:xfrm>
                         <a:prstGeom prst="rect">
                           <a:avLst/>
@@ -1571,8 +1799,8 @@
                 <v:path o:extrusionok="f" gradientshapeok="t" o:connecttype="rect"/>
                 <o:lock v:ext="edit" aspectratio="t"/>
               </v:shapetype>
-              <v:shape id="_x0000_i2" o:spid="_x0000_s2" type="#_x0000_t75" style="width:140.63pt;height:98.53pt;mso-wrap-distance-left:0.00pt;mso-wrap-distance-top:0.00pt;mso-wrap-distance-right:0.00pt;mso-wrap-distance-bottom:0.00pt;z-index:1;" stroked="false">
-                <v:imagedata r:id="rId14" o:title=""/>
+              <v:shape id="_x0000_i3" o:spid="_x0000_s3" type="#_x0000_t75" style="width:225.00pt;height:157.65pt;mso-wrap-distance-left:0.00pt;mso-wrap-distance-top:0.00pt;mso-wrap-distance-right:0.00pt;mso-wrap-distance-bottom:0.00pt;z-index:1;" stroked="false">
+                <v:imagedata r:id="rId13" o:title=""/>
                 <o:lock v:ext="edit" rotation="t"/>
               </v:shape>
             </w:pict>
@@ -1583,7 +1811,7 @@
     </w:p>
     <w:p>
       <w:pPr>
-        <w:pStyle w:val="737"/>
+        <w:pStyle w:val="725"/>
         <w:pBdr/>
         <w:spacing/>
         <w:ind/>
@@ -1602,47 +1830,37 @@
         <w:rPr/>
       </w:pPr>
       <w:r>
-        <w:t xml:space="preserve">Ms. Wolf did get two things</w:t>
-      </w:r>
-      <w:r>
-        <w:t xml:space="preserve"> right in her op-ed: prioritize thinning in the wildland urban interface and limit development in fire-prone areas. These solutions, however, fail to address the current problem of excessive biomass in forests, resulting from a century of fire suppression.</w:t>
+        <w:t xml:space="preserve">Moving forward, several integrated pathways can support the transition from biomass as an energy ideology to a practical response to an unavoidable byproduct of critical forest restoration efforts:</w:t>
       </w:r>
       <w:r/>
     </w:p>
     <w:p>
       <w:pPr>
-        <w:pStyle w:val="758"/>
+        <w:pStyle w:val="735"/>
+        <w:numPr>
+          <w:ilvl w:val="0"/>
+          <w:numId w:val="4"/>
+        </w:numPr>
         <w:pBdr/>
         <w:spacing/>
         <w:ind/>
         <w:rPr/>
       </w:pPr>
       <w:r>
-        <w:t xml:space="preserve">“The choice is not between profit and responsibility. It is between managed transition and unmanaged failure.” </w:t>
-      </w:r>
-      <w:r>
-        <w:t xml:space="preserve">Harrison (2025)</w:t>
-      </w:r>
-      <w:r/>
-    </w:p>
-    <w:p>
-      <w:pPr>
-        <w:pBdr/>
-        <w:spacing/>
-        <w:ind/>
-        <w:rPr/>
-      </w:pPr>
-      <w:r>
-        <w:t xml:space="preserve">Removing many small-diameter trees followed by prescribed fire will not only reduce wildfire risk in priority areas (note Cald</w:t>
-      </w:r>
-      <w:r>
-        <w:t xml:space="preserve">or fire burn deflected by Caples Lake prescribed fire), but it will reduce excessive competition, causing chronic stress across forest stands, reducing disease, insect invasions, allowing large trees to grow larger, and making forest stands more resilient </w:t>
+        <w:rPr>
+          <w:b/>
+          <w:bCs/>
+        </w:rPr>
+        <w:t xml:space="preserve">Climate adaptation and biomass integration</w:t>
+      </w:r>
+      <w:r>
+        <w:t xml:space="preserve">. Rapid scaling of forest health treatments, including thinning and prescribed fire, is critical to maintaining forest resilience in a warming climate </w:t>
       </w:r>
       <w:r>
         <w:t xml:space="preserve">(</w:t>
       </w:r>
       <w:r>
-        <w:t xml:space="preserve">North </w:t>
+        <w:t xml:space="preserve">Delyser </w:t>
       </w:r>
       <w:r>
         <w:rPr>
@@ -1652,19 +1870,19 @@
         <w:t xml:space="preserve">et al.</w:t>
       </w:r>
       <w:r>
-        <w:t xml:space="preserve">, 2022</w:t>
+        <w:t xml:space="preserve">, 2025</w:t>
       </w:r>
       <w:r>
         <w:t xml:space="preserve">)</w:t>
       </w:r>
       <w:r>
-        <w:t xml:space="preserve">. Either/or solutions are not needed; both/and, integrated solutions with all hands on deck to mitigate wildfire threats to forests and communities. Some of these include</w:t>
+        <w:t xml:space="preserve">. Policies that align forest treatments, biomass utilization, climate goals, and greenhouse gas reduction can reduce wildfire risk while ensuring that utilization infrastructure supports, rather than distorts, restoration outcomes.</w:t>
       </w:r>
       <w:r/>
     </w:p>
     <w:p>
       <w:pPr>
-        <w:pStyle w:val="747"/>
+        <w:pStyle w:val="735"/>
         <w:numPr>
           <w:ilvl w:val="0"/>
           <w:numId w:val="4"/>
@@ -1679,16 +1897,188 @@
           <w:b/>
           <w:bCs/>
         </w:rPr>
-        <w:t xml:space="preserve">Climate change and biomass</w:t>
-      </w:r>
-      <w:r>
-        <w:t xml:space="preserve">. It is clear that rapid scaling of forest health treatments, including thinning and prescribed fire, is critical to resilient forests in the face of climate change </w:t>
+        <w:t xml:space="preserve">Mobile &amp; modular processing technologies</w:t>
+      </w:r>
+      <w:r>
+        <w:t xml:space="preserve">. Biomass infrastructure should be flexible and place-based, reflecting the temporary nature of excess fuels created by past fire </w:t>
+      </w:r>
+      <w:r>
+        <w:t xml:space="preserve">suppression. Avoiding permanent, oversized facilities reduces the risk of creating demand disconnected from ecological need. Modular and mobile systems can prioritize local utilization, reduce transport emissions, and adapt over time as landscapes recover.</w:t>
+      </w:r>
+      <w:r/>
+    </w:p>
+    <w:p>
+      <w:pPr>
+        <w:pStyle w:val="735"/>
+        <w:numPr>
+          <w:ilvl w:val="0"/>
+          <w:numId w:val="4"/>
+        </w:numPr>
+        <w:pBdr/>
+        <w:spacing/>
+        <w:ind/>
+        <w:rPr/>
+      </w:pPr>
+      <w:r>
+        <w:rPr>
+          <w:b/>
+          <w:bCs/>
+        </w:rPr>
+        <w:t xml:space="preserve">Proactive disaster insurance and risk pricing</w:t>
+      </w:r>
+      <w:r>
+        <w:t xml:space="preserve">. Repeated large-scale wildfires threaten to make entire regions uninsurable and, eventually, uninhabitable. Aligning insurance markets with forest treatment incentives can reduce losses, stabilize premiums, and lower long-term public costs </w:t>
       </w:r>
       <w:r>
         <w:t xml:space="preserve">(</w:t>
       </w:r>
       <w:r>
-        <w:t xml:space="preserve">Delyser </w:t>
+        <w:t xml:space="preserve">Harrison, 2025</w:t>
+      </w:r>
+      <w:r>
+        <w:t xml:space="preserve">)</w:t>
+      </w:r>
+      <w:r>
+        <w:t xml:space="preserve">. Disaster response should not form the basis of a growth economy. Instead, policy and market mechanisms can reward risk reduction and penalize continued inaction.</w:t>
+      </w:r>
+      <w:r/>
+    </w:p>
+    <w:p>
+      <w:pPr>
+        <w:pStyle w:val="735"/>
+        <w:numPr>
+          <w:ilvl w:val="0"/>
+          <w:numId w:val="4"/>
+        </w:numPr>
+        <w:pBdr/>
+        <w:spacing/>
+        <w:ind/>
+        <w:rPr/>
+      </w:pPr>
+      <w:r>
+        <w:rPr>
+          <w:b/>
+          <w:bCs/>
+        </w:rPr>
+        <w:t xml:space="preserve">Jobs in the woods and community resilience</w:t>
+      </w:r>
+      <w:r>
+        <w:t xml:space="preserve">. Forest restoration and biomass utilization can create meaningful, long-term employment in rural and fire-p</w:t>
+      </w:r>
+      <w:r>
+        <w:t xml:space="preserve">rone communities that have experienced decades of economic decline and capacity loss. Investing in local stewardship workforces supports both ecological restoration and social resilience, while helping to reverse patterns of outmigration and disinvestment.</w:t>
+      </w:r>
+      <w:r/>
+    </w:p>
+    <w:p>
+      <w:pPr>
+        <w:pStyle w:val="735"/>
+        <w:numPr>
+          <w:ilvl w:val="0"/>
+          <w:numId w:val="4"/>
+        </w:numPr>
+        <w:pBdr/>
+        <w:spacing/>
+        <w:ind/>
+        <w:rPr/>
+      </w:pPr>
+      <w:r>
+        <w:rPr>
+          <w:b/>
+          <w:bCs/>
+        </w:rPr>
+        <w:t xml:space="preserve">Biodiversity as a guiding constraint</w:t>
+      </w:r>
+      <w:r>
+        <w:t xml:space="preserve">. Biodiversity i</w:t>
+      </w:r>
+      <w:r>
+        <w:t xml:space="preserve">s not an argument for or against biomass utilization, but it must remain a central constraint on how forest health treatments are designed and implemented. Ecological forestry that creates gaps, clumps, and heterogeneity supports habitat diversity, while i</w:t>
+      </w:r>
+      <w:r>
+        <w:t xml:space="preserve">ndiscriminate thinning or the removal of all snags can undermine ecological goals. Restoration strategies must remain ecosystem-specific and adaptive, recognizing that approaches suitable for dry conifer forests may not apply in chaparral or mesic systems.</w:t>
+      </w:r>
+      <w:r/>
+    </w:p>
+    <w:p>
+      <w:pPr>
+        <w:pStyle w:val="725"/>
+        <w:pBdr/>
+        <w:spacing/>
+        <w:ind/>
+        <w:rPr/>
+      </w:pPr>
+      <w:r>
+        <w:t xml:space="preserve">Conclusion</w:t>
+      </w:r>
+      <w:r/>
+    </w:p>
+    <w:p>
+      <w:pPr>
+        <w:pBdr/>
+        <w:spacing/>
+        <w:ind/>
+        <w:rPr/>
+      </w:pPr>
+      <w:r>
+        <w:t xml:space="preserve">Taken together, these pathways point toward a future in which California’s forests are once again shaped by frequent, beneficial fire rather than catastrophic megafires. Biomass utilization plays a supporting role in this transitio</w:t>
+      </w:r>
+      <w:r>
+        <w:t xml:space="preserve">n, helping to manage the legacy of fire suppression while landscapes are brought back into balance. The long-term goal is not perpetual intervention, but the restoration of living systems capable of sustaining themselves through wise, adaptive stewardship.</w:t>
+      </w:r>
+      <w:r/>
+    </w:p>
+    <w:p>
+      <w:pPr>
+        <w:pBdr/>
+        <w:spacing/>
+        <w:ind/>
+        <w:rPr/>
+      </w:pPr>
+      <w:r>
+        <w:t xml:space="preserve">California’s wildfire crisis is not the result of to</w:t>
+      </w:r>
+      <w:r>
+        <w:t xml:space="preserve">o much intervention, but of too little, applied too late, across landscapes that evolved to burn regularly. A century of fire suppression has pushed forests far beyond their ecological carrying capacity, producing dense, fuel-loaded systems that are increa</w:t>
+      </w:r>
+      <w:r>
+        <w:t xml:space="preserve">singly vulnerable to drought, disease, and high-severity fire. Addressing this reality requires moving beyond narrow debates about individual tools and toward a whole-systems approach grounded in fire ecology, climate adaptation, and long-term stewardship.</w:t>
+      </w:r>
+      <w:r/>
+    </w:p>
+    <w:p>
+      <w:pPr>
+        <w:pBdr/>
+        <w:spacing/>
+        <w:ind/>
+        <w:rPr/>
+      </w:pPr>
+      <w:r>
+        <w:t xml:space="preserve">The choice facing California is not between profit and responsibility, but between managed transition and unmanaged failure </w:t>
+      </w:r>
+      <w:r>
+        <w:t xml:space="preserve">(</w:t>
+      </w:r>
+      <w:r>
+        <w:t xml:space="preserve">Harrison, 2025</w:t>
+      </w:r>
+      <w:r>
+        <w:t xml:space="preserve">)</w:t>
+      </w:r>
+      <w:r>
+        <w:t xml:space="preserve">. Restoring fire-adapted forests means reintroducing frequent, low-intensity fire and r</w:t>
+      </w:r>
+      <w:r>
+        <w:t xml:space="preserve">ebuilding structural diversity at scale. In the near term, this inevitably requires thinning and other treatments that reduce competition, improve tree health, and lower fire severity. These actions, when followed by prescribed fire, have been shown to red</w:t>
+      </w:r>
+      <w:r>
+        <w:t xml:space="preserve">uce wildfire risk, limit stand-replacing fire, and increase forest resilience under extreme conditions, as demonstrated in recent fires such as the Caldor Fire, where prior prescribed burning helped deflect fire behavior and protect surrounding landscapes </w:t>
+      </w:r>
+      <w:r>
+        <w:t xml:space="preserve">(</w:t>
+      </w:r>
+      <w:r>
+        <w:t xml:space="preserve">North </w:t>
       </w:r>
       <w:r>
         <w:rPr>
@@ -1698,139 +2088,34 @@
         <w:t xml:space="preserve">et al.</w:t>
       </w:r>
       <w:r>
-        <w:t xml:space="preserve">, 2025</w:t>
+        <w:t xml:space="preserve">, 2022</w:t>
       </w:r>
       <w:r>
         <w:t xml:space="preserve">)</w:t>
       </w:r>
       <w:r>
-        <w:t xml:space="preserve">. Creating policies that integrate treatments and biomass utilization with climate goals and greenhouse gas reduction enables wildfire risk mitigation and incorporates utilization infrastructure regulations into the same solutions.</w:t>
+        <w:t xml:space="preserve">.</w:t>
       </w:r>
       <w:r/>
     </w:p>
     <w:p>
       <w:pPr>
-        <w:pStyle w:val="747"/>
-        <w:numPr>
-          <w:ilvl w:val="0"/>
-          <w:numId w:val="4"/>
-        </w:numPr>
         <w:pBdr/>
         <w:spacing/>
         <w:ind/>
         <w:rPr/>
       </w:pPr>
       <w:r>
-        <w:rPr>
-          <w:b/>
-          <w:bCs/>
-        </w:rPr>
-        <w:t xml:space="preserve">Mobile modular technology</w:t>
-      </w:r>
-      <w:r>
-        <w:t xml:space="preserve">. Processing biomass is a temporary solution to the buildup of biomass over a century of fire suppression. Creating biomass infrastructure should not create a</w:t>
-      </w:r>
-      <w:r>
-        <w:t xml:space="preserve"> feed-the-beast situation, as has happened in the Southeast US or parts of Europe. Rather, processing biomass in areas of need may be needed over time, not only to prioritize local utilization, but also to support the transport of biomass and its products.</w:t>
+        <w:t xml:space="preserve">Crucially, this restoration work produces large volumes of forest residuals. Biomass utilization does not justify forest intervention, nor does it replace </w:t>
+      </w:r>
+      <w:r>
+        <w:t xml:space="preserve">the long-term role of fire. It functions as a transitional tool that helps manage the material consequences of restoring fire-adapted systems while forests move back toward conditions where cultural burning and good fire can once again do most of the work.</w:t>
       </w:r>
       <w:r/>
     </w:p>
     <w:p>
       <w:pPr>
-        <w:pStyle w:val="747"/>
-        <w:numPr>
-          <w:ilvl w:val="0"/>
-          <w:numId w:val="4"/>
-        </w:numPr>
-        <w:pBdr/>
-        <w:spacing/>
-        <w:ind/>
-        <w:rPr/>
-      </w:pPr>
-      <w:r>
-        <w:rPr>
-          <w:b/>
-          <w:bCs/>
-        </w:rPr>
-        <w:t xml:space="preserve">Pro-active disaster insurance</w:t>
-      </w:r>
-      <w:r>
-        <w:t xml:space="preserve">. It is clear that r</w:t>
-      </w:r>
-      <w:r>
-        <w:t xml:space="preserve">epeated large-scale wildfires will make California and other regions of the world uninsurable and possibly uninhabitable. Creating economic incentives to treat prevention will reduce losses, stabilize premium costs, and lower overall impacts to the public </w:t>
-      </w:r>
-      <w:r>
-        <w:t xml:space="preserve">(</w:t>
-      </w:r>
-      <w:r>
-        <w:t xml:space="preserve">Harrison, 2025</w:t>
-      </w:r>
-      <w:r>
-        <w:t xml:space="preserve">)</w:t>
-      </w:r>
-      <w:r>
-        <w:t xml:space="preserve">. Disaster should not form the basis of a growth economy; policy and market incentives can provide carrot-and-stick approaches to ensure change at the scale that climate and resulting wildfires pose.</w:t>
-      </w:r>
-      <w:r/>
-    </w:p>
-    <w:p>
-      <w:pPr>
-        <w:pStyle w:val="747"/>
-        <w:numPr>
-          <w:ilvl w:val="0"/>
-          <w:numId w:val="4"/>
-        </w:numPr>
-        <w:pBdr/>
-        <w:spacing/>
-        <w:ind/>
-        <w:rPr/>
-      </w:pPr>
-      <w:r>
-        <w:rPr>
-          <w:b/>
-          <w:bCs/>
-        </w:rPr>
-        <w:t xml:space="preserve">Jobs in the woods</w:t>
-      </w:r>
-      <w:r>
-        <w:t xml:space="preserve">. Biomass production and processing can create valuable jobs in the woods in rural, often disadvantaged communities that are threatened by wildfir</w:t>
-      </w:r>
-      <w:r>
-        <w:t xml:space="preserve">e and also experiencing a constant state of brain drain and loss of capacity due to residents leaving to look for jobs elsewhere (when jobs don’t exist in their communities). Creating whole system stewards could be a component of this job creation process.</w:t>
-      </w:r>
-      <w:r/>
-    </w:p>
-    <w:p>
-      <w:pPr>
-        <w:pStyle w:val="747"/>
-        <w:numPr>
-          <w:ilvl w:val="0"/>
-          <w:numId w:val="4"/>
-        </w:numPr>
-        <w:pBdr/>
-        <w:spacing/>
-        <w:ind/>
-        <w:rPr/>
-      </w:pPr>
-      <w:r>
-        <w:rPr>
-          <w:b/>
-          <w:bCs/>
-        </w:rPr>
-        <w:t xml:space="preserve">Biodiversity</w:t>
-      </w:r>
-      <w:r>
-        <w:t xml:space="preserve">. Biodiversity isn’t a solution to biomass utilization, per se, but it should be included in every conversation about forest health, e.g., what is the impact on biodiversity of thinning, prescribed fire, and biomass utilization? Removing all snags from t</w:t>
-      </w:r>
-      <w:r>
-        <w:t xml:space="preserve">he forest to reduce fire risk will negatively impact biodiversity. Indiscriminate thinning, instead of creating gaps and clumps, and ecological-based forest management will reduce biodiversity and may not even work to create resilient forest health stands.</w:t>
-      </w:r>
-      <w:r/>
-    </w:p>
-    <w:p>
-      <w:pPr>
-        <w:pStyle w:val="737"/>
+        <w:pStyle w:val="725"/>
         <w:pBdr/>
         <w:spacing/>
         <w:ind/>
@@ -1858,10 +2143,10 @@
       <w:r>
         <w:t xml:space="preserve"> has nearly 40 years of experience working in forest science &amp; management, rewilding, biodiversity conservation, agricultural landscapes, restoration, and natural resources management. He is the owner of </w:t>
       </w:r>
-      <w:hyperlink r:id="rId15" w:tooltip="http://3point.xyz" w:history="1">
+      <w:hyperlink r:id="rId14" w:tooltip="http://3point.xyz" w:history="1">
         <w:r>
           <w:rPr>
-            <w:rStyle w:val="748"/>
+            <w:rStyle w:val="736"/>
             <w:b/>
             <w:bCs/>
           </w:rPr>
@@ -1912,7 +2197,7 @@
     </w:p>
     <w:p>
       <w:pPr>
-        <w:pStyle w:val="737"/>
+        <w:pStyle w:val="725"/>
         <w:pBdr/>
         <w:spacing/>
         <w:ind/>
@@ -2001,10 +2286,7 @@
         <w:rPr/>
       </w:pPr>
       <w:r>
-        <w:t xml:space="preserve">Dodson, E. K., Peterson, D. W., &amp; Harrod, R. J. (2008). Understory vegetation response to thinning and burning restoration treatments in dry conifer forests of the eastern Cascades, USA. Forest Ecology and Management, 255(8–9), 3130–3140. 10.1016/j.foreco.2</w:t>
-      </w:r>
-      <w:r>
-        <w:t xml:space="preserve">008.01.026.</w:t>
+        <w:t xml:space="preserve">Dias, M. (2025). HCalifornia is drowning in hazardous forest waste with nowhere to put it. https://calmatters.org/commentary/reader-reactions/2025/12/hazardous-forest-waste-wildfire-california.</w:t>
       </w:r>
       <w:r/>
     </w:p>
@@ -2017,10 +2299,10 @@
         <w:rPr/>
       </w:pPr>
       <w:r>
-        <w:t xml:space="preserve">Eagleston, H., Bester, M., Yusuf, J., Damodaran, A., &amp; Reno, M. J. (2025). Systemic Drivers of Electric-Grid-Caused Catastrophic Wildfires: Implications for Resilience in the United States. Challenges, 16(1).Elias, M., Yackulic, E., Duffy, K., Saksa, P., Sa</w:t>
-      </w:r>
-      <w:r>
-        <w:t xml:space="preserve">nchez, D. L., Pevzner, N., Plumb, S., Dyszynski, J., &amp; Bracer, C. (2025). Carbon finance for forest resilience in California. Frontiers in Forests and Global Change, 7, 1507554. 10.3389/ffgc.2024.1507554.</w:t>
+        <w:t xml:space="preserve">Dodson, E. K., Peterson, D. W., &amp; Harrod, R. J. (2008). Understory vegetation response to thinning and burning restoration treatments in dry conifer forests of the eastern Cascades, USA. Forest Ecology and Management, 255(8–9), 3130–3140. 10.1016/j.foreco.2</w:t>
+      </w:r>
+      <w:r>
+        <w:t xml:space="preserve">008.01.026.</w:t>
       </w:r>
       <w:r/>
     </w:p>
@@ -2033,10 +2315,7 @@
         <w:rPr/>
       </w:pPr>
       <w:r>
-        <w:t xml:space="preserve">Hagmann, R. K., Hessburg, P. F., Prichard, S. J., Povak, N. A., Brown, P. M., Fulé, P. Z., Keane, R. E., Knapp, E. E., Lydersen, J. M., Metlen, K. L., Reilly, M. J., Sánchez Meador, A. J., Stephens, S. L., Stevens, J. T., Taylor, A. H., Yocom, L. L., Battag</w:t>
-      </w:r>
-      <w:r>
-        <w:t xml:space="preserve">lia, M. A., Churchill, D. J., Daniels, L. D., … Waltz, A. E. M. (2021). Evidence for widespread changes in the structure, composition, and fire regimes of western North American forests. Ecological Applications, 31(8). 10.1002/eap.2431.</w:t>
+        <w:t xml:space="preserve">Elias, M., Yackulic, E., Duffy, K., Saksa, P., Sanchez, D. L., Pevzner, N., Plumb, S., Dyszynski, J., &amp; Bracer, C. (2025). Carbon finance for forest resilience in California. Frontiers in Forests and Global Change, 7, 1507554. 10.3389/ffgc.2024.1507554.</w:t>
       </w:r>
       <w:r/>
     </w:p>
@@ -2049,7 +2328,7 @@
         <w:rPr/>
       </w:pPr>
       <w:r>
-        <w:t xml:space="preserve">Harrison, J. (2025). Avoiding an uninsurable future. Medium. https://medium.com/@joshuaharrison_97833/avoiding-an-uninsurable-future-78d525e8ded6.</w:t>
+        <w:t xml:space="preserve">Fernando, A. E., &amp; McCarthy, M. A. (2025). The relationship between pyrodiversity and biodiversity. Ecological Modelling, 510. 10.1016/j.ecolmodel.2025.111294.</w:t>
       </w:r>
       <w:r/>
     </w:p>
@@ -2062,10 +2341,7 @@
         <w:rPr/>
       </w:pPr>
       <w:r>
-        <w:t xml:space="preserve">Hoffman, K. M., Davis, E. L., Wickham, S. B., Schang, K., Johnson, A., Larking, T., Lauriault, P. N., Quynh Le, N., Swerdfager, E., &amp; Trant, A. J. (2021). Conservation of Earth’s biodiversity is embedded in Indigenous fire stewardship. Proceedings of the Na</w:t>
-      </w:r>
-      <w:r>
-        <w:t xml:space="preserve">tional Academy of Sciences, 118(32). 10.1073/pnas.2105073118.</w:t>
+        <w:t xml:space="preserve">Frisch, S., &amp; Uden, S. (2022). How forest thinning waste could fund California wildfire prevention. https://calmatters.org/commentary/2022/11/wildfire-prevention-biomass-climate-forest.</w:t>
       </w:r>
       <w:r/>
     </w:p>
@@ -2078,7 +2354,7 @@
         <w:rPr/>
       </w:pPr>
       <w:r>
-        <w:t xml:space="preserve">Holland, T., Evans, S., Long, J., Maxwell, C., Scheller, R., &amp; Potts, M. (2022). The management costs of alternative forest management strategies in the Lake Tahoe Basin. Ecology and Society. 27 (4): 43, 27(4). 10.5751/ES-13481-270443.</w:t>
+        <w:t xml:space="preserve">Harrison, J. (2025). Avoiding an uninsurable future. Medium. https://medium.com/@joshuaharrison_97833/avoiding-an-uninsurable-future-78d525e8ded6.</w:t>
       </w:r>
       <w:r/>
     </w:p>
@@ -2091,10 +2367,10 @@
         <w:rPr/>
       </w:pPr>
       <w:r>
-        <w:t xml:space="preserve">Jerrett, M., Jina, A. S., &amp; Marlier, M. E. (2022). Up in smoke: California’s greenhouse gas reductions could be wiped out by 2020 wildfires. Environmental Pollution, 310.Jones, G. M., Vraga, E. K., Hessburg, P. F., Hurteau, M. D., Allen, C. D., Keane, R. E.</w:t>
-      </w:r>
-      <w:r>
-        <w:t xml:space="preserve">, Spies, T. A., North, M. P., Collins, B. M., Finney, M. A., Lydersen, J. M., &amp; Westerling, A. L. (2022). Counteracting wildfire misinformation. Frontiers in Ecology and the Environment, 20(7), 392–393. 10.1002/fee.2553.</w:t>
+        <w:t xml:space="preserve">Hoffman, K. M., Davis, E. L., Wickham, S. B., Schang, K., Johnson, A., Larking, T., Lauriault, P. N., Quynh Le, N., Swerdfager, E., &amp; Trant, A. J. (2021). Conservation of Earth’s biodiversity is embedded in Indigenous fire stewardship. Proceedings of the Na</w:t>
+      </w:r>
+      <w:r>
+        <w:t xml:space="preserve">tional Academy of Sciences, 118(32). 10.1073/pnas.2105073118.</w:t>
       </w:r>
       <w:r/>
     </w:p>
@@ -2107,7 +2383,10 @@
         <w:rPr/>
       </w:pPr>
       <w:r>
-        <w:t xml:space="preserve">North, M. P., Tompkins, R. E., Bernal, A. A., Collins, B. M., Stephens, S. L., &amp; York, R. A. (2022). Operational resilience in western US frequent-fire forests. Forest Ecology and Management, 507, 120004. 10.1016/j.foreco.2021.120004.</w:t>
+        <w:t xml:space="preserve">Jerrett, M., Jina, A. S., &amp; Marlier, M. E. (2022). Up in smoke: California’s greenhouse gas reductions could be wiped out by 2020 wildfires. Environmental Pollution, 310.Jones, G. M., Vraga, E. K., Hessburg, P. F., Hurteau, M. D., Allen, C. D., Keane, R. E.</w:t>
+      </w:r>
+      <w:r>
+        <w:t xml:space="preserve">, Spies, T. A., North, M. P., Collins, B. M., Finney, M. A., Lydersen, J. M., &amp; Westerling, A. L. (2022). Counteracting wildfire misinformation. Frontiers in Ecology and the Environment, 20(7), 392–393. 10.1002/fee.2553.</w:t>
       </w:r>
       <w:r/>
     </w:p>
@@ -2120,7 +2399,7 @@
         <w:rPr/>
       </w:pPr>
       <w:r>
-        <w:t xml:space="preserve">North, M., Stine, P., O’Hara, K., Zielinski, W., &amp; Stephens, S. (2009). An ecosystem management strategy for Sierran mixed-conifer forests. U.S. Department of Agriculture, Forest Service, Pacific Southwest Research Station. 10.2737/PSW-GTR-220.</w:t>
+        <w:t xml:space="preserve">North, M. P., Tompkins, R. E., Bernal, A. A., Collins, B. M., Stephens, S. L., &amp; York, R. A. (2022). Operational resilience in western US frequent-fire forests. Forest Ecology and Management, 507, 120004. 10.1016/j.foreco.2021.120004.</w:t>
       </w:r>
       <w:r/>
     </w:p>
@@ -2133,10 +2412,7 @@
         <w:rPr/>
       </w:pPr>
       <w:r>
-        <w:t xml:space="preserve">Oreskes, N., &amp; Conway, E. M. (2011). Merchants of doubt: How a handful of scientists obscured the truth on issues from tobacco smoke to global warming. Bloomsbury Publishing USA.Peery, M. Z., Jones, G. M., Gutiérrez, R., Redpath, S. M., Franklin, A. B., Sim</w:t>
-      </w:r>
-      <w:r>
-        <w:t xml:space="preserve">berloff, D., Turner, M. G., Radeloff, V. C., &amp; White, G. C. (2019). The conundrum of agendadriven science in conservation. Frontiers in Ecology and the Environment, 17(2), 80–82. 10.1002/fee.2006.</w:t>
+        <w:t xml:space="preserve">North, M., Stine, P., O’Hara, K., Zielinski, W., &amp; Stephens, S. (2009). An ecosystem management strategy for Sierran mixed-conifer forests. U.S. Department of Agriculture, Forest Service, Pacific Southwest Research Station. 10.2737/PSW-GTR-220.</w:t>
       </w:r>
       <w:r/>
     </w:p>
@@ -2149,10 +2425,10 @@
         <w:rPr/>
       </w:pPr>
       <w:r>
-        <w:t xml:space="preserve">Prichard, S. J., Hessburg, P. F., Hagmann, R. K., Povak, N. A., Dobrowski, S. Z., Hurteau, M. D., Kane, V. R., Keane, R. E., Kobziar, L. N., Kolden, C. A., North, M., Parks, S. A., Safford, H. D., Stevens, J. T., Yocom, L. L., Churchill, D. J., Gray, R. W.,</w:t>
-      </w:r>
-      <w:r>
-        <w:t xml:space="preserve"> Huffman, D. W., Lake, F. K., &amp; KhatriChhetri, P. (2021). Adapting western North American forests to climate change and wildfires: 10 common questions. Ecological Applications, 31(8). 10.1002/eap.2433.</w:t>
+        <w:t xml:space="preserve">Peery, M. Z., Jones, G. M., Gutiérrez, R., Redpath, S. M., Franklin, A. B., Simberloff, D., Turner, M. G., Radeloff, V. C., &amp; White, G. C. (2019). The conundrum of agendadriven science in conservation. Frontiers in Ecology and the Environment, 17(2), 80–82.</w:t>
+      </w:r>
+      <w:r>
+        <w:t xml:space="preserve"> 10.1002/fee.2006.</w:t>
       </w:r>
       <w:r/>
     </w:p>
@@ -2165,7 +2441,7 @@
         <w:rPr/>
       </w:pPr>
       <w:r>
-        <w:t xml:space="preserve">Safford, H. D., &amp; Saberi, S. (2026). Fuel treatment effects on fire severity during the Caldor Fire (2021), Lake Tahoe, California, USA. Forest Ecology and Management, 603. https://research.fs.usda.gov/treesearch/download/64496.pdf.</w:t>
+        <w:t xml:space="preserve">Stephens, S. L., Martin, R. E., &amp; Clinton, N. E. (2007). Prehistoric fire area and emissions from California’s forests, woodlands, shrublands, and grasslands. Forest Ecology and Management, 251(3), 205–216. 10.1016/j.foreco.2007.06.005.</w:t>
       </w:r>
       <w:r/>
     </w:p>
@@ -2178,10 +2454,7 @@
         <w:rPr/>
       </w:pPr>
       <w:r>
-        <w:t xml:space="preserve">Shive, K. L., Coppoletta, M., Wayman, R. B., Paulson, A. K., Wilson, K. N., Abatzaglou, J. T., Saberi, S. J., Estes, B., &amp; Safford, H. D. (2024). Thinning with follow-up burning treatments have increased effectiveness at reducing severity in California’s la</w:t>
-      </w:r>
-      <w:r>
-        <w:t xml:space="preserve">rgest wildfire. Forest Ecology and Management, 572. 10.1016/j.foreco.2024.122171.</w:t>
+        <w:t xml:space="preserve">Strabo, F., Bryan, C., &amp; Reimer, M. (2025). Wildfire Damages and the Cost-Effective Role of Forest Fuel Treatments. SSRN. 10.2139/ssrn.5337929.</w:t>
       </w:r>
       <w:r/>
     </w:p>
@@ -2194,44 +2467,13 @@
         <w:rPr/>
       </w:pPr>
       <w:r>
-        <w:t xml:space="preserve">Stephens, S. L., Martin, R. E., &amp; Clinton, N. E. (2007). Prehistoric fire area and emissions from California’s forests, woodlands, shrublands, and grasslands. Forest Ecology and Management, 251(3), 205–216. 10.1016/j.foreco.2007.06.005.</w:t>
+        <w:t xml:space="preserve">Turner, E. (2023). The Potential for Hazardous Fuel Reduction Treatments to Produce Net Economic Benefits in California [Phdthesis, Johns Hopkins University]. https://jscholarship.library.jhu.edu/server/api/core/bitstreams/f8447761-4375-48d4-a2ba-82bc5bef63</w:t>
+      </w:r>
+      <w:r>
+        <w:t xml:space="preserve">18/content.</w:t>
       </w:r>
       <w:r/>
-    </w:p>
-    <w:p>
-      <w:pPr>
-        <w:pBdr/>
-        <w:spacing/>
-        <w:ind/>
-        <w:jc w:val="left"/>
-        <w:rPr/>
-      </w:pPr>
-      <w:r>
-        <w:t xml:space="preserve">Strabo, F., Bryan, C., &amp; Reimer, M. (2025). Wildfire Damages and the Cost-Effective Role of Forest Fuel Treatments. SSRN. 10.2139/ssrn.5337929.</w:t>
-      </w:r>
       <w:r/>
-    </w:p>
-    <w:p>
-      <w:pPr>
-        <w:pBdr/>
-        <w:spacing/>
-        <w:ind/>
-        <w:jc w:val="left"/>
-        <w:rPr/>
-      </w:pPr>
-      <w:r>
-        <w:t xml:space="preserve">Turner, E. (2023). The Potential for Hazardous Fuel Reduction Treatments to Produce Net Economic Benefits in California [Phdthesis, Johns Hopkins University]. https://jscholarship.library.jhu.edu/server/api/core/bitstreams/f8447761-4375-48d4-a2ba-82bc5bef63</w:t>
-      </w:r>
-      <w:r>
-        <w:t xml:space="preserve">18/content</w:t>
-      </w:r>
-      <w:r/>
-      <w:r>
-        <w:rPr>
-          <w:lang w:val="en"/>
-        </w:rPr>
-        <w:t xml:space="preserve">.</w:t>
-      </w:r>
       <w:r/>
     </w:p>
     <w:sectPr>
@@ -2411,33 +2653,7 @@
       </w:pPr>
       <w:r>
         <w:rPr>
-          <w:rStyle w:val="749"/>
-        </w:rPr>
-        <w:footnoteRef/>
-      </w:r>
-      <w:r>
-        <w:t xml:space="preserve">Ironically, some environmentalists are using a Merchants of Doubt type of approach to their wildfire disinformation campaigns. See </w:t>
-      </w:r>
-      <w:r>
-        <w:t xml:space="preserve">Oreskes &amp; Conway (2011)</w:t>
-      </w:r>
-      <w:r>
-        <w:t xml:space="preserve"> for more on disinformation campaigns intended to sow doubt about science that have been used historically by the petrochemical and cigarette industries, among others.</w:t>
-      </w:r>
-      <w:r/>
-    </w:p>
-  </w:footnote>
-  <w:footnote w:id="3">
-    <w:p>
-      <w:pPr>
-        <w:pBdr/>
-        <w:spacing/>
-        <w:ind/>
-        <w:rPr/>
-      </w:pPr>
-      <w:r>
-        <w:rPr>
-          <w:rStyle w:val="749"/>
+          <w:rStyle w:val="737"/>
         </w:rPr>
         <w:footnoteRef/>
       </w:r>
@@ -2717,7 +2933,7 @@
       <w:pPr>
         <w:pBdr/>
         <w:spacing/>
-        <w:ind w:hanging="259" w:left="997"/>
+        <w:ind w:hanging="259" w:left="720"/>
       </w:pPr>
       <w:rPr/>
       <w:start w:val="1"/>
@@ -2731,7 +2947,7 @@
       <w:pPr>
         <w:pBdr/>
         <w:spacing/>
-        <w:ind w:hanging="259" w:left="1717"/>
+        <w:ind w:hanging="259" w:left="1440"/>
       </w:pPr>
       <w:rPr/>
       <w:start w:val="1"/>
@@ -2745,7 +2961,7 @@
       <w:pPr>
         <w:pBdr/>
         <w:spacing/>
-        <w:ind w:hanging="259" w:left="2437"/>
+        <w:ind w:hanging="259" w:left="2160"/>
       </w:pPr>
       <w:rPr/>
       <w:start w:val="1"/>
@@ -2759,7 +2975,7 @@
       <w:pPr>
         <w:pBdr/>
         <w:spacing/>
-        <w:ind w:hanging="259" w:left="3157"/>
+        <w:ind w:hanging="259" w:left="2880"/>
       </w:pPr>
       <w:rPr/>
       <w:start w:val="1"/>
@@ -2773,7 +2989,7 @@
       <w:pPr>
         <w:pBdr/>
         <w:spacing/>
-        <w:ind w:hanging="259" w:left="3877"/>
+        <w:ind w:hanging="259" w:left="3600"/>
       </w:pPr>
       <w:rPr/>
       <w:start w:val="1"/>
@@ -2787,7 +3003,7 @@
       <w:pPr>
         <w:pBdr/>
         <w:spacing/>
-        <w:ind w:hanging="259" w:left="4597"/>
+        <w:ind w:hanging="259" w:left="4320"/>
       </w:pPr>
       <w:rPr/>
       <w:start w:val="1"/>
@@ -2801,7 +3017,7 @@
       <w:pPr>
         <w:pBdr/>
         <w:spacing/>
-        <w:ind w:hanging="259" w:left="5317"/>
+        <w:ind w:hanging="259" w:left="5040"/>
       </w:pPr>
       <w:rPr/>
       <w:start w:val="1"/>
@@ -2815,7 +3031,7 @@
       <w:pPr>
         <w:pBdr/>
         <w:spacing/>
-        <w:ind w:hanging="259" w:left="6037"/>
+        <w:ind w:hanging="259" w:left="5760"/>
       </w:pPr>
       <w:rPr/>
       <w:start w:val="1"/>
@@ -2829,7 +3045,7 @@
       <w:pPr>
         <w:pBdr/>
         <w:spacing/>
-        <w:ind w:hanging="259" w:left="6757"/>
+        <w:ind w:hanging="259" w:left="6480"/>
       </w:pPr>
       <w:rPr/>
       <w:start w:val="1"/>
@@ -3148,7 +3364,7 @@
   </w:latentStyles>
   <w:style w:type="table" w:styleId="12">
     <w:name w:val="Table Grid"/>
-    <w:basedOn w:val="743"/>
+    <w:basedOn w:val="731"/>
     <w:uiPriority w:val="59"/>
     <w:pPr>
       <w:pBdr/>
@@ -3347,7 +3563,7 @@
   </w:style>
   <w:style w:type="table" w:styleId="13">
     <w:name w:val="Table Grid Light"/>
-    <w:basedOn w:val="743"/>
+    <w:basedOn w:val="731"/>
     <w:uiPriority w:val="59"/>
     <w:pPr>
       <w:pBdr/>
@@ -3546,7 +3762,7 @@
   </w:style>
   <w:style w:type="table" w:styleId="14">
     <w:name w:val="Plain Table 1"/>
-    <w:basedOn w:val="743"/>
+    <w:basedOn w:val="731"/>
     <w:uiPriority w:val="59"/>
     <w:pPr>
       <w:pBdr/>
@@ -3771,7 +3987,7 @@
   </w:style>
   <w:style w:type="table" w:styleId="15">
     <w:name w:val="Plain Table 2"/>
-    <w:basedOn w:val="743"/>
+    <w:basedOn w:val="731"/>
     <w:uiPriority w:val="59"/>
     <w:pPr>
       <w:pBdr/>
@@ -4004,7 +4220,7 @@
   </w:style>
   <w:style w:type="table" w:styleId="16">
     <w:name w:val="Plain Table 3"/>
-    <w:basedOn w:val="743"/>
+    <w:basedOn w:val="731"/>
     <w:uiPriority w:val="99"/>
     <w:pPr>
       <w:pBdr/>
@@ -4234,7 +4450,7 @@
   </w:style>
   <w:style w:type="table" w:styleId="17">
     <w:name w:val="Plain Table 4"/>
-    <w:basedOn w:val="743"/>
+    <w:basedOn w:val="731"/>
     <w:uiPriority w:val="99"/>
     <w:pPr>
       <w:pBdr/>
@@ -4450,7 +4666,7 @@
   </w:style>
   <w:style w:type="table" w:styleId="18">
     <w:name w:val="Plain Table 5"/>
-    <w:basedOn w:val="743"/>
+    <w:basedOn w:val="731"/>
     <w:uiPriority w:val="99"/>
     <w:pPr>
       <w:pBdr/>
@@ -4683,7 +4899,7 @@
   </w:style>
   <w:style w:type="table" w:styleId="19">
     <w:name w:val="Grid Table 1 Light"/>
-    <w:basedOn w:val="743"/>
+    <w:basedOn w:val="731"/>
     <w:uiPriority w:val="99"/>
     <w:pPr>
       <w:pBdr/>
@@ -4906,7 +5122,7 @@
   </w:style>
   <w:style w:type="table" w:styleId="20">
     <w:name w:val="Grid Table 1 Light - Accent 1"/>
-    <w:basedOn w:val="743"/>
+    <w:basedOn w:val="731"/>
     <w:uiPriority w:val="99"/>
     <w:pPr>
       <w:pBdr/>
@@ -5129,7 +5345,7 @@
   </w:style>
   <w:style w:type="table" w:styleId="21">
     <w:name w:val="Grid Table 1 Light - Accent 2"/>
-    <w:basedOn w:val="743"/>
+    <w:basedOn w:val="731"/>
     <w:uiPriority w:val="99"/>
     <w:pPr>
       <w:pBdr/>
@@ -5352,7 +5568,7 @@
   </w:style>
   <w:style w:type="table" w:styleId="22">
     <w:name w:val="Grid Table 1 Light - Accent 3"/>
-    <w:basedOn w:val="743"/>
+    <w:basedOn w:val="731"/>
     <w:uiPriority w:val="99"/>
     <w:pPr>
       <w:pBdr/>
@@ -5575,7 +5791,7 @@
   </w:style>
   <w:style w:type="table" w:styleId="23">
     <w:name w:val="Grid Table 1 Light - Accent 4"/>
-    <w:basedOn w:val="743"/>
+    <w:basedOn w:val="731"/>
     <w:uiPriority w:val="99"/>
     <w:pPr>
       <w:pBdr/>
@@ -5798,7 +6014,7 @@
   </w:style>
   <w:style w:type="table" w:styleId="24">
     <w:name w:val="Grid Table 1 Light - Accent 5"/>
-    <w:basedOn w:val="743"/>
+    <w:basedOn w:val="731"/>
     <w:uiPriority w:val="99"/>
     <w:pPr>
       <w:pBdr/>
@@ -6021,7 +6237,7 @@
   </w:style>
   <w:style w:type="table" w:styleId="25">
     <w:name w:val="Grid Table 1 Light - Accent 6"/>
-    <w:basedOn w:val="743"/>
+    <w:basedOn w:val="731"/>
     <w:uiPriority w:val="99"/>
     <w:pPr>
       <w:pBdr/>
@@ -6244,7 +6460,7 @@
   </w:style>
   <w:style w:type="table" w:styleId="26">
     <w:name w:val="Grid Table 2"/>
-    <w:basedOn w:val="743"/>
+    <w:basedOn w:val="731"/>
     <w:uiPriority w:val="99"/>
     <w:pPr>
       <w:pBdr/>
@@ -6476,7 +6692,7 @@
   </w:style>
   <w:style w:type="table" w:styleId="27">
     <w:name w:val="Grid Table 2 - Accent 1"/>
-    <w:basedOn w:val="743"/>
+    <w:basedOn w:val="731"/>
     <w:uiPriority w:val="99"/>
     <w:pPr>
       <w:pBdr/>
@@ -6708,7 +6924,7 @@
   </w:style>
   <w:style w:type="table" w:styleId="28">
     <w:name w:val="Grid Table 2 - Accent 2"/>
-    <w:basedOn w:val="743"/>
+    <w:basedOn w:val="731"/>
     <w:uiPriority w:val="99"/>
     <w:pPr>
       <w:pBdr/>
@@ -6940,7 +7156,7 @@
   </w:style>
   <w:style w:type="table" w:styleId="29">
     <w:name w:val="Grid Table 2 - Accent 3"/>
-    <w:basedOn w:val="743"/>
+    <w:basedOn w:val="731"/>
     <w:uiPriority w:val="99"/>
     <w:pPr>
       <w:pBdr/>
@@ -7172,7 +7388,7 @@
   </w:style>
   <w:style w:type="table" w:styleId="30">
     <w:name w:val="Grid Table 2 - Accent 4"/>
-    <w:basedOn w:val="743"/>
+    <w:basedOn w:val="731"/>
     <w:uiPriority w:val="99"/>
     <w:pPr>
       <w:pBdr/>
@@ -7404,7 +7620,7 @@
   </w:style>
   <w:style w:type="table" w:styleId="31">
     <w:name w:val="Grid Table 2 - Accent 5"/>
-    <w:basedOn w:val="743"/>
+    <w:basedOn w:val="731"/>
     <w:uiPriority w:val="99"/>
     <w:pPr>
       <w:pBdr/>
@@ -7636,7 +7852,7 @@
   </w:style>
   <w:style w:type="table" w:styleId="32">
     <w:name w:val="Grid Table 2 - Accent 6"/>
-    <w:basedOn w:val="743"/>
+    <w:basedOn w:val="731"/>
     <w:uiPriority w:val="99"/>
     <w:pPr>
       <w:pBdr/>
@@ -7868,7 +8084,7 @@
   </w:style>
   <w:style w:type="table" w:styleId="33">
     <w:name w:val="Grid Table 3"/>
-    <w:basedOn w:val="743"/>
+    <w:basedOn w:val="731"/>
     <w:uiPriority w:val="99"/>
     <w:pPr>
       <w:pBdr/>
@@ -8113,7 +8329,7 @@
   </w:style>
   <w:style w:type="table" w:styleId="34">
     <w:name w:val="Grid Table 3 - Accent 1"/>
-    <w:basedOn w:val="743"/>
+    <w:basedOn w:val="731"/>
     <w:uiPriority w:val="99"/>
     <w:pPr>
       <w:pBdr/>
@@ -8358,7 +8574,7 @@
   </w:style>
   <w:style w:type="table" w:styleId="35">
     <w:name w:val="Grid Table 3 - Accent 2"/>
-    <w:basedOn w:val="743"/>
+    <w:basedOn w:val="731"/>
     <w:uiPriority w:val="99"/>
     <w:pPr>
       <w:pBdr/>
@@ -8603,7 +8819,7 @@
   </w:style>
   <w:style w:type="table" w:styleId="36">
     <w:name w:val="Grid Table 3 - Accent 3"/>
-    <w:basedOn w:val="743"/>
+    <w:basedOn w:val="731"/>
     <w:uiPriority w:val="99"/>
     <w:pPr>
       <w:pBdr/>
@@ -8848,7 +9064,7 @@
   </w:style>
   <w:style w:type="table" w:styleId="37">
     <w:name w:val="Grid Table 3 - Accent 4"/>
-    <w:basedOn w:val="743"/>
+    <w:basedOn w:val="731"/>
     <w:uiPriority w:val="99"/>
     <w:pPr>
       <w:pBdr/>
@@ -9093,7 +9309,7 @@
   </w:style>
   <w:style w:type="table" w:styleId="38">
     <w:name w:val="Grid Table 3 - Accent 5"/>
-    <w:basedOn w:val="743"/>
+    <w:basedOn w:val="731"/>
     <w:uiPriority w:val="99"/>
     <w:pPr>
       <w:pBdr/>
@@ -9338,7 +9554,7 @@
   </w:style>
   <w:style w:type="table" w:styleId="39">
     <w:name w:val="Grid Table 3 - Accent 6"/>
-    <w:basedOn w:val="743"/>
+    <w:basedOn w:val="731"/>
     <w:uiPriority w:val="99"/>
     <w:pPr>
       <w:pBdr/>
@@ -9583,7 +9799,7 @@
   </w:style>
   <w:style w:type="table" w:styleId="40">
     <w:name w:val="Grid Table 4"/>
-    <w:basedOn w:val="743"/>
+    <w:basedOn w:val="731"/>
     <w:uiPriority w:val="59"/>
     <w:pPr>
       <w:pBdr/>
@@ -9816,7 +10032,7 @@
   </w:style>
   <w:style w:type="table" w:styleId="41">
     <w:name w:val="Grid Table 4 - Accent 1"/>
-    <w:basedOn w:val="743"/>
+    <w:basedOn w:val="731"/>
     <w:uiPriority w:val="59"/>
     <w:pPr>
       <w:pBdr/>
@@ -10049,7 +10265,7 @@
   </w:style>
   <w:style w:type="table" w:styleId="42">
     <w:name w:val="Grid Table 4 - Accent 2"/>
-    <w:basedOn w:val="743"/>
+    <w:basedOn w:val="731"/>
     <w:uiPriority w:val="59"/>
     <w:pPr>
       <w:pBdr/>
@@ -10282,7 +10498,7 @@
   </w:style>
   <w:style w:type="table" w:styleId="43">
     <w:name w:val="Grid Table 4 - Accent 3"/>
-    <w:basedOn w:val="743"/>
+    <w:basedOn w:val="731"/>
     <w:uiPriority w:val="59"/>
     <w:pPr>
       <w:pBdr/>
@@ -10515,7 +10731,7 @@
   </w:style>
   <w:style w:type="table" w:styleId="44">
     <w:name w:val="Grid Table 4 - Accent 4"/>
-    <w:basedOn w:val="743"/>
+    <w:basedOn w:val="731"/>
     <w:uiPriority w:val="59"/>
     <w:pPr>
       <w:pBdr/>
@@ -10748,7 +10964,7 @@
   </w:style>
   <w:style w:type="table" w:styleId="45">
     <w:name w:val="Grid Table 4 - Accent 5"/>
-    <w:basedOn w:val="743"/>
+    <w:basedOn w:val="731"/>
     <w:uiPriority w:val="59"/>
     <w:pPr>
       <w:pBdr/>
@@ -10981,7 +11197,7 @@
   </w:style>
   <w:style w:type="table" w:styleId="46">
     <w:name w:val="Grid Table 4 - Accent 6"/>
-    <w:basedOn w:val="743"/>
+    <w:basedOn w:val="731"/>
     <w:uiPriority w:val="59"/>
     <w:pPr>
       <w:pBdr/>
@@ -11214,7 +11430,7 @@
   </w:style>
   <w:style w:type="table" w:styleId="47">
     <w:name w:val="Grid Table 5 Dark"/>
-    <w:basedOn w:val="743"/>
+    <w:basedOn w:val="731"/>
     <w:uiPriority w:val="99"/>
     <w:pPr>
       <w:pBdr/>
@@ -11442,7 +11658,7 @@
   </w:style>
   <w:style w:type="table" w:styleId="48">
     <w:name w:val="Grid Table 5 Dark- Accent 1"/>
-    <w:basedOn w:val="743"/>
+    <w:basedOn w:val="731"/>
     <w:uiPriority w:val="99"/>
     <w:pPr>
       <w:pBdr/>
@@ -11670,7 +11886,7 @@
   </w:style>
   <w:style w:type="table" w:styleId="49">
     <w:name w:val="Grid Table 5 Dark - Accent 2"/>
-    <w:basedOn w:val="743"/>
+    <w:basedOn w:val="731"/>
     <w:uiPriority w:val="99"/>
     <w:pPr>
       <w:pBdr/>
@@ -11898,7 +12114,7 @@
   </w:style>
   <w:style w:type="table" w:styleId="50">
     <w:name w:val="Grid Table 5 Dark - Accent 3"/>
-    <w:basedOn w:val="743"/>
+    <w:basedOn w:val="731"/>
     <w:uiPriority w:val="99"/>
     <w:pPr>
       <w:pBdr/>
@@ -12126,7 +12342,7 @@
   </w:style>
   <w:style w:type="table" w:styleId="51">
     <w:name w:val="Grid Table 5 Dark- Accent 4"/>
-    <w:basedOn w:val="743"/>
+    <w:basedOn w:val="731"/>
     <w:uiPriority w:val="99"/>
     <w:pPr>
       <w:pBdr/>
@@ -12354,7 +12570,7 @@
   </w:style>
   <w:style w:type="table" w:styleId="52">
     <w:name w:val="Grid Table 5 Dark - Accent 5"/>
-    <w:basedOn w:val="743"/>
+    <w:basedOn w:val="731"/>
     <w:uiPriority w:val="99"/>
     <w:pPr>
       <w:pBdr/>
@@ -12582,7 +12798,7 @@
   </w:style>
   <w:style w:type="table" w:styleId="53">
     <w:name w:val="Grid Table 5 Dark - Accent 6"/>
-    <w:basedOn w:val="743"/>
+    <w:basedOn w:val="731"/>
     <w:uiPriority w:val="99"/>
     <w:pPr>
       <w:pBdr/>
@@ -12810,7 +13026,7 @@
   </w:style>
   <w:style w:type="table" w:styleId="54">
     <w:name w:val="Grid Table 6 Colorful"/>
-    <w:basedOn w:val="743"/>
+    <w:basedOn w:val="731"/>
     <w:uiPriority w:val="99"/>
     <w:pPr>
       <w:pBdr/>
@@ -13040,7 +13256,7 @@
   </w:style>
   <w:style w:type="table" w:styleId="55">
     <w:name w:val="Grid Table 6 Colorful - Accent 1"/>
-    <w:basedOn w:val="743"/>
+    <w:basedOn w:val="731"/>
     <w:uiPriority w:val="99"/>
     <w:pPr>
       <w:pBdr/>
@@ -13270,7 +13486,7 @@
   </w:style>
   <w:style w:type="table" w:styleId="56">
     <w:name w:val="Grid Table 6 Colorful - Accent 2"/>
-    <w:basedOn w:val="743"/>
+    <w:basedOn w:val="731"/>
     <w:uiPriority w:val="99"/>
     <w:pPr>
       <w:pBdr/>
@@ -13500,7 +13716,7 @@
   </w:style>
   <w:style w:type="table" w:styleId="57">
     <w:name w:val="Grid Table 6 Colorful - Accent 3"/>
-    <w:basedOn w:val="743"/>
+    <w:basedOn w:val="731"/>
     <w:uiPriority w:val="99"/>
     <w:pPr>
       <w:pBdr/>
@@ -13730,7 +13946,7 @@
   </w:style>
   <w:style w:type="table" w:styleId="58">
     <w:name w:val="Grid Table 6 Colorful - Accent 4"/>
-    <w:basedOn w:val="743"/>
+    <w:basedOn w:val="731"/>
     <w:uiPriority w:val="99"/>
     <w:pPr>
       <w:pBdr/>
@@ -13960,7 +14176,7 @@
   </w:style>
   <w:style w:type="table" w:styleId="59">
     <w:name w:val="Grid Table 6 Colorful - Accent 5"/>
-    <w:basedOn w:val="743"/>
+    <w:basedOn w:val="731"/>
     <w:uiPriority w:val="99"/>
     <w:pPr>
       <w:pBdr/>
@@ -14190,7 +14406,7 @@
   </w:style>
   <w:style w:type="table" w:styleId="60">
     <w:name w:val="Grid Table 6 Colorful - Accent 6"/>
-    <w:basedOn w:val="743"/>
+    <w:basedOn w:val="731"/>
     <w:uiPriority w:val="99"/>
     <w:pPr>
       <w:pBdr/>
@@ -14420,7 +14636,7 @@
   </w:style>
   <w:style w:type="table" w:styleId="61">
     <w:name w:val="Grid Table 7 Colorful"/>
-    <w:basedOn w:val="743"/>
+    <w:basedOn w:val="731"/>
     <w:uiPriority w:val="99"/>
     <w:pPr>
       <w:pBdr/>
@@ -14674,7 +14890,7 @@
   </w:style>
   <w:style w:type="table" w:styleId="62">
     <w:name w:val="Grid Table 7 Colorful - Accent 1"/>
-    <w:basedOn w:val="743"/>
+    <w:basedOn w:val="731"/>
     <w:uiPriority w:val="99"/>
     <w:pPr>
       <w:pBdr/>
@@ -14928,7 +15144,7 @@
   </w:style>
   <w:style w:type="table" w:styleId="63">
     <w:name w:val="Grid Table 7 Colorful - Accent 2"/>
-    <w:basedOn w:val="743"/>
+    <w:basedOn w:val="731"/>
     <w:uiPriority w:val="99"/>
     <w:pPr>
       <w:pBdr/>
@@ -15182,7 +15398,7 @@
   </w:style>
   <w:style w:type="table" w:styleId="64">
     <w:name w:val="Grid Table 7 Colorful - Accent 3"/>
-    <w:basedOn w:val="743"/>
+    <w:basedOn w:val="731"/>
     <w:uiPriority w:val="99"/>
     <w:pPr>
       <w:pBdr/>
@@ -15436,7 +15652,7 @@
   </w:style>
   <w:style w:type="table" w:styleId="65">
     <w:name w:val="Grid Table 7 Colorful - Accent 4"/>
-    <w:basedOn w:val="743"/>
+    <w:basedOn w:val="731"/>
     <w:uiPriority w:val="99"/>
     <w:pPr>
       <w:pBdr/>
@@ -15690,7 +15906,7 @@
   </w:style>
   <w:style w:type="table" w:styleId="66">
     <w:name w:val="Grid Table 7 Colorful - Accent 5"/>
-    <w:basedOn w:val="743"/>
+    <w:basedOn w:val="731"/>
     <w:uiPriority w:val="99"/>
     <w:pPr>
       <w:pBdr/>
@@ -15944,7 +16160,7 @@
   </w:style>
   <w:style w:type="table" w:styleId="67">
     <w:name w:val="Grid Table 7 Colorful - Accent 6"/>
-    <w:basedOn w:val="743"/>
+    <w:basedOn w:val="731"/>
     <w:uiPriority w:val="99"/>
     <w:pPr>
       <w:pBdr/>
@@ -16198,7 +16414,7 @@
   </w:style>
   <w:style w:type="table" w:styleId="68">
     <w:name w:val="List Table 1 Light"/>
-    <w:basedOn w:val="743"/>
+    <w:basedOn w:val="731"/>
     <w:uiPriority w:val="99"/>
     <w:pPr>
       <w:pBdr/>
@@ -16414,7 +16630,7 @@
   </w:style>
   <w:style w:type="table" w:styleId="69">
     <w:name w:val="List Table 1 Light - Accent 1"/>
-    <w:basedOn w:val="743"/>
+    <w:basedOn w:val="731"/>
     <w:uiPriority w:val="99"/>
     <w:pPr>
       <w:pBdr/>
@@ -16630,7 +16846,7 @@
   </w:style>
   <w:style w:type="table" w:styleId="70">
     <w:name w:val="List Table 1 Light - Accent 2"/>
-    <w:basedOn w:val="743"/>
+    <w:basedOn w:val="731"/>
     <w:uiPriority w:val="99"/>
     <w:pPr>
       <w:pBdr/>
@@ -16846,7 +17062,7 @@
   </w:style>
   <w:style w:type="table" w:styleId="71">
     <w:name w:val="List Table 1 Light - Accent 3"/>
-    <w:basedOn w:val="743"/>
+    <w:basedOn w:val="731"/>
     <w:uiPriority w:val="99"/>
     <w:pPr>
       <w:pBdr/>
@@ -17062,7 +17278,7 @@
   </w:style>
   <w:style w:type="table" w:styleId="72">
     <w:name w:val="List Table 1 Light - Accent 4"/>
-    <w:basedOn w:val="743"/>
+    <w:basedOn w:val="731"/>
     <w:uiPriority w:val="99"/>
     <w:pPr>
       <w:pBdr/>
@@ -17278,7 +17494,7 @@
   </w:style>
   <w:style w:type="table" w:styleId="73">
     <w:name w:val="List Table 1 Light - Accent 5"/>
-    <w:basedOn w:val="743"/>
+    <w:basedOn w:val="731"/>
     <w:uiPriority w:val="99"/>
     <w:pPr>
       <w:pBdr/>
@@ -17494,7 +17710,7 @@
   </w:style>
   <w:style w:type="table" w:styleId="74">
     <w:name w:val="List Table 1 Light - Accent 6"/>
-    <w:basedOn w:val="743"/>
+    <w:basedOn w:val="731"/>
     <w:uiPriority w:val="99"/>
     <w:pPr>
       <w:pBdr/>
@@ -17710,7 +17926,7 @@
   </w:style>
   <w:style w:type="table" w:styleId="75">
     <w:name w:val="List Table 2"/>
-    <w:basedOn w:val="743"/>
+    <w:basedOn w:val="731"/>
     <w:uiPriority w:val="99"/>
     <w:pPr>
       <w:pBdr/>
@@ -17948,7 +18164,7 @@
   </w:style>
   <w:style w:type="table" w:styleId="76">
     <w:name w:val="List Table 2 - Accent 1"/>
-    <w:basedOn w:val="743"/>
+    <w:basedOn w:val="731"/>
     <w:uiPriority w:val="99"/>
     <w:pPr>
       <w:pBdr/>
@@ -18186,7 +18402,7 @@
   </w:style>
   <w:style w:type="table" w:styleId="77">
     <w:name w:val="List Table 2 - Accent 2"/>
-    <w:basedOn w:val="743"/>
+    <w:basedOn w:val="731"/>
     <w:uiPriority w:val="99"/>
     <w:pPr>
       <w:pBdr/>
@@ -18424,7 +18640,7 @@
   </w:style>
   <w:style w:type="table" w:styleId="78">
     <w:name w:val="List Table 2 - Accent 3"/>
-    <w:basedOn w:val="743"/>
+    <w:basedOn w:val="731"/>
     <w:uiPriority w:val="99"/>
     <w:pPr>
       <w:pBdr/>
@@ -18662,7 +18878,7 @@
   </w:style>
   <w:style w:type="table" w:styleId="79">
     <w:name w:val="List Table 2 - Accent 4"/>
-    <w:basedOn w:val="743"/>
+    <w:basedOn w:val="731"/>
     <w:uiPriority w:val="99"/>
     <w:pPr>
       <w:pBdr/>
@@ -18900,7 +19116,7 @@
   </w:style>
   <w:style w:type="table" w:styleId="80">
     <w:name w:val="List Table 2 - Accent 5"/>
-    <w:basedOn w:val="743"/>
+    <w:basedOn w:val="731"/>
     <w:uiPriority w:val="99"/>
     <w:pPr>
       <w:pBdr/>
@@ -19138,7 +19354,7 @@
   </w:style>
   <w:style w:type="table" w:styleId="81">
     <w:name w:val="List Table 2 - Accent 6"/>
-    <w:basedOn w:val="743"/>
+    <w:basedOn w:val="731"/>
     <w:uiPriority w:val="99"/>
     <w:pPr>
       <w:pBdr/>
@@ -19376,7 +19592,7 @@
   </w:style>
   <w:style w:type="table" w:styleId="82">
     <w:name w:val="List Table 3"/>
-    <w:basedOn w:val="743"/>
+    <w:basedOn w:val="731"/>
     <w:uiPriority w:val="99"/>
     <w:pPr>
       <w:pBdr/>
@@ -19604,7 +19820,7 @@
   </w:style>
   <w:style w:type="table" w:styleId="83">
     <w:name w:val="List Table 3 - Accent 1"/>
-    <w:basedOn w:val="743"/>
+    <w:basedOn w:val="731"/>
     <w:uiPriority w:val="99"/>
     <w:pPr>
       <w:pBdr/>
@@ -19832,7 +20048,7 @@
   </w:style>
   <w:style w:type="table" w:styleId="84">
     <w:name w:val="List Table 3 - Accent 2"/>
-    <w:basedOn w:val="743"/>
+    <w:basedOn w:val="731"/>
     <w:uiPriority w:val="99"/>
     <w:pPr>
       <w:pBdr/>
@@ -20060,7 +20276,7 @@
   </w:style>
   <w:style w:type="table" w:styleId="85">
     <w:name w:val="List Table 3 - Accent 3"/>
-    <w:basedOn w:val="743"/>
+    <w:basedOn w:val="731"/>
     <w:uiPriority w:val="99"/>
     <w:pPr>
       <w:pBdr/>
@@ -20288,7 +20504,7 @@
   </w:style>
   <w:style w:type="table" w:styleId="86">
     <w:name w:val="List Table 3 - Accent 4"/>
-    <w:basedOn w:val="743"/>
+    <w:basedOn w:val="731"/>
     <w:uiPriority w:val="99"/>
     <w:pPr>
       <w:pBdr/>
@@ -20516,7 +20732,7 @@
   </w:style>
   <w:style w:type="table" w:styleId="87">
     <w:name w:val="List Table 3 - Accent 5"/>
-    <w:basedOn w:val="743"/>
+    <w:basedOn w:val="731"/>
     <w:uiPriority w:val="99"/>
     <w:pPr>
       <w:pBdr/>
@@ -20744,7 +20960,7 @@
   </w:style>
   <w:style w:type="table" w:styleId="88">
     <w:name w:val="List Table 3 - Accent 6"/>
-    <w:basedOn w:val="743"/>
+    <w:basedOn w:val="731"/>
     <w:uiPriority w:val="99"/>
     <w:pPr>
       <w:pBdr/>
@@ -20972,7 +21188,7 @@
   </w:style>
   <w:style w:type="table" w:styleId="89">
     <w:name w:val="List Table 4"/>
-    <w:basedOn w:val="743"/>
+    <w:basedOn w:val="731"/>
     <w:uiPriority w:val="99"/>
     <w:pPr>
       <w:pBdr/>
@@ -21197,7 +21413,7 @@
   </w:style>
   <w:style w:type="table" w:styleId="90">
     <w:name w:val="List Table 4 - Accent 1"/>
-    <w:basedOn w:val="743"/>
+    <w:basedOn w:val="731"/>
     <w:uiPriority w:val="99"/>
     <w:pPr>
       <w:pBdr/>
@@ -21422,7 +21638,7 @@
   </w:style>
   <w:style w:type="table" w:styleId="91">
     <w:name w:val="List Table 4 - Accent 2"/>
-    <w:basedOn w:val="743"/>
+    <w:basedOn w:val="731"/>
     <w:uiPriority w:val="99"/>
     <w:pPr>
       <w:pBdr/>
@@ -21647,7 +21863,7 @@
   </w:style>
   <w:style w:type="table" w:styleId="92">
     <w:name w:val="List Table 4 - Accent 3"/>
-    <w:basedOn w:val="743"/>
+    <w:basedOn w:val="731"/>
     <w:uiPriority w:val="99"/>
     <w:pPr>
       <w:pBdr/>
@@ -21872,7 +22088,7 @@
   </w:style>
   <w:style w:type="table" w:styleId="93">
     <w:name w:val="List Table 4 - Accent 4"/>
-    <w:basedOn w:val="743"/>
+    <w:basedOn w:val="731"/>
     <w:uiPriority w:val="99"/>
     <w:pPr>
       <w:pBdr/>
@@ -22097,7 +22313,7 @@
   </w:style>
   <w:style w:type="table" w:styleId="94">
     <w:name w:val="List Table 4 - Accent 5"/>
-    <w:basedOn w:val="743"/>
+    <w:basedOn w:val="731"/>
     <w:uiPriority w:val="99"/>
     <w:pPr>
       <w:pBdr/>
@@ -22322,7 +22538,7 @@
   </w:style>
   <w:style w:type="table" w:styleId="95">
     <w:name w:val="List Table 4 - Accent 6"/>
-    <w:basedOn w:val="743"/>
+    <w:basedOn w:val="731"/>
     <w:uiPriority w:val="99"/>
     <w:pPr>
       <w:pBdr/>
@@ -22547,7 +22763,7 @@
   </w:style>
   <w:style w:type="table" w:styleId="96">
     <w:name w:val="List Table 5 Dark"/>
-    <w:basedOn w:val="743"/>
+    <w:basedOn w:val="731"/>
     <w:uiPriority w:val="99"/>
     <w:pPr>
       <w:pBdr/>
@@ -22789,7 +23005,7 @@
   </w:style>
   <w:style w:type="table" w:styleId="97">
     <w:name w:val="List Table 5 Dark - Accent 1"/>
-    <w:basedOn w:val="743"/>
+    <w:basedOn w:val="731"/>
     <w:uiPriority w:val="99"/>
     <w:pPr>
       <w:pBdr/>
@@ -23031,7 +23247,7 @@
   </w:style>
   <w:style w:type="table" w:styleId="98">
     <w:name w:val="List Table 5 Dark - Accent 2"/>
-    <w:basedOn w:val="743"/>
+    <w:basedOn w:val="731"/>
     <w:uiPriority w:val="99"/>
     <w:pPr>
       <w:pBdr/>
@@ -23273,7 +23489,7 @@
   </w:style>
   <w:style w:type="table" w:styleId="99">
     <w:name w:val="List Table 5 Dark - Accent 3"/>
-    <w:basedOn w:val="743"/>
+    <w:basedOn w:val="731"/>
     <w:uiPriority w:val="99"/>
     <w:pPr>
       <w:pBdr/>
@@ -23515,7 +23731,7 @@
   </w:style>
   <w:style w:type="table" w:styleId="100">
     <w:name w:val="List Table 5 Dark - Accent 4"/>
-    <w:basedOn w:val="743"/>
+    <w:basedOn w:val="731"/>
     <w:uiPriority w:val="99"/>
     <w:pPr>
       <w:pBdr/>
@@ -23757,7 +23973,7 @@
   </w:style>
   <w:style w:type="table" w:styleId="101">
     <w:name w:val="List Table 5 Dark - Accent 5"/>
-    <w:basedOn w:val="743"/>
+    <w:basedOn w:val="731"/>
     <w:uiPriority w:val="99"/>
     <w:pPr>
       <w:pBdr/>
@@ -23999,7 +24215,7 @@
   </w:style>
   <w:style w:type="table" w:styleId="102">
     <w:name w:val="List Table 5 Dark - Accent 6"/>
-    <w:basedOn w:val="743"/>
+    <w:basedOn w:val="731"/>
     <w:uiPriority w:val="99"/>
     <w:pPr>
       <w:pBdr/>
@@ -24241,7 +24457,7 @@
   </w:style>
   <w:style w:type="table" w:styleId="103">
     <w:name w:val="List Table 6 Colorful"/>
-    <w:basedOn w:val="743"/>
+    <w:basedOn w:val="731"/>
     <w:uiPriority w:val="99"/>
     <w:pPr>
       <w:pBdr/>
@@ -24464,7 +24680,7 @@
   </w:style>
   <w:style w:type="table" w:styleId="104">
     <w:name w:val="List Table 6 Colorful - Accent 1"/>
-    <w:basedOn w:val="743"/>
+    <w:basedOn w:val="731"/>
     <w:uiPriority w:val="99"/>
     <w:pPr>
       <w:pBdr/>
@@ -24687,7 +24903,7 @@
   </w:style>
   <w:style w:type="table" w:styleId="105">
     <w:name w:val="List Table 6 Colorful - Accent 2"/>
-    <w:basedOn w:val="743"/>
+    <w:basedOn w:val="731"/>
     <w:uiPriority w:val="99"/>
     <w:pPr>
       <w:pBdr/>
@@ -24910,7 +25126,7 @@
   </w:style>
   <w:style w:type="table" w:styleId="106">
     <w:name w:val="List Table 6 Colorful - Accent 3"/>
-    <w:basedOn w:val="743"/>
+    <w:basedOn w:val="731"/>
     <w:uiPriority w:val="99"/>
     <w:pPr>
       <w:pBdr/>
@@ -25133,7 +25349,7 @@
   </w:style>
   <w:style w:type="table" w:styleId="107">
     <w:name w:val="List Table 6 Colorful - Accent 4"/>
-    <w:basedOn w:val="743"/>
+    <w:basedOn w:val="731"/>
     <w:uiPriority w:val="99"/>
     <w:pPr>
       <w:pBdr/>
@@ -25356,7 +25572,7 @@
   </w:style>
   <w:style w:type="table" w:styleId="108">
     <w:name w:val="List Table 6 Colorful - Accent 5"/>
-    <w:basedOn w:val="743"/>
+    <w:basedOn w:val="731"/>
     <w:uiPriority w:val="99"/>
     <w:pPr>
       <w:pBdr/>
@@ -25579,7 +25795,7 @@
   </w:style>
   <w:style w:type="table" w:styleId="109">
     <w:name w:val="List Table 6 Colorful - Accent 6"/>
-    <w:basedOn w:val="743"/>
+    <w:basedOn w:val="731"/>
     <w:uiPriority w:val="99"/>
     <w:pPr>
       <w:pBdr/>
@@ -25802,7 +26018,7 @@
   </w:style>
   <w:style w:type="table" w:styleId="110">
     <w:name w:val="List Table 7 Colorful"/>
-    <w:basedOn w:val="743"/>
+    <w:basedOn w:val="731"/>
     <w:uiPriority w:val="99"/>
     <w:pPr>
       <w:pBdr/>
@@ -26058,7 +26274,7 @@
   </w:style>
   <w:style w:type="table" w:styleId="111">
     <w:name w:val="List Table 7 Colorful - Accent 1"/>
-    <w:basedOn w:val="743"/>
+    <w:basedOn w:val="731"/>
     <w:uiPriority w:val="99"/>
     <w:pPr>
       <w:pBdr/>
@@ -26314,7 +26530,7 @@
   </w:style>
   <w:style w:type="table" w:styleId="112">
     <w:name w:val="List Table 7 Colorful - Accent 2"/>
-    <w:basedOn w:val="743"/>
+    <w:basedOn w:val="731"/>
     <w:uiPriority w:val="99"/>
     <w:pPr>
       <w:pBdr/>
@@ -26570,7 +26786,7 @@
   </w:style>
   <w:style w:type="table" w:styleId="113">
     <w:name w:val="List Table 7 Colorful - Accent 3"/>
-    <w:basedOn w:val="743"/>
+    <w:basedOn w:val="731"/>
     <w:uiPriority w:val="99"/>
     <w:pPr>
       <w:pBdr/>
@@ -26826,7 +27042,7 @@
   </w:style>
   <w:style w:type="table" w:styleId="114">
     <w:name w:val="List Table 7 Colorful - Accent 4"/>
-    <w:basedOn w:val="743"/>
+    <w:basedOn w:val="731"/>
     <w:uiPriority w:val="99"/>
     <w:pPr>
       <w:pBdr/>
@@ -27082,7 +27298,7 @@
   </w:style>
   <w:style w:type="table" w:styleId="115">
     <w:name w:val="List Table 7 Colorful - Accent 5"/>
-    <w:basedOn w:val="743"/>
+    <w:basedOn w:val="731"/>
     <w:uiPriority w:val="99"/>
     <w:pPr>
       <w:pBdr/>
@@ -27338,7 +27554,7 @@
   </w:style>
   <w:style w:type="table" w:styleId="116">
     <w:name w:val="List Table 7 Colorful - Accent 6"/>
-    <w:basedOn w:val="743"/>
+    <w:basedOn w:val="731"/>
     <w:uiPriority w:val="99"/>
     <w:pPr>
       <w:pBdr/>
@@ -27594,7 +27810,7 @@
   </w:style>
   <w:style w:type="table" w:styleId="117">
     <w:name w:val="Lined - Accent"/>
-    <w:basedOn w:val="743"/>
+    <w:basedOn w:val="731"/>
     <w:uiPriority w:val="99"/>
     <w:pPr>
       <w:pBdr/>
@@ -27831,7 +28047,7 @@
   </w:style>
   <w:style w:type="table" w:styleId="118">
     <w:name w:val="Lined - Accent 1"/>
-    <w:basedOn w:val="743"/>
+    <w:basedOn w:val="731"/>
     <w:uiPriority w:val="99"/>
     <w:pPr>
       <w:pBdr/>
@@ -28068,7 +28284,7 @@
   </w:style>
   <w:style w:type="table" w:styleId="119">
     <w:name w:val="Lined - Accent 2"/>
-    <w:basedOn w:val="743"/>
+    <w:basedOn w:val="731"/>
     <w:uiPriority w:val="99"/>
     <w:pPr>
       <w:pBdr/>
@@ -28305,7 +28521,7 @@
   </w:style>
   <w:style w:type="table" w:styleId="120">
     <w:name w:val="Lined - Accent 3"/>
-    <w:basedOn w:val="743"/>
+    <w:basedOn w:val="731"/>
     <w:uiPriority w:val="99"/>
     <w:pPr>
       <w:pBdr/>
@@ -28542,7 +28758,7 @@
   </w:style>
   <w:style w:type="table" w:styleId="121">
     <w:name w:val="Lined - Accent 4"/>
-    <w:basedOn w:val="743"/>
+    <w:basedOn w:val="731"/>
     <w:uiPriority w:val="99"/>
     <w:pPr>
       <w:pBdr/>
@@ -28779,7 +28995,7 @@
   </w:style>
   <w:style w:type="table" w:styleId="122">
     <w:name w:val="Lined - Accent 5"/>
-    <w:basedOn w:val="743"/>
+    <w:basedOn w:val="731"/>
     <w:uiPriority w:val="99"/>
     <w:pPr>
       <w:pBdr/>
@@ -29016,7 +29232,7 @@
   </w:style>
   <w:style w:type="table" w:styleId="123">
     <w:name w:val="Lined - Accent 6"/>
-    <w:basedOn w:val="743"/>
+    <w:basedOn w:val="731"/>
     <w:uiPriority w:val="99"/>
     <w:pPr>
       <w:pBdr/>
@@ -29253,7 +29469,7 @@
   </w:style>
   <w:style w:type="table" w:styleId="124">
     <w:name w:val="Bordered &amp; Lined - Accent"/>
-    <w:basedOn w:val="743"/>
+    <w:basedOn w:val="731"/>
     <w:uiPriority w:val="99"/>
     <w:pPr>
       <w:pBdr/>
@@ -29497,7 +29713,7 @@
   </w:style>
   <w:style w:type="table" w:styleId="125">
     <w:name w:val="Bordered &amp; Lined - Accent 1"/>
-    <w:basedOn w:val="743"/>
+    <w:basedOn w:val="731"/>
     <w:uiPriority w:val="99"/>
     <w:pPr>
       <w:pBdr/>
@@ -29741,7 +29957,7 @@
   </w:style>
   <w:style w:type="table" w:styleId="126">
     <w:name w:val="Bordered &amp; Lined - Accent 2"/>
-    <w:basedOn w:val="743"/>
+    <w:basedOn w:val="731"/>
     <w:uiPriority w:val="99"/>
     <w:pPr>
       <w:pBdr/>
@@ -29985,7 +30201,7 @@
   </w:style>
   <w:style w:type="table" w:styleId="127">
     <w:name w:val="Bordered &amp; Lined - Accent 3"/>
-    <w:basedOn w:val="743"/>
+    <w:basedOn w:val="731"/>
     <w:uiPriority w:val="99"/>
     <w:pPr>
       <w:pBdr/>
@@ -30229,7 +30445,7 @@
   </w:style>
   <w:style w:type="table" w:styleId="128">
     <w:name w:val="Bordered &amp; Lined - Accent 4"/>
-    <w:basedOn w:val="743"/>
+    <w:basedOn w:val="731"/>
     <w:uiPriority w:val="99"/>
     <w:pPr>
       <w:pBdr/>
@@ -30473,7 +30689,7 @@
   </w:style>
   <w:style w:type="table" w:styleId="129">
     <w:name w:val="Bordered &amp; Lined - Accent 5"/>
-    <w:basedOn w:val="743"/>
+    <w:basedOn w:val="731"/>
     <w:uiPriority w:val="99"/>
     <w:pPr>
       <w:pBdr/>
@@ -30717,7 +30933,7 @@
   </w:style>
   <w:style w:type="table" w:styleId="130">
     <w:name w:val="Bordered &amp; Lined - Accent 6"/>
-    <w:basedOn w:val="743"/>
+    <w:basedOn w:val="731"/>
     <w:uiPriority w:val="99"/>
     <w:pPr>
       <w:pBdr/>
@@ -30961,7 +31177,7 @@
   </w:style>
   <w:style w:type="table" w:styleId="131">
     <w:name w:val="Bordered"/>
-    <w:basedOn w:val="743"/>
+    <w:basedOn w:val="731"/>
     <w:uiPriority w:val="99"/>
     <w:pPr>
       <w:pBdr/>
@@ -31192,7 +31408,7 @@
   </w:style>
   <w:style w:type="table" w:styleId="132">
     <w:name w:val="Bordered - Accent 1"/>
-    <w:basedOn w:val="743"/>
+    <w:basedOn w:val="731"/>
     <w:uiPriority w:val="99"/>
     <w:pPr>
       <w:pBdr/>
@@ -31423,7 +31639,7 @@
   </w:style>
   <w:style w:type="table" w:styleId="133">
     <w:name w:val="Bordered - Accent 2"/>
-    <w:basedOn w:val="743"/>
+    <w:basedOn w:val="731"/>
     <w:uiPriority w:val="99"/>
     <w:pPr>
       <w:pBdr/>
@@ -31654,7 +31870,7 @@
   </w:style>
   <w:style w:type="table" w:styleId="134">
     <w:name w:val="Bordered - Accent 3"/>
-    <w:basedOn w:val="743"/>
+    <w:basedOn w:val="731"/>
     <w:uiPriority w:val="99"/>
     <w:pPr>
       <w:pBdr/>
@@ -31885,7 +32101,7 @@
   </w:style>
   <w:style w:type="table" w:styleId="135">
     <w:name w:val="Bordered - Accent 4"/>
-    <w:basedOn w:val="743"/>
+    <w:basedOn w:val="731"/>
     <w:uiPriority w:val="99"/>
     <w:pPr>
       <w:pBdr/>
@@ -32116,7 +32332,7 @@
   </w:style>
   <w:style w:type="table" w:styleId="136">
     <w:name w:val="Bordered - Accent 5"/>
-    <w:basedOn w:val="743"/>
+    <w:basedOn w:val="731"/>
     <w:uiPriority w:val="99"/>
     <w:pPr>
       <w:pBdr/>
@@ -32347,7 +32563,7 @@
   </w:style>
   <w:style w:type="table" w:styleId="137">
     <w:name w:val="Bordered - Accent 6"/>
-    <w:basedOn w:val="743"/>
+    <w:basedOn w:val="731"/>
     <w:uiPriority w:val="99"/>
     <w:pPr>
       <w:pBdr/>
@@ -32578,8 +32794,8 @@
   </w:style>
   <w:style w:type="paragraph" w:styleId="145">
     <w:name w:val="Heading 7"/>
-    <w:basedOn w:val="735"/>
-    <w:next w:val="735"/>
+    <w:basedOn w:val="723"/>
+    <w:next w:val="723"/>
     <w:link w:val="156"/>
     <w:uiPriority w:val="9"/>
     <w:unhideWhenUsed/>
@@ -32599,8 +32815,8 @@
   </w:style>
   <w:style w:type="paragraph" w:styleId="146">
     <w:name w:val="Heading 8"/>
-    <w:basedOn w:val="735"/>
-    <w:next w:val="735"/>
+    <w:basedOn w:val="723"/>
+    <w:next w:val="723"/>
     <w:link w:val="157"/>
     <w:uiPriority w:val="9"/>
     <w:unhideWhenUsed/>
@@ -32622,8 +32838,8 @@
   </w:style>
   <w:style w:type="paragraph" w:styleId="147">
     <w:name w:val="Heading 9"/>
-    <w:basedOn w:val="735"/>
-    <w:next w:val="735"/>
+    <w:basedOn w:val="723"/>
+    <w:next w:val="723"/>
     <w:link w:val="158"/>
     <w:uiPriority w:val="9"/>
     <w:unhideWhenUsed/>
@@ -32645,8 +32861,8 @@
   </w:style>
   <w:style w:type="character" w:styleId="150">
     <w:name w:val="Heading 1 Char"/>
-    <w:basedOn w:val="742"/>
-    <w:link w:val="736"/>
+    <w:basedOn w:val="730"/>
+    <w:link w:val="724"/>
     <w:uiPriority w:val="9"/>
     <w:pPr>
       <w:pBdr/>
@@ -32662,8 +32878,8 @@
   </w:style>
   <w:style w:type="character" w:styleId="151">
     <w:name w:val="Heading 2 Char"/>
-    <w:basedOn w:val="742"/>
-    <w:link w:val="737"/>
+    <w:basedOn w:val="730"/>
+    <w:link w:val="725"/>
     <w:uiPriority w:val="9"/>
     <w:pPr>
       <w:pBdr/>
@@ -32679,8 +32895,8 @@
   </w:style>
   <w:style w:type="character" w:styleId="152">
     <w:name w:val="Heading 3 Char"/>
-    <w:basedOn w:val="742"/>
-    <w:link w:val="738"/>
+    <w:basedOn w:val="730"/>
+    <w:link w:val="726"/>
     <w:uiPriority w:val="9"/>
     <w:pPr>
       <w:pBdr/>
@@ -32696,8 +32912,8 @@
   </w:style>
   <w:style w:type="character" w:styleId="153">
     <w:name w:val="Heading 4 Char"/>
-    <w:basedOn w:val="742"/>
-    <w:link w:val="739"/>
+    <w:basedOn w:val="730"/>
+    <w:link w:val="727"/>
     <w:uiPriority w:val="9"/>
     <w:pPr>
       <w:pBdr/>
@@ -32713,8 +32929,8 @@
   </w:style>
   <w:style w:type="character" w:styleId="154">
     <w:name w:val="Heading 5 Char"/>
-    <w:basedOn w:val="742"/>
-    <w:link w:val="740"/>
+    <w:basedOn w:val="730"/>
+    <w:link w:val="728"/>
     <w:uiPriority w:val="9"/>
     <w:pPr>
       <w:pBdr/>
@@ -32728,8 +32944,8 @@
   </w:style>
   <w:style w:type="character" w:styleId="155">
     <w:name w:val="Heading 6 Char"/>
-    <w:basedOn w:val="742"/>
-    <w:link w:val="741"/>
+    <w:basedOn w:val="730"/>
+    <w:link w:val="729"/>
     <w:uiPriority w:val="9"/>
     <w:pPr>
       <w:pBdr/>
@@ -32745,7 +32961,7 @@
   </w:style>
   <w:style w:type="character" w:styleId="156">
     <w:name w:val="Heading 7 Char"/>
-    <w:basedOn w:val="742"/>
+    <w:basedOn w:val="730"/>
     <w:link w:val="145"/>
     <w:uiPriority w:val="9"/>
     <w:pPr>
@@ -32760,7 +32976,7 @@
   </w:style>
   <w:style w:type="character" w:styleId="157">
     <w:name w:val="Heading 8 Char"/>
-    <w:basedOn w:val="742"/>
+    <w:basedOn w:val="730"/>
     <w:link w:val="146"/>
     <w:uiPriority w:val="9"/>
     <w:pPr>
@@ -32777,7 +32993,7 @@
   </w:style>
   <w:style w:type="character" w:styleId="158">
     <w:name w:val="Heading 9 Char"/>
-    <w:basedOn w:val="742"/>
+    <w:basedOn w:val="730"/>
     <w:link w:val="147"/>
     <w:uiPriority w:val="9"/>
     <w:pPr>
@@ -32794,8 +33010,8 @@
   </w:style>
   <w:style w:type="character" w:styleId="160">
     <w:name w:val="Title Char"/>
-    <w:basedOn w:val="742"/>
-    <w:link w:val="745"/>
+    <w:basedOn w:val="730"/>
+    <w:link w:val="733"/>
     <w:uiPriority w:val="10"/>
     <w:pPr>
       <w:pBdr/>
@@ -32811,8 +33027,8 @@
   </w:style>
   <w:style w:type="paragraph" w:styleId="163">
     <w:name w:val="Quote"/>
-    <w:basedOn w:val="735"/>
-    <w:next w:val="735"/>
+    <w:basedOn w:val="723"/>
+    <w:next w:val="723"/>
     <w:link w:val="164"/>
     <w:uiPriority w:val="29"/>
     <w:qFormat/>
@@ -32830,7 +33046,7 @@
   </w:style>
   <w:style w:type="character" w:styleId="164">
     <w:name w:val="Quote Char"/>
-    <w:basedOn w:val="742"/>
+    <w:basedOn w:val="730"/>
     <w:link w:val="163"/>
     <w:uiPriority w:val="29"/>
     <w:pPr>
@@ -32846,7 +33062,7 @@
   </w:style>
   <w:style w:type="character" w:styleId="166">
     <w:name w:val="Intense Emphasis"/>
-    <w:basedOn w:val="742"/>
+    <w:basedOn w:val="730"/>
     <w:uiPriority w:val="21"/>
     <w:qFormat/>
     <w:pPr>
@@ -32862,7 +33078,7 @@
   </w:style>
   <w:style w:type="character" w:styleId="169">
     <w:name w:val="Intense Reference"/>
-    <w:basedOn w:val="742"/>
+    <w:basedOn w:val="730"/>
     <w:uiPriority w:val="32"/>
     <w:qFormat/>
     <w:pPr>
@@ -32880,7 +33096,7 @@
   </w:style>
   <w:style w:type="paragraph" w:styleId="170">
     <w:name w:val="No Spacing"/>
-    <w:basedOn w:val="735"/>
+    <w:basedOn w:val="723"/>
     <w:uiPriority w:val="1"/>
     <w:qFormat/>
     <w:pPr>
@@ -32891,7 +33107,7 @@
   </w:style>
   <w:style w:type="character" w:styleId="171">
     <w:name w:val="Subtle Emphasis"/>
-    <w:basedOn w:val="742"/>
+    <w:basedOn w:val="730"/>
     <w:uiPriority w:val="19"/>
     <w:qFormat/>
     <w:pPr>
@@ -32907,7 +33123,7 @@
   </w:style>
   <w:style w:type="character" w:styleId="172">
     <w:name w:val="Emphasis"/>
-    <w:basedOn w:val="742"/>
+    <w:basedOn w:val="730"/>
     <w:uiPriority w:val="20"/>
     <w:qFormat/>
     <w:pPr>
@@ -32922,7 +33138,7 @@
   </w:style>
   <w:style w:type="character" w:styleId="173">
     <w:name w:val="Strong"/>
-    <w:basedOn w:val="742"/>
+    <w:basedOn w:val="730"/>
     <w:uiPriority w:val="22"/>
     <w:qFormat/>
     <w:pPr>
@@ -32937,7 +33153,7 @@
   </w:style>
   <w:style w:type="character" w:styleId="174">
     <w:name w:val="Subtle Reference"/>
-    <w:basedOn w:val="742"/>
+    <w:basedOn w:val="730"/>
     <w:uiPriority w:val="31"/>
     <w:qFormat/>
     <w:pPr>
@@ -32952,7 +33168,7 @@
   </w:style>
   <w:style w:type="character" w:styleId="175">
     <w:name w:val="Book Title"/>
-    <w:basedOn w:val="742"/>
+    <w:basedOn w:val="730"/>
     <w:uiPriority w:val="33"/>
     <w:qFormat/>
     <w:pPr>
@@ -32970,7 +33186,7 @@
   </w:style>
   <w:style w:type="paragraph" w:styleId="184">
     <w:name w:val="endnote text"/>
-    <w:basedOn w:val="735"/>
+    <w:basedOn w:val="723"/>
     <w:link w:val="185"/>
     <w:uiPriority w:val="99"/>
     <w:semiHidden/>
@@ -32987,7 +33203,7 @@
   </w:style>
   <w:style w:type="character" w:styleId="185">
     <w:name w:val="Endnote Text Char"/>
-    <w:basedOn w:val="742"/>
+    <w:basedOn w:val="730"/>
     <w:link w:val="184"/>
     <w:uiPriority w:val="99"/>
     <w:semiHidden/>
@@ -33003,7 +33219,7 @@
   </w:style>
   <w:style w:type="character" w:styleId="186">
     <w:name w:val="endnote reference"/>
-    <w:basedOn w:val="742"/>
+    <w:basedOn w:val="730"/>
     <w:uiPriority w:val="99"/>
     <w:semiHidden/>
     <w:unhideWhenUsed/>
@@ -33018,7 +33234,7 @@
   </w:style>
   <w:style w:type="character" w:styleId="188">
     <w:name w:val="FollowedHyperlink"/>
-    <w:basedOn w:val="742"/>
+    <w:basedOn w:val="730"/>
     <w:uiPriority w:val="99"/>
     <w:semiHidden/>
     <w:unhideWhenUsed/>
@@ -33034,8 +33250,8 @@
   </w:style>
   <w:style w:type="paragraph" w:styleId="189">
     <w:name w:val="toc 1"/>
-    <w:basedOn w:val="735"/>
-    <w:next w:val="735"/>
+    <w:basedOn w:val="723"/>
+    <w:next w:val="723"/>
     <w:uiPriority w:val="39"/>
     <w:unhideWhenUsed/>
     <w:pPr>
@@ -33046,8 +33262,8 @@
   </w:style>
   <w:style w:type="paragraph" w:styleId="190">
     <w:name w:val="toc 2"/>
-    <w:basedOn w:val="735"/>
-    <w:next w:val="735"/>
+    <w:basedOn w:val="723"/>
+    <w:next w:val="723"/>
     <w:uiPriority w:val="39"/>
     <w:unhideWhenUsed/>
     <w:pPr>
@@ -33058,8 +33274,8 @@
   </w:style>
   <w:style w:type="paragraph" w:styleId="191">
     <w:name w:val="toc 3"/>
-    <w:basedOn w:val="735"/>
-    <w:next w:val="735"/>
+    <w:basedOn w:val="723"/>
+    <w:next w:val="723"/>
     <w:uiPriority w:val="39"/>
     <w:unhideWhenUsed/>
     <w:pPr>
@@ -33070,8 +33286,8 @@
   </w:style>
   <w:style w:type="paragraph" w:styleId="192">
     <w:name w:val="toc 4"/>
-    <w:basedOn w:val="735"/>
-    <w:next w:val="735"/>
+    <w:basedOn w:val="723"/>
+    <w:next w:val="723"/>
     <w:uiPriority w:val="39"/>
     <w:unhideWhenUsed/>
     <w:pPr>
@@ -33082,8 +33298,8 @@
   </w:style>
   <w:style w:type="paragraph" w:styleId="193">
     <w:name w:val="toc 5"/>
-    <w:basedOn w:val="735"/>
-    <w:next w:val="735"/>
+    <w:basedOn w:val="723"/>
+    <w:next w:val="723"/>
     <w:uiPriority w:val="39"/>
     <w:unhideWhenUsed/>
     <w:pPr>
@@ -33094,8 +33310,8 @@
   </w:style>
   <w:style w:type="paragraph" w:styleId="194">
     <w:name w:val="toc 6"/>
-    <w:basedOn w:val="735"/>
-    <w:next w:val="735"/>
+    <w:basedOn w:val="723"/>
+    <w:next w:val="723"/>
     <w:uiPriority w:val="39"/>
     <w:unhideWhenUsed/>
     <w:pPr>
@@ -33106,8 +33322,8 @@
   </w:style>
   <w:style w:type="paragraph" w:styleId="195">
     <w:name w:val="toc 7"/>
-    <w:basedOn w:val="735"/>
-    <w:next w:val="735"/>
+    <w:basedOn w:val="723"/>
+    <w:next w:val="723"/>
     <w:uiPriority w:val="39"/>
     <w:unhideWhenUsed/>
     <w:pPr>
@@ -33118,8 +33334,8 @@
   </w:style>
   <w:style w:type="paragraph" w:styleId="196">
     <w:name w:val="toc 8"/>
-    <w:basedOn w:val="735"/>
-    <w:next w:val="735"/>
+    <w:basedOn w:val="723"/>
+    <w:next w:val="723"/>
     <w:uiPriority w:val="39"/>
     <w:unhideWhenUsed/>
     <w:pPr>
@@ -33130,8 +33346,8 @@
   </w:style>
   <w:style w:type="paragraph" w:styleId="197">
     <w:name w:val="toc 9"/>
-    <w:basedOn w:val="735"/>
-    <w:next w:val="735"/>
+    <w:basedOn w:val="723"/>
+    <w:next w:val="723"/>
     <w:uiPriority w:val="39"/>
     <w:unhideWhenUsed/>
     <w:pPr>
@@ -33142,7 +33358,7 @@
   </w:style>
   <w:style w:type="character" w:styleId="198">
     <w:name w:val="Placeholder Text"/>
-    <w:basedOn w:val="742"/>
+    <w:basedOn w:val="730"/>
     <w:uiPriority w:val="99"/>
     <w:semiHidden/>
     <w:pPr>
@@ -33166,8 +33382,8 @@
   </w:style>
   <w:style w:type="paragraph" w:styleId="209">
     <w:name w:val="table of figures"/>
-    <w:basedOn w:val="735"/>
-    <w:next w:val="735"/>
+    <w:basedOn w:val="723"/>
+    <w:next w:val="723"/>
     <w:uiPriority w:val="99"/>
     <w:unhideWhenUsed/>
     <w:pPr>
@@ -33176,7 +33392,7 @@
       <w:ind/>
     </w:pPr>
   </w:style>
-  <w:style w:type="paragraph" w:styleId="735" w:default="1">
+  <w:style w:type="paragraph" w:styleId="723" w:default="1">
     <w:name w:val="Normal"/>
     <w:qFormat/>
     <w:pPr>
@@ -33186,7 +33402,7 @@
       <w:jc w:val="both"/>
     </w:pPr>
   </w:style>
-  <w:style w:type="paragraph" w:styleId="736">
+  <w:style w:type="paragraph" w:styleId="724">
     <w:name w:val="Heading 1"/>
     <w:uiPriority w:val="9"/>
     <w:qFormat/>
@@ -33203,7 +33419,7 @@
       <w:szCs w:val="32"/>
     </w:rPr>
   </w:style>
-  <w:style w:type="paragraph" w:styleId="737">
+  <w:style w:type="paragraph" w:styleId="725">
     <w:name w:val="Heading 2"/>
     <w:uiPriority w:val="9"/>
     <w:unhideWhenUsed/>
@@ -33221,7 +33437,7 @@
       <w:szCs w:val="26"/>
     </w:rPr>
   </w:style>
-  <w:style w:type="paragraph" w:styleId="738">
+  <w:style w:type="paragraph" w:styleId="726">
     <w:name w:val="Heading 3"/>
     <w:uiPriority w:val="9"/>
     <w:unhideWhenUsed/>
@@ -33239,7 +33455,7 @@
       <w:szCs w:val="24"/>
     </w:rPr>
   </w:style>
-  <w:style w:type="paragraph" w:styleId="739">
+  <w:style w:type="paragraph" w:styleId="727">
     <w:name w:val="Heading 4"/>
     <w:uiPriority w:val="9"/>
     <w:semiHidden/>
@@ -33257,7 +33473,7 @@
       <w:color w:val="2e74b5"/>
     </w:rPr>
   </w:style>
-  <w:style w:type="paragraph" w:styleId="740">
+  <w:style w:type="paragraph" w:styleId="728">
     <w:name w:val="Heading 5"/>
     <w:uiPriority w:val="9"/>
     <w:semiHidden/>
@@ -33273,7 +33489,7 @@
       <w:color w:val="2e74b5"/>
     </w:rPr>
   </w:style>
-  <w:style w:type="paragraph" w:styleId="741">
+  <w:style w:type="paragraph" w:styleId="729">
     <w:name w:val="Heading 6"/>
     <w:uiPriority w:val="9"/>
     <w:semiHidden/>
@@ -33289,7 +33505,7 @@
       <w:color w:val="1f4d78"/>
     </w:rPr>
   </w:style>
-  <w:style w:type="character" w:styleId="742" w:default="1">
+  <w:style w:type="character" w:styleId="730" w:default="1">
     <w:name w:val="Default Paragraph Font"/>
     <w:uiPriority w:val="1"/>
     <w:semiHidden/>
@@ -33300,7 +33516,7 @@
       <w:ind/>
     </w:pPr>
   </w:style>
-  <w:style w:type="table" w:styleId="743" w:default="1">
+  <w:style w:type="table" w:styleId="731" w:default="1">
     <w:name w:val="Normal Table"/>
     <w:uiPriority w:val="99"/>
     <w:semiHidden/>
@@ -33493,7 +33709,7 @@
       </w:tcPr>
     </w:tblStylePr>
   </w:style>
-  <w:style w:type="numbering" w:styleId="744" w:default="1">
+  <w:style w:type="numbering" w:styleId="732" w:default="1">
     <w:name w:val="No List"/>
     <w:uiPriority w:val="99"/>
     <w:semiHidden/>
@@ -33504,7 +33720,7 @@
       <w:ind/>
     </w:pPr>
   </w:style>
-  <w:style w:type="paragraph" w:styleId="745">
+  <w:style w:type="paragraph" w:styleId="733">
     <w:name w:val="Title"/>
     <w:uiPriority w:val="10"/>
     <w:qFormat/>
@@ -33518,7 +33734,7 @@
       <w:szCs w:val="56"/>
     </w:rPr>
   </w:style>
-  <w:style w:type="paragraph" w:styleId="746" w:customStyle="1">
+  <w:style w:type="paragraph" w:styleId="734" w:customStyle="1">
     <w:name w:val="Strong1"/>
     <w:qFormat/>
     <w:pPr>
@@ -33531,7 +33747,7 @@
       <w:bCs/>
     </w:rPr>
   </w:style>
-  <w:style w:type="paragraph" w:styleId="747">
+  <w:style w:type="paragraph" w:styleId="735">
     <w:name w:val="List Paragraph"/>
     <w:qFormat/>
     <w:pPr>
@@ -33540,7 +33756,7 @@
       <w:ind/>
     </w:pPr>
   </w:style>
-  <w:style w:type="character" w:styleId="748">
+  <w:style w:type="character" w:styleId="736">
     <w:name w:val="Hyperlink"/>
     <w:uiPriority w:val="99"/>
     <w:unhideWhenUsed/>
@@ -33554,7 +33770,7 @@
       <w:u w:val="single"/>
     </w:rPr>
   </w:style>
-  <w:style w:type="character" w:styleId="749">
+  <w:style w:type="character" w:styleId="737">
     <w:name w:val="footnote reference"/>
     <w:uiPriority w:val="99"/>
     <w:semiHidden/>
@@ -33568,9 +33784,9 @@
       <w:vertAlign w:val="superscript"/>
     </w:rPr>
   </w:style>
-  <w:style w:type="paragraph" w:styleId="750">
+  <w:style w:type="paragraph" w:styleId="738">
     <w:name w:val="footnote text"/>
-    <w:link w:val="751"/>
+    <w:link w:val="739"/>
     <w:uiPriority w:val="99"/>
     <w:semiHidden/>
     <w:unhideWhenUsed/>
@@ -33580,9 +33796,9 @@
       <w:ind/>
     </w:pPr>
   </w:style>
-  <w:style w:type="character" w:styleId="751" w:customStyle="1">
+  <w:style w:type="character" w:styleId="739" w:customStyle="1">
     <w:name w:val="Footnote Text Char"/>
-    <w:link w:val="750"/>
+    <w:link w:val="738"/>
     <w:uiPriority w:val="99"/>
     <w:semiHidden/>
     <w:unhideWhenUsed/>
@@ -33596,10 +33812,10 @@
       <w:szCs w:val="20"/>
     </w:rPr>
   </w:style>
-  <w:style w:type="paragraph" w:styleId="752">
+  <w:style w:type="paragraph" w:styleId="740">
     <w:name w:val="Header"/>
-    <w:basedOn w:val="735"/>
-    <w:link w:val="753"/>
+    <w:basedOn w:val="723"/>
+    <w:link w:val="741"/>
     <w:uiPriority w:val="99"/>
     <w:unhideWhenUsed/>
     <w:pPr>
@@ -33612,10 +33828,10 @@
       <w:ind/>
     </w:pPr>
   </w:style>
-  <w:style w:type="character" w:styleId="753" w:customStyle="1">
+  <w:style w:type="character" w:styleId="741" w:customStyle="1">
     <w:name w:val="Header Char"/>
-    <w:basedOn w:val="742"/>
-    <w:link w:val="752"/>
+    <w:basedOn w:val="730"/>
+    <w:link w:val="740"/>
     <w:uiPriority w:val="99"/>
     <w:pPr>
       <w:pBdr/>
@@ -33623,10 +33839,10 @@
       <w:ind/>
     </w:pPr>
   </w:style>
-  <w:style w:type="paragraph" w:styleId="754">
+  <w:style w:type="paragraph" w:styleId="742">
     <w:name w:val="Footer"/>
-    <w:basedOn w:val="735"/>
-    <w:link w:val="755"/>
+    <w:basedOn w:val="723"/>
+    <w:link w:val="743"/>
     <w:uiPriority w:val="99"/>
     <w:unhideWhenUsed/>
     <w:pPr>
@@ -33639,10 +33855,10 @@
       <w:ind/>
     </w:pPr>
   </w:style>
-  <w:style w:type="character" w:styleId="755" w:customStyle="1">
+  <w:style w:type="character" w:styleId="743" w:customStyle="1">
     <w:name w:val="Footer Char"/>
-    <w:basedOn w:val="742"/>
-    <w:link w:val="754"/>
+    <w:basedOn w:val="730"/>
+    <w:link w:val="742"/>
     <w:uiPriority w:val="99"/>
     <w:pPr>
       <w:pBdr/>
@@ -33650,11 +33866,11 @@
       <w:ind/>
     </w:pPr>
   </w:style>
-  <w:style w:type="paragraph" w:styleId="756">
+  <w:style w:type="paragraph" w:styleId="744">
     <w:name w:val="Subtitle"/>
-    <w:basedOn w:val="735"/>
-    <w:next w:val="735"/>
-    <w:link w:val="757"/>
+    <w:basedOn w:val="723"/>
+    <w:next w:val="723"/>
+    <w:link w:val="745"/>
     <w:uiPriority w:val="11"/>
     <w:qFormat/>
     <w:pPr>
@@ -33673,10 +33889,10 @@
       <w:szCs w:val="22"/>
     </w:rPr>
   </w:style>
-  <w:style w:type="character" w:styleId="757" w:customStyle="1">
+  <w:style w:type="character" w:styleId="745" w:customStyle="1">
     <w:name w:val="Subtitle Char"/>
-    <w:basedOn w:val="742"/>
-    <w:link w:val="756"/>
+    <w:basedOn w:val="730"/>
+    <w:link w:val="744"/>
     <w:uiPriority w:val="11"/>
     <w:pPr>
       <w:pBdr/>
@@ -33690,11 +33906,11 @@
       <w:szCs w:val="22"/>
     </w:rPr>
   </w:style>
-  <w:style w:type="paragraph" w:styleId="758">
+  <w:style w:type="paragraph" w:styleId="746">
     <w:name w:val="Intense Quote"/>
-    <w:basedOn w:val="735"/>
-    <w:next w:val="735"/>
-    <w:link w:val="759"/>
+    <w:basedOn w:val="723"/>
+    <w:next w:val="723"/>
+    <w:link w:val="747"/>
     <w:uiPriority w:val="30"/>
     <w:qFormat/>
     <w:pPr>
@@ -33712,10 +33928,10 @@
       <w:color w:val="4472c4" w:themeColor="accent1"/>
     </w:rPr>
   </w:style>
-  <w:style w:type="character" w:styleId="759" w:customStyle="1">
+  <w:style w:type="character" w:styleId="747" w:customStyle="1">
     <w:name w:val="Intense Quote Char"/>
-    <w:basedOn w:val="742"/>
-    <w:link w:val="758"/>
+    <w:basedOn w:val="730"/>
+    <w:link w:val="746"/>
     <w:uiPriority w:val="30"/>
     <w:pPr>
       <w:pBdr/>
@@ -33728,10 +33944,10 @@
       <w:color w:val="4472c4" w:themeColor="accent1"/>
     </w:rPr>
   </w:style>
-  <w:style w:type="paragraph" w:styleId="760">
+  <w:style w:type="paragraph" w:styleId="748">
     <w:name w:val="Caption"/>
-    <w:basedOn w:val="735"/>
-    <w:next w:val="735"/>
+    <w:basedOn w:val="723"/>
+    <w:next w:val="723"/>
     <w:uiPriority w:val="35"/>
     <w:unhideWhenUsed/>
     <w:qFormat/>

</xml_diff>

<commit_message>
fixed abstract in exports
</commit_message>
<xml_diff>
--- a/exports/biomass.docx
+++ b/exports/biomass.docx
@@ -11,7 +11,7 @@
         <w:rPr/>
       </w:pPr>
       <w:r>
-        <w:t xml:space="preserve">Takeaways</w:t>
+        <w:t xml:space="preserve">Forest Biomass Solutions</w:t>
       </w:r>
       <w:r/>
     </w:p>
@@ -25,6 +25,99 @@
       </w:pPr>
       <w:r>
         <w:t xml:space="preserve">Vance Russell, Joshua Harrison</w:t>
+      </w:r>
+      <w:r/>
+    </w:p>
+    <w:p>
+      <w:pPr>
+        <w:pStyle w:val="725"/>
+        <w:pBdr/>
+        <w:spacing/>
+        <w:ind/>
+        <w:rPr/>
+      </w:pPr>
+      <w:r/>
+      <w:r/>
+      <w:r/>
+    </w:p>
+    <w:p>
+      <w:pPr>
+        <w:pStyle w:val="725"/>
+        <w:pBdr/>
+        <w:spacing/>
+        <w:ind/>
+        <w:rPr>
+          <w:highlight w:val="none"/>
+          <w:lang w:val="en"/>
+        </w:rPr>
+      </w:pPr>
+      <w:r>
+        <w:rPr>
+          <w:highlight w:val="none"/>
+          <w:lang w:val="en"/>
+        </w:rPr>
+        <w:t xml:space="preserve">Abstract</w:t>
+      </w:r>
+      <w:r/>
+    </w:p>
+    <w:p>
+      <w:pPr>
+        <w:pBdr/>
+        <w:spacing/>
+        <w:ind/>
+        <w:jc w:val="left"/>
+        <w:rPr/>
+      </w:pPr>
+      <w:r/>
+      <w:r/>
+      <w:r>
+        <w:t xml:space="preserve">The real dispute around biomass is about the legitimacy of active forest management under novel climate conditions, not about standalone energy production. Biomass utilization is a downstream necessity of forest health treatments to reduce the risk of wildf</w:t>
+      </w:r>
+      <w:r>
+        <w:t xml:space="preserve">ire to communities and the natural world. Although there are emissions and air-quality concerns from biomass plants uncontrolled wildfires produce far larger, more damaging emissions and public health impacts. Creating public fear about biomass using disinf</w:t>
+      </w:r>
+      <w:r>
+        <w:t xml:space="preserve">ormation tactics ignores the current risks at play due to a century of wildfire suppression compounded by climate change. We propose constructive, integrated solutions to implement at scale that include the entire process to arrive at healthy, resilient for</w:t>
+      </w:r>
+      <w:r>
+        <w:t xml:space="preserve">ests, create jobs, and protect biodiversity.</w:t>
+      </w:r>
+      <w:r/>
+      <w:r/>
+    </w:p>
+    <w:p>
+      <w:pPr>
+        <w:pStyle w:val="725"/>
+        <w:pBdr/>
+        <w:spacing/>
+        <w:ind/>
+        <w:rPr/>
+      </w:pPr>
+      <w:r>
+        <w:rPr>
+          <w:highlight w:val="none"/>
+          <w:lang w:val="en"/>
+        </w:rPr>
+      </w:r>
+      <w:r>
+        <w:rPr>
+          <w:highlight w:val="none"/>
+          <w:lang w:val="en"/>
+        </w:rPr>
+      </w:r>
+    </w:p>
+    <w:p>
+      <w:pPr>
+        <w:pStyle w:val="725"/>
+        <w:pBdr/>
+        <w:spacing/>
+        <w:ind/>
+        <w:rPr>
+          <w:highlight w:val="none"/>
+        </w:rPr>
+      </w:pPr>
+      <w:r>
+        <w:t xml:space="preserve">Takeaways</w:t>
       </w:r>
       <w:r/>
     </w:p>
@@ -2220,18 +2313,6 @@
         <w:t xml:space="preserve">Baldassare, D. (2024). North Fork Forest Recovery Project Carbon Effects Report.Brown, P. (2024). Cost-effectiveness of large-scale fuel reduction for wildfire mitigation in California. JSTOR. https://www.jstor.org/stable/resrep60733?seq=22.</w:t>
       </w:r>
       <w:r/>
-    </w:p>
-    <w:p>
-      <w:pPr>
-        <w:pBdr/>
-        <w:spacing/>
-        <w:ind/>
-        <w:jc w:val="left"/>
-        <w:rPr/>
-      </w:pPr>
-      <w:r>
-        <w:t xml:space="preserve">Collins, B. M., Fry, D. L., Lydersen, J. M., Everett, R., &amp; Stephens, S. L. (2017). Impacts of different land management histories on forest change. Ecological Applications, 27(8), 2475–2486. 10.1002/eap.1622.</w:t>
-      </w:r>
       <w:r/>
     </w:p>
     <w:p>
@@ -2243,20 +2324,7 @@
         <w:rPr/>
       </w:pPr>
       <w:r>
-        <w:t xml:space="preserve">Cook, J. (2020). Deconstructing climate science denial. In Research Handbook on Communicating Climate Change. Edward Elgar Publishing. 10.4337/9781789900408.00014.</w:t>
-      </w:r>
-      <w:r/>
-    </w:p>
-    <w:p>
-      <w:pPr>
-        <w:pBdr/>
-        <w:spacing/>
-        <w:ind/>
-        <w:jc w:val="left"/>
-        <w:rPr/>
-      </w:pPr>
-      <w:r>
-        <w:t xml:space="preserve">Darlington, C., Moghaddas, Jason, &amp; Fanslow, G. (2023). California forest biomass pile data collection. Joint Institute for Wood Products Innovation. https://cdnverify.bof.fire.ca.gov/media/fbplcgwm/california-forest-biomass-pile-data-collection_adamfk.pdf.</w:t>
+        <w:t xml:space="preserve">Collins, B. M., Fry, D. L., Lydersen, J. M., Everett, R., &amp; Stephens, S. L. (2017). Impacts of different land management histories on forest change. Ecological Applications, 27(8), 2475–2486. 10.1002/eap.1622.</w:t>
       </w:r>
       <w:r/>
       <w:r/>
@@ -2270,11 +2338,9 @@
         <w:rPr/>
       </w:pPr>
       <w:r>
-        <w:t xml:space="preserve">Delyser, K., Tase, N., Clay, K., Magnan, M., Evans, S., Keithley, C., Bartowitz, K., Gadoth-Goodman, D., Papa, C., Ontl, T., &amp; Cooper, L. (2025). Effects of Forest Management &amp; Wood Utilization on Carbon Sequestration &amp; Storage in California. CAL FIRE. http</w:t>
-      </w:r>
-      <w:r>
-        <w:t xml:space="preserve">s://d3f9k0n15ckvhe.cloudfront.net/wp-content/uploads/2025/02/CBM_CA_report_FINAL.pdf.</w:t>
-      </w:r>
+        <w:t xml:space="preserve">Cook, J. (2020). Deconstructing climate science denial. In Research Handbook on Communicating Climate Change. Edward Elgar Publishing. 10.4337/9781789900408.00014.</w:t>
+      </w:r>
+      <w:r/>
       <w:r/>
     </w:p>
     <w:p>
@@ -2286,8 +2352,12 @@
         <w:rPr/>
       </w:pPr>
       <w:r>
-        <w:t xml:space="preserve">Dias, M. (2025). HCalifornia is drowning in hazardous forest waste with nowhere to put it. https://calmatters.org/commentary/reader-reactions/2025/12/hazardous-forest-waste-wildfire-california.</w:t>
-      </w:r>
+        <w:t xml:space="preserve">D</w:t>
+      </w:r>
+      <w:r>
+        <w:t xml:space="preserve">arlington, C., Moghaddas, Jason, &amp; Fanslow, G. (2023). California forest biomass pile data collection. Joint Institute for Wood Products Innovation. https://cdnverify.bof.fire.ca.gov/media/fbplcgwm/california-forest-biomass-pile-data-collection_adamfk.pdf.</w:t>
+      </w:r>
+      <w:r/>
       <w:r/>
     </w:p>
     <w:p>
@@ -2299,11 +2369,15 @@
         <w:rPr/>
       </w:pPr>
       <w:r>
-        <w:t xml:space="preserve">Dodson, E. K., Peterson, D. W., &amp; Harrod, R. J. (2008). Understory vegetation response to thinning and burning restoration treatments in dry conifer forests of the eastern Cascades, USA. Forest Ecology and Management, 255(8–9), 3130–3140. 10.1016/j.foreco.2</w:t>
-      </w:r>
-      <w:r>
-        <w:t xml:space="preserve">008.01.026.</w:t>
-      </w:r>
+        <w:t xml:space="preserve">D</w:t>
+      </w:r>
+      <w:r>
+        <w:t xml:space="preserve">elyser, K., Tase, N., Clay, K., Magnan, M., Evans, S., Keithley, C., Bartowitz, K., Gadoth-Goodman, D., Papa, C., Ontl, T., &amp; Cooper, L. (2025). Effects of Forest Management &amp; Wood Utilization on Carbon Sequestration &amp; Storage in California. CAL FIRE. http</w:t>
+      </w:r>
+      <w:r>
+        <w:t xml:space="preserve">s://d3f9k0n15ckvhe.cloudfront.net/wp-content/uploads/2025/02/CBM_CA_report_FINAL.pdf.</w:t>
+      </w:r>
+      <w:r/>
       <w:r/>
     </w:p>
     <w:p>
@@ -2315,8 +2389,9 @@
         <w:rPr/>
       </w:pPr>
       <w:r>
-        <w:t xml:space="preserve">Elias, M., Yackulic, E., Duffy, K., Saksa, P., Sanchez, D. L., Pevzner, N., Plumb, S., Dyszynski, J., &amp; Bracer, C. (2025). Carbon finance for forest resilience in California. Frontiers in Forests and Global Change, 7, 1507554. 10.3389/ffgc.2024.1507554.</w:t>
-      </w:r>
+        <w:t xml:space="preserve">Dias, M. (2025). HCalifornia is drowning in hazardous forest waste with nowhere to put it. https://calmatters.org/commentary/reader-reactions/2025/12/hazardous-forest-waste-wildfire-california.</w:t>
+      </w:r>
+      <w:r/>
       <w:r/>
     </w:p>
     <w:p>
@@ -2328,8 +2403,15 @@
         <w:rPr/>
       </w:pPr>
       <w:r>
-        <w:t xml:space="preserve">Fernando, A. E., &amp; McCarthy, M. A. (2025). The relationship between pyrodiversity and biodiversity. Ecological Modelling, 510. 10.1016/j.ecolmodel.2025.111294.</w:t>
-      </w:r>
+        <w:t xml:space="preserve">D</w:t>
+      </w:r>
+      <w:r>
+        <w:t xml:space="preserve">odson, E. K., Peterson, D. W., &amp; Harrod, R. J. (2008). Understory vegetation response to thinning and burning restoration treatments in dry conifer forests of the eastern Cascades, USA. Forest Ecology and Management, 255(8–9), 3130–3140. 10.1016/j.foreco.2</w:t>
+      </w:r>
+      <w:r>
+        <w:t xml:space="preserve">008.01.026.</w:t>
+      </w:r>
+      <w:r/>
       <w:r/>
     </w:p>
     <w:p>
@@ -2341,8 +2423,9 @@
         <w:rPr/>
       </w:pPr>
       <w:r>
-        <w:t xml:space="preserve">Frisch, S., &amp; Uden, S. (2022). How forest thinning waste could fund California wildfire prevention. https://calmatters.org/commentary/2022/11/wildfire-prevention-biomass-climate-forest.</w:t>
-      </w:r>
+        <w:t xml:space="preserve">Elias, M., Yackulic, E., Duffy, K., Saksa, P., Sanchez, D. L., Pevzner, N., Plumb, S., Dyszynski, J., &amp; Bracer, C. (2025). Carbon finance for forest resilience in California. Frontiers in Forests and Global Change, 7, 1507554. 10.3389/ffgc.2024.1507554.</w:t>
+      </w:r>
+      <w:r/>
       <w:r/>
     </w:p>
     <w:p>
@@ -2354,8 +2437,9 @@
         <w:rPr/>
       </w:pPr>
       <w:r>
-        <w:t xml:space="preserve">Harrison, J. (2025). Avoiding an uninsurable future. Medium. https://medium.com/@joshuaharrison_97833/avoiding-an-uninsurable-future-78d525e8ded6.</w:t>
-      </w:r>
+        <w:t xml:space="preserve">Fernando, A. E., &amp; McCarthy, M. A. (2025). The relationship between pyrodiversity and biodiversity. Ecological Modelling, 510. 10.1016/j.ecolmodel.2025.111294.</w:t>
+      </w:r>
+      <w:r/>
       <w:r/>
     </w:p>
     <w:p>
@@ -2367,11 +2451,9 @@
         <w:rPr/>
       </w:pPr>
       <w:r>
-        <w:t xml:space="preserve">Hoffman, K. M., Davis, E. L., Wickham, S. B., Schang, K., Johnson, A., Larking, T., Lauriault, P. N., Quynh Le, N., Swerdfager, E., &amp; Trant, A. J. (2021). Conservation of Earth’s biodiversity is embedded in Indigenous fire stewardship. Proceedings of the Na</w:t>
-      </w:r>
-      <w:r>
-        <w:t xml:space="preserve">tional Academy of Sciences, 118(32). 10.1073/pnas.2105073118.</w:t>
-      </w:r>
+        <w:t xml:space="preserve">Frisch, S., &amp; Uden, S. (2022). How forest thinning waste could fund California wildfire prevention. https://calmatters.org/commentary/2022/11/wildfire-prevention-biomass-climate-forest.</w:t>
+      </w:r>
+      <w:r/>
       <w:r/>
     </w:p>
     <w:p>
@@ -2383,11 +2465,9 @@
         <w:rPr/>
       </w:pPr>
       <w:r>
-        <w:t xml:space="preserve">Jerrett, M., Jina, A. S., &amp; Marlier, M. E. (2022). Up in smoke: California’s greenhouse gas reductions could be wiped out by 2020 wildfires. Environmental Pollution, 310.Jones, G. M., Vraga, E. K., Hessburg, P. F., Hurteau, M. D., Allen, C. D., Keane, R. E.</w:t>
-      </w:r>
-      <w:r>
-        <w:t xml:space="preserve">, Spies, T. A., North, M. P., Collins, B. M., Finney, M. A., Lydersen, J. M., &amp; Westerling, A. L. (2022). Counteracting wildfire misinformation. Frontiers in Ecology and the Environment, 20(7), 392–393. 10.1002/fee.2553.</w:t>
-      </w:r>
+        <w:t xml:space="preserve">Harrison, J. (2025). Avoiding an uninsurable future. Medium. https://medium.com/@joshuaharrison_97833/avoiding-an-uninsurable-future-78d525e8ded6.</w:t>
+      </w:r>
+      <w:r/>
       <w:r/>
     </w:p>
     <w:p>
@@ -2399,8 +2479,15 @@
         <w:rPr/>
       </w:pPr>
       <w:r>
-        <w:t xml:space="preserve">North, M. P., Tompkins, R. E., Bernal, A. A., Collins, B. M., Stephens, S. L., &amp; York, R. A. (2022). Operational resilience in western US frequent-fire forests. Forest Ecology and Management, 507, 120004. 10.1016/j.foreco.2021.120004.</w:t>
-      </w:r>
+        <w:t xml:space="preserve">H</w:t>
+      </w:r>
+      <w:r>
+        <w:t xml:space="preserve">offman, K. M., Davis, E. L., Wickham, S. B., Schang, K., Johnson, A., Larking, T., Lauriault, P. N., Quynh Le, N., Swerdfager, E., &amp; Trant, A. J. (2021). Conservation of Earth’s biodiversity is embedded in Indigenous fire stewardship. Proceedings of the Na</w:t>
+      </w:r>
+      <w:r>
+        <w:t xml:space="preserve">tional Academy of Sciences, 118(32). 10.1073/pnas.2105073118.</w:t>
+      </w:r>
+      <w:r/>
       <w:r/>
     </w:p>
     <w:p>
@@ -2412,8 +2499,15 @@
         <w:rPr/>
       </w:pPr>
       <w:r>
-        <w:t xml:space="preserve">North, M., Stine, P., O’Hara, K., Zielinski, W., &amp; Stephens, S. (2009). An ecosystem management strategy for Sierran mixed-conifer forests. U.S. Department of Agriculture, Forest Service, Pacific Southwest Research Station. 10.2737/PSW-GTR-220.</w:t>
-      </w:r>
+        <w:t xml:space="preserve">J</w:t>
+      </w:r>
+      <w:r>
+        <w:t xml:space="preserve">errett, M., Jina, A. S., &amp; Marlier, M. E. (2022). Up in smoke: California’s greenhouse gas reductions could be wiped out by 2020 wildfires. Environmental Pollution, 310.Jones, G. M., Vraga, E. K., Hessburg, P. F., Hurteau, M. D., Allen, C. D., Keane, R. E.</w:t>
+      </w:r>
+      <w:r>
+        <w:t xml:space="preserve">, Spies, T. A., North, M. P., Collins, B. M., Finney, M. A., Lydersen, J. M., &amp; Westerling, A. L. (2022). Counteracting wildfire misinformation. Frontiers in Ecology and the Environment, 20(7), 392–393. 10.1002/fee.2553.</w:t>
+      </w:r>
+      <w:r/>
       <w:r/>
     </w:p>
     <w:p>
@@ -2425,11 +2519,9 @@
         <w:rPr/>
       </w:pPr>
       <w:r>
-        <w:t xml:space="preserve">Peery, M. Z., Jones, G. M., Gutiérrez, R., Redpath, S. M., Franklin, A. B., Simberloff, D., Turner, M. G., Radeloff, V. C., &amp; White, G. C. (2019). The conundrum of agendadriven science in conservation. Frontiers in Ecology and the Environment, 17(2), 80–82.</w:t>
-      </w:r>
-      <w:r>
-        <w:t xml:space="preserve"> 10.1002/fee.2006.</w:t>
-      </w:r>
+        <w:t xml:space="preserve">North, M. P., Tompkins, R. E., Bernal, A. A., Collins, B. M., Stephens, S. L., &amp; York, R. A. (2022). Operational resilience in western US frequent-fire forests. Forest Ecology and Management, 507, 120004. 10.1016/j.foreco.2021.120004.</w:t>
+      </w:r>
+      <w:r/>
       <w:r/>
     </w:p>
     <w:p>
@@ -2441,8 +2533,9 @@
         <w:rPr/>
       </w:pPr>
       <w:r>
-        <w:t xml:space="preserve">Stephens, S. L., Martin, R. E., &amp; Clinton, N. E. (2007). Prehistoric fire area and emissions from California’s forests, woodlands, shrublands, and grasslands. Forest Ecology and Management, 251(3), 205–216. 10.1016/j.foreco.2007.06.005.</w:t>
-      </w:r>
+        <w:t xml:space="preserve">North, M., Stine, P., O’Hara, K., Zielinski, W., &amp; Stephens, S. (2009). An ecosystem management strategy for Sierran mixed-conifer forests. U.S. Department of Agriculture, Forest Service, Pacific Southwest Research Station. 10.2737/PSW-GTR-220.</w:t>
+      </w:r>
+      <w:r/>
       <w:r/>
     </w:p>
     <w:p>
@@ -2454,8 +2547,15 @@
         <w:rPr/>
       </w:pPr>
       <w:r>
-        <w:t xml:space="preserve">Strabo, F., Bryan, C., &amp; Reimer, M. (2025). Wildfire Damages and the Cost-Effective Role of Forest Fuel Treatments. SSRN. 10.2139/ssrn.5337929.</w:t>
-      </w:r>
+        <w:t xml:space="preserve">P</w:t>
+      </w:r>
+      <w:r>
+        <w:t xml:space="preserve">eery, M. Z., Jones, G. M., Gutiérrez, R., Redpath, S. M., Franklin, A. B., Simberloff, D., Turner, M. G., Radeloff, V. C., &amp; White, G. C. (2019). The conundrum of agendadriven science in conservation. Frontiers in Ecology and the Environment, 17(2), 80–82.</w:t>
+      </w:r>
+      <w:r>
+        <w:t xml:space="preserve"> 10.1002/fee.2006.</w:t>
+      </w:r>
+      <w:r/>
       <w:r/>
     </w:p>
     <w:p>
@@ -2467,12 +2567,52 @@
         <w:rPr/>
       </w:pPr>
       <w:r>
-        <w:t xml:space="preserve">Turner, E. (2023). The Potential for Hazardous Fuel Reduction Treatments to Produce Net Economic Benefits in California [Phdthesis, Johns Hopkins University]. https://jscholarship.library.jhu.edu/server/api/core/bitstreams/f8447761-4375-48d4-a2ba-82bc5bef63</w:t>
+        <w:t xml:space="preserve">Stephens, S. L., Martin, R. E., &amp; Clinton, N. E. (2007). Prehistoric fire area and emissions from California’s forests, woodlands, shrublands, and grasslands. Forest Ecology and Management, 251(3), 205–216. 10.1016/j.foreco.2007.06.005.</w:t>
+      </w:r>
+      <w:r/>
+      <w:r/>
+    </w:p>
+    <w:p>
+      <w:pPr>
+        <w:pBdr/>
+        <w:spacing/>
+        <w:ind/>
+        <w:jc w:val="left"/>
+        <w:rPr/>
+      </w:pPr>
+      <w:r>
+        <w:t xml:space="preserve">Strabo, F., Bryan, C., &amp; Reimer, M. (2025). Wildfire Damages and the Cost-Effective Role of Forest Fuel Treatments. SSRN. 10.2139/ssrn.5337929.</w:t>
+      </w:r>
+      <w:r/>
+      <w:r/>
+    </w:p>
+    <w:p>
+      <w:pPr>
+        <w:pBdr/>
+        <w:spacing/>
+        <w:ind/>
+        <w:jc w:val="left"/>
+        <w:rPr/>
+      </w:pPr>
+      <w:r>
+        <w:t xml:space="preserve">T</w:t>
+      </w:r>
+      <w:r>
+        <w:t xml:space="preserve">urner, E. (2023). The Potential for Hazardous Fuel Reduction Treatments to Produce Net Economic Benefits in California [Phdthesis, Johns Hopkins University]. https://jscholarship.library.jhu.edu/server/api/core/bitstreams/f8447761-4375-48d4-a2ba-82bc5bef63</w:t>
       </w:r>
       <w:r>
         <w:t xml:space="preserve">18/content.</w:t>
       </w:r>
       <w:r/>
+      <w:r/>
+    </w:p>
+    <w:p>
+      <w:pPr>
+        <w:pBdr/>
+        <w:spacing/>
+        <w:ind/>
+        <w:rPr/>
+      </w:pPr>
       <w:r/>
       <w:r/>
     </w:p>

</xml_diff>